<commit_message>
Enhance report formatting with logo cover, TOC, and detailed image placeholders
Agent-Logs-Url: https://github.com/TanQui-Ovnatiuq/BlockChain/sessions/3eddbffa-687d-492b-9d89-2c42433c34ad

Co-authored-by: TanQui-Ovnatiuq <253677590+TanQui-Ovnatiuq@users.noreply.github.com>
</commit_message>
<xml_diff>
--- a/BAOCAO_DAPP_DAT_SAN_20042026.docx
+++ b/BAOCAO_DAPP_DAT_SAN_20042026.docx
@@ -10,6 +10,7 @@
       <w:r>
         <w:rPr>
           <w:b/>
+          <w:i w:val="0"/>
         </w:rPr>
         <w:t>TRƯỜNG ĐẠI HỌC ĐỒNG THÁP</w:t>
       </w:r>
@@ -22,20 +23,125 @@
       <w:r>
         <w:rPr>
           <w:b/>
+          <w:i w:val="0"/>
         </w:rPr>
         <w:t>KHOA CÔNG NGHỆ VÀ KỸ THUẬT</w:t>
       </w:r>
     </w:p>
     <w:p>
       <w:pPr>
+        <w:spacing w:line="360" w:lineRule="auto"/>
+        <w:jc w:val="center"/>
+      </w:pPr>
+      <w:r>
+        <w:drawing>
+          <wp:inline xmlns:a="http://schemas.openxmlformats.org/drawingml/2006/main" xmlns:pic="http://schemas.openxmlformats.org/drawingml/2006/picture">
+            <wp:extent cx="1260000" cy="1260000"/>
+            <wp:docPr id="1" name="Picture 1"/>
+            <wp:cNvGraphicFramePr>
+              <a:graphicFrameLocks noChangeAspect="1"/>
+            </wp:cNvGraphicFramePr>
+            <a:graphic>
+              <a:graphicData uri="http://schemas.openxmlformats.org/drawingml/2006/picture">
+                <pic:pic>
+                  <pic:nvPicPr>
+                    <pic:cNvPr id="0" name="image1.png"/>
+                    <pic:cNvPicPr/>
+                  </pic:nvPicPr>
+                  <pic:blipFill>
+                    <a:blip r:embed="rId9"/>
+                    <a:stretch>
+                      <a:fillRect/>
+                    </a:stretch>
+                  </pic:blipFill>
+                  <pic:spPr>
+                    <a:xfrm>
+                      <a:off x="0" y="0"/>
+                      <a:ext cx="1260000" cy="1260000"/>
+                    </a:xfrm>
+                    <a:prstGeom prst="rect"/>
+                  </pic:spPr>
+                </pic:pic>
+              </a:graphicData>
+            </a:graphic>
+          </wp:inline>
+        </w:drawing>
+      </w:r>
+    </w:p>
+    <w:p>
+      <w:pPr>
+        <w:spacing w:line="360" w:lineRule="auto" w:after="120"/>
+        <w:jc w:val="center"/>
+      </w:pPr>
+      <w:r>
+        <w:rPr>
+          <w:b w:val="0"/>
+          <w:i w:val="0"/>
+        </w:rPr>
+        <w:t>Lê Thanh Trân - [MSSV]</w:t>
+      </w:r>
+    </w:p>
+    <w:p>
+      <w:pPr>
+        <w:spacing w:line="360" w:lineRule="auto" w:after="120"/>
+        <w:jc w:val="center"/>
+      </w:pPr>
+      <w:r>
+        <w:rPr>
+          <w:b w:val="0"/>
+          <w:i w:val="0"/>
+        </w:rPr>
+        <w:t>Lê Mai Trường Chinh - [MSSV]</w:t>
+      </w:r>
+    </w:p>
+    <w:p>
+      <w:pPr>
+        <w:spacing w:line="360" w:lineRule="auto" w:after="120"/>
+        <w:jc w:val="center"/>
+      </w:pPr>
+      <w:r>
+        <w:rPr>
+          <w:b w:val="0"/>
+          <w:i w:val="0"/>
+        </w:rPr>
+        <w:t>Hồ Nguyễn Đức Anh Hào - [MSSV]</w:t>
+      </w:r>
+    </w:p>
+    <w:p>
+      <w:pPr>
+        <w:spacing w:line="360" w:lineRule="auto" w:after="120"/>
+        <w:jc w:val="center"/>
+      </w:pPr>
+      <w:r>
+        <w:rPr>
+          <w:b w:val="0"/>
+          <w:i w:val="0"/>
+        </w:rPr>
+        <w:t>Võ Tấn Qui - [MSSV]</w:t>
+      </w:r>
+    </w:p>
+    <w:p>
+      <w:pPr>
+        <w:spacing w:line="360" w:lineRule="auto" w:after="480"/>
+      </w:pPr>
+      <w:r>
+        <w:rPr>
+          <w:b w:val="0"/>
+          <w:i w:val="0"/>
+        </w:rPr>
+      </w:r>
+    </w:p>
+    <w:p>
+      <w:pPr>
         <w:spacing w:line="360" w:lineRule="auto" w:after="120"/>
         <w:jc w:val="center"/>
       </w:pPr>
       <w:r>
         <w:rPr>
           <w:b/>
+          <w:i w:val="0"/>
         </w:rPr>
-        <w:t>BÁO CÁO HỌC PHẦN BLOCKCHAIN VÀ ỨNG DỤNG</w:t>
+        <w:t>BÁO CÁO KẾT THÚC HỌC PHẦN BLOCKCHAIN VÀ ỨNG DỤNG</w:t>
       </w:r>
     </w:p>
     <w:p>
@@ -46,18 +152,44 @@
       <w:r>
         <w:rPr>
           <w:b/>
+          <w:i w:val="0"/>
         </w:rPr>
         <w:t>ĐỀ TÀI: XÂY DỰNG ỨNG DỤNG DAPP ĐẶT SÂN THỂ THAO SỬ DỤNG BLOCKCHAIN</w:t>
       </w:r>
     </w:p>
     <w:p>
       <w:pPr>
-        <w:spacing w:line="360" w:lineRule="auto" w:after="120"/>
-        <w:jc w:val="center"/>
+        <w:spacing w:line="360" w:lineRule="auto" w:after="600"/>
       </w:pPr>
       <w:r>
         <w:rPr>
           <w:b w:val="0"/>
+          <w:i w:val="0"/>
+        </w:rPr>
+      </w:r>
+    </w:p>
+    <w:p>
+      <w:pPr>
+        <w:spacing w:line="360" w:lineRule="auto" w:after="120"/>
+        <w:jc w:val="center"/>
+      </w:pPr>
+      <w:r>
+        <w:rPr>
+          <w:b w:val="0"/>
+          <w:i w:val="0"/>
+        </w:rPr>
+        <w:t>NGÀNH: KHOA HỌC MÁY TÍNH</w:t>
+      </w:r>
+    </w:p>
+    <w:p>
+      <w:pPr>
+        <w:spacing w:line="360" w:lineRule="auto" w:after="120"/>
+        <w:jc w:val="center"/>
+      </w:pPr>
+      <w:r>
+        <w:rPr>
+          <w:b w:val="0"/>
+          <w:i w:val="0"/>
         </w:rPr>
         <w:t>LỚP: DHCNTT23A-CS</w:t>
       </w:r>
@@ -70,6 +202,7 @@
       <w:r>
         <w:rPr>
           <w:b w:val="0"/>
+          <w:i w:val="0"/>
         </w:rPr>
         <w:t>GIẢNG VIÊN HƯỚNG DẪN: THẦY HUỲNH MINH CHÂU</w:t>
       </w:r>
@@ -77,25 +210,14 @@
     <w:p>
       <w:pPr>
         <w:spacing w:line="360" w:lineRule="auto" w:after="120"/>
-        <w:jc w:val="center"/>
+        <w:jc w:val="right"/>
       </w:pPr>
       <w:r>
         <w:rPr>
           <w:b w:val="0"/>
+          <w:i/>
         </w:rPr>
-        <w:t>THÀNH VIÊN NHÓM: Lê Thanh Trân; Lê Mai Trường Chinh; Hồ Nguyên Đức Anh Hào; Võ Tấn Qui</w:t>
-      </w:r>
-    </w:p>
-    <w:p>
-      <w:pPr>
-        <w:spacing w:line="360" w:lineRule="auto" w:after="360"/>
-        <w:jc w:val="center"/>
-      </w:pPr>
-      <w:r>
-        <w:rPr>
-          <w:b w:val="0"/>
-        </w:rPr>
-        <w:t>Đồng Tháp, tháng 04 năm 2026</w:t>
+        <w:t>Đồng Tháp, tháng 4 năm 2026</w:t>
       </w:r>
     </w:p>
     <w:p>
@@ -108,13 +230,51 @@
     </w:p>
     <w:p>
       <w:pPr>
+        <w:pStyle w:val="Heading1"/>
         <w:spacing w:line="360" w:lineRule="auto" w:after="120"/>
-        <w:jc w:val="center"/>
+      </w:pPr>
+      <w:r>
+        <w:t>MỤC LỤC</w:t>
+      </w:r>
+    </w:p>
+    <w:p>
+      <w:pPr>
+        <w:spacing w:line="360" w:lineRule="auto"/>
+      </w:pPr>
+      <w:r>
+        <w:fldChar w:fldCharType="begin"/>
+        <w:instrText xml:space="preserve">TOC \o "1-3" \h \z \u</w:instrText>
+        <w:fldChar w:fldCharType="separate"/>
+        <w:t>Nhấp chuột phải vào mục lục và chọn Update Field để cập nhật số trang.</w:t>
+        <w:fldChar w:fldCharType="end"/>
+      </w:r>
+    </w:p>
+    <w:p>
+      <w:pPr>
+        <w:spacing w:line="360" w:lineRule="auto" w:after="120"/>
       </w:pPr>
       <w:r>
         <w:rPr>
-          <w:b/>
+          <w:b w:val="0"/>
+          <w:i/>
         </w:rPr>
+        <w:t>Dàn ý được mở rộng chi tiết bên dưới, có chừa các vị trí để bạn chèn thêm hình, sơ đồ và bảng.</w:t>
+      </w:r>
+    </w:p>
+    <w:p>
+      <w:pPr>
+        <w:spacing w:line="360" w:lineRule="auto"/>
+      </w:pPr>
+      <w:r>
+        <w:br w:type="page"/>
+      </w:r>
+    </w:p>
+    <w:p>
+      <w:pPr>
+        <w:pStyle w:val="Heading1"/>
+        <w:spacing w:line="360" w:lineRule="auto" w:after="120"/>
+      </w:pPr>
+      <w:r>
         <w:t>LỜI CẢM ƠN</w:t>
       </w:r>
     </w:p>
@@ -125,30 +285,17 @@
       <w:r>
         <w:rPr>
           <w:b w:val="0"/>
+          <w:i w:val="0"/>
         </w:rPr>
-        <w:t>Nhóm thực hiện xin chân thành cảm ơn Thầy Huỳnh Minh Châu đã hướng dẫn học phần Blockchain và ứng dụng, hỗ trợ định hướng kỹ thuật và góp ý chuyên môn xuyên suốt quá trình triển khai đề tài. Các ý kiến phản biện và gợi ý cải tiến của thầy đã giúp nhóm hoàn thiện kiến trúc DApp theo hướng thực tiễn, bảo đảm tính đúng đắn của luồng giao dịch và khả năng mở rộng hệ thống.</w:t>
+        <w:t>Nhóm xin cảm ơn Thầy Huỳnh Minh Châu đã hướng dẫn học phần Blockchain và ứng dụng, hỗ trợ chuyên môn và định hướng triển khai đề tài.</w:t>
       </w:r>
     </w:p>
     <w:p>
       <w:pPr>
-        <w:spacing w:line="360" w:lineRule="auto" w:after="240"/>
+        <w:pStyle w:val="Heading1"/>
+        <w:spacing w:line="360" w:lineRule="auto" w:after="120"/>
       </w:pPr>
       <w:r>
-        <w:rPr>
-          <w:b w:val="0"/>
-        </w:rPr>
-        <w:t>Trong quá trình thực hiện, nhóm đã vận dụng kiến thức về Smart Contract, EVM, JSON-RPC, REST API, Middleware và Authorization để xây dựng hệ thống đặt sân thể thao có tích hợp thanh toán ETH. Do giới hạn thời gian và điều kiện triển khai trên mạng cục bộ, sản phẩm vẫn còn một số điểm cần tối ưu. Nhóm kính mong nhận được thêm góp ý để tiếp tục hoàn thiện trong các giai đoạn phát triển tiếp theo.</w:t>
-      </w:r>
-    </w:p>
-    <w:p>
-      <w:pPr>
-        <w:spacing w:line="360" w:lineRule="auto" w:after="120"/>
-        <w:jc w:val="center"/>
-      </w:pPr>
-      <w:r>
-        <w:rPr>
-          <w:b/>
-        </w:rPr>
         <w:t>DANH MỤC KÝ HIỆU VÀ THUẬT NGỮ</w:t>
       </w:r>
     </w:p>
@@ -159,8 +306,9 @@
       <w:r>
         <w:rPr>
           <w:b w:val="0"/>
+          <w:i w:val="0"/>
         </w:rPr>
-        <w:t>DApp: Ứng dụng phi tập trung chạy trên nền tảng blockchain.</w:t>
+        <w:t>DApp: Ứng dụng phi tập trung vận hành dựa trên blockchain.</w:t>
       </w:r>
     </w:p>
     <w:p>
@@ -170,6 +318,7 @@
       <w:r>
         <w:rPr>
           <w:b w:val="0"/>
+          <w:i w:val="0"/>
         </w:rPr>
         <w:t>Smart Contract: Hợp đồng thông minh viết bằng Solidity, thực thi trên EVM.</w:t>
       </w:r>
@@ -181,8 +330,9 @@
       <w:r>
         <w:rPr>
           <w:b w:val="0"/>
+          <w:i w:val="0"/>
         </w:rPr>
-        <w:t>EVM: Ethereum Virtual Machine, môi trường thực thi bytecode của hợp đồng.</w:t>
+        <w:t>EVM: Ethereum Virtual Machine dùng để chạy bytecode của hợp đồng.</w:t>
       </w:r>
     </w:p>
     <w:p>
@@ -192,8 +342,9 @@
       <w:r>
         <w:rPr>
           <w:b w:val="0"/>
+          <w:i w:val="0"/>
         </w:rPr>
-        <w:t>JSON-RPC: Giao thức gọi hàm từ client đến node blockchain.</w:t>
+        <w:t>JSON-RPC: Giao thức trung gian để client gọi hàm đến node blockchain.</w:t>
       </w:r>
     </w:p>
     <w:p>
@@ -203,8 +354,9 @@
       <w:r>
         <w:rPr>
           <w:b w:val="0"/>
+          <w:i w:val="0"/>
         </w:rPr>
-        <w:t>Transaction Signing: Quá trình ký giao dịch bằng private key trong MetaMask.</w:t>
+        <w:t>Transaction Signing: Cơ chế ký giao dịch bằng private key trong MetaMask.</w:t>
       </w:r>
     </w:p>
     <w:p>
@@ -214,8 +366,9 @@
       <w:r>
         <w:rPr>
           <w:b w:val="0"/>
+          <w:i w:val="0"/>
         </w:rPr>
-        <w:t>Gas Fee: Chi phí thực thi giao dịch trên mạng Ethereum.</w:t>
+        <w:t>Gas Fee: Chi phí xử lý giao dịch trên mạng Ethereum.</w:t>
       </w:r>
     </w:p>
     <w:p>
@@ -225,8 +378,9 @@
       <w:r>
         <w:rPr>
           <w:b w:val="0"/>
+          <w:i w:val="0"/>
         </w:rPr>
-        <w:t>REST API: Giao diện lập trình ứng dụng theo chuẩn HTTP cho backend.</w:t>
+        <w:t>REST API: Chuẩn giao tiếp HTTP giữa frontend và backend.</w:t>
       </w:r>
     </w:p>
     <w:p>
@@ -236,8 +390,9 @@
       <w:r>
         <w:rPr>
           <w:b w:val="0"/>
+          <w:i w:val="0"/>
         </w:rPr>
-        <w:t>Middleware: Lớp trung gian xử lý request/response trong backend.</w:t>
+        <w:t>Middleware: Thành phần xử lý trung gian request/response.</w:t>
       </w:r>
     </w:p>
     <w:p>
@@ -247,30 +402,39 @@
       <w:r>
         <w:rPr>
           <w:b w:val="0"/>
+          <w:i w:val="0"/>
         </w:rPr>
-        <w:t>Authorization: Cơ chế phân quyền truy cập theo vai trò hoặc danh tính ví.</w:t>
+        <w:t>Authorization: Kiểm soát quyền truy cập dựa trên vai trò hoặc địa chỉ ví.</w:t>
       </w:r>
     </w:p>
     <w:p>
       <w:pPr>
+        <w:pStyle w:val="Heading1"/>
         <w:spacing w:line="360" w:lineRule="auto" w:after="120"/>
       </w:pPr>
       <w:r>
-        <w:rPr>
-          <w:b/>
-        </w:rPr>
         <w:t>CHƯƠNG 1. TỔNG QUAN ĐỀ TÀI</w:t>
       </w:r>
     </w:p>
     <w:p>
       <w:pPr>
+        <w:pStyle w:val="Heading2"/>
+        <w:spacing w:line="360" w:lineRule="auto" w:after="120"/>
+      </w:pPr>
+      <w:r>
+        <w:t>1.1 Bối cảnh và lý do chọn đề tài</w:t>
+      </w:r>
+    </w:p>
+    <w:p>
+      <w:pPr>
         <w:spacing w:line="360" w:lineRule="auto" w:after="120"/>
       </w:pPr>
       <w:r>
         <w:rPr>
           <w:b w:val="0"/>
+          <w:i w:val="0"/>
         </w:rPr>
-        <w:t>1.1 Lý do chọn đề tài</w:t>
+        <w:t>Nêu thực trạng đặt sân truyền thống, vấn đề minh bạch lịch đặt và đối soát thanh toán.</w:t>
       </w:r>
     </w:p>
     <w:p>
@@ -280,8 +444,9 @@
       <w:r>
         <w:rPr>
           <w:b w:val="0"/>
+          <w:i/>
         </w:rPr>
-        <w:t>Nhu cầu số hóa quy trình đặt sân thể thao ngày càng tăng, trong khi các mô hình tập trung truyền thống dễ phát sinh tranh chấp về lịch đặt, thanh toán và tính minh bạch giao dịch. Đề tài lựa chọn hướng tiếp cận DApp nhằm bảo đảm tính công khai, toàn vẹn dữ liệu và khả năng kiểm chứng độc lập cho mọi giao dịch đặt sân.</w:t>
+        <w:t>[Chèn hình: Hình 1: 1.1 Bối cảnh và lý do chọn đề tài]</w:t>
       </w:r>
     </w:p>
     <w:p>
@@ -291,7 +456,41 @@
       <w:r>
         <w:rPr>
           <w:b w:val="0"/>
+          <w:i/>
         </w:rPr>
+        <w:t>[Mô tả hình: ............................................................]</w:t>
+      </w:r>
+    </w:p>
+    <w:p>
+      <w:pPr>
+        <w:spacing w:line="360" w:lineRule="auto" w:after="120"/>
+      </w:pPr>
+      <w:r>
+        <w:rPr>
+          <w:b w:val="0"/>
+          <w:i/>
+        </w:rPr>
+        <w:t>[Chèn bảng: Bảng 1: 1.1 Bối cảnh và lý do chọn đề tài]</w:t>
+      </w:r>
+    </w:p>
+    <w:p>
+      <w:pPr>
+        <w:spacing w:line="360" w:lineRule="auto" w:after="120"/>
+      </w:pPr>
+      <w:r>
+        <w:rPr>
+          <w:b w:val="0"/>
+          <w:i/>
+        </w:rPr>
+        <w:t>[Chèn sơ đồ: Sơ đồ 1: 1.1 Bối cảnh và lý do chọn đề tài]</w:t>
+      </w:r>
+    </w:p>
+    <w:p>
+      <w:pPr>
+        <w:pStyle w:val="Heading2"/>
+        <w:spacing w:line="360" w:lineRule="auto" w:after="120"/>
+      </w:pPr>
+      <w:r>
         <w:t>1.2 Mục tiêu nghiên cứu</w:t>
       </w:r>
     </w:p>
@@ -302,8 +501,9 @@
       <w:r>
         <w:rPr>
           <w:b w:val="0"/>
+          <w:i w:val="0"/>
         </w:rPr>
-        <w:t>Mục tiêu chính là xây dựng hệ thống đặt sân gồm ba lớp Frontend, Backend và Blockchain Hardhat localhost; cho phép người dùng kết nối MetaMask, thực hiện đặt sân bằng ETH và theo dõi trạng thái giao dịch theo thời gian thực. Đồng thời, hệ thống cung cấp chức năng quản trị cho admin để tạo, sửa, xóa sân và theo dõi doanh thu.</w:t>
+        <w:t>Mô tả mục tiêu kỹ thuật và nghiệp vụ của hệ thống DApp đặt sân.</w:t>
       </w:r>
     </w:p>
     <w:p>
@@ -313,8 +513,9 @@
       <w:r>
         <w:rPr>
           <w:b w:val="0"/>
+          <w:i/>
         </w:rPr>
-        <w:t>1.3 Phạm vi thực hiện</w:t>
+        <w:t>[Chèn hình: Hình 2: 1.2 Mục tiêu nghiên cứu]</w:t>
       </w:r>
     </w:p>
     <w:p>
@@ -324,8 +525,9 @@
       <w:r>
         <w:rPr>
           <w:b w:val="0"/>
+          <w:i/>
         </w:rPr>
-        <w:t>Hệ thống triển khai Smart Contract trên Hardhat localhost, frontend web và backend API độc lập. Phạm vi xử lý nghiệp vụ tập trung vào quản lý sân, đặt sân, thanh toán ETH, lịch sử giao dịch và phân quyền admin. Phần triển khai thực tế ưu tiên môi trường thử nghiệm; mạng công khai sẽ được đề xuất ở hướng phát triển.</w:t>
+        <w:t>[Mô tả hình: ............................................................]</w:t>
       </w:r>
     </w:p>
     <w:p>
@@ -335,8 +537,9 @@
       <w:r>
         <w:rPr>
           <w:b w:val="0"/>
+          <w:i/>
         </w:rPr>
-        <w:t>[Hình 1.1] Kiến trúc tổng quan Frontend–Backend–Blockchain</w:t>
+        <w:t>[Chèn bảng: Bảng 2: 1.2 Mục tiêu nghiên cứu]</w:t>
       </w:r>
     </w:p>
     <w:p>
@@ -345,20 +548,178 @@
       </w:pPr>
       <w:r>
         <w:rPr>
-          <w:b/>
+          <w:b w:val="0"/>
+          <w:i/>
         </w:rPr>
+        <w:t>[Chèn sơ đồ: Sơ đồ 2: 1.2 Mục tiêu nghiên cứu]</w:t>
+      </w:r>
+    </w:p>
+    <w:p>
+      <w:pPr>
+        <w:pStyle w:val="Heading2"/>
+        <w:spacing w:line="360" w:lineRule="auto" w:after="120"/>
+      </w:pPr>
+      <w:r>
+        <w:t>1.3 Phạm vi và giới hạn</w:t>
+      </w:r>
+    </w:p>
+    <w:p>
+      <w:pPr>
+        <w:spacing w:line="360" w:lineRule="auto" w:after="120"/>
+      </w:pPr>
+      <w:r>
+        <w:rPr>
+          <w:b w:val="0"/>
+          <w:i w:val="0"/>
+        </w:rPr>
+        <w:t>Xác định phạm vi triển khai trên Hardhat localhost và giới hạn hiện tại.</w:t>
+      </w:r>
+    </w:p>
+    <w:p>
+      <w:pPr>
+        <w:spacing w:line="360" w:lineRule="auto" w:after="120"/>
+      </w:pPr>
+      <w:r>
+        <w:rPr>
+          <w:b w:val="0"/>
+          <w:i/>
+        </w:rPr>
+        <w:t>[Chèn hình: Hình 3: 1.3 Phạm vi và giới hạn]</w:t>
+      </w:r>
+    </w:p>
+    <w:p>
+      <w:pPr>
+        <w:spacing w:line="360" w:lineRule="auto" w:after="120"/>
+      </w:pPr>
+      <w:r>
+        <w:rPr>
+          <w:b w:val="0"/>
+          <w:i/>
+        </w:rPr>
+        <w:t>[Mô tả hình: ............................................................]</w:t>
+      </w:r>
+    </w:p>
+    <w:p>
+      <w:pPr>
+        <w:spacing w:line="360" w:lineRule="auto" w:after="120"/>
+      </w:pPr>
+      <w:r>
+        <w:rPr>
+          <w:b w:val="0"/>
+          <w:i/>
+        </w:rPr>
+        <w:t>[Chèn bảng: Bảng 3: 1.3 Phạm vi và giới hạn]</w:t>
+      </w:r>
+    </w:p>
+    <w:p>
+      <w:pPr>
+        <w:spacing w:line="360" w:lineRule="auto" w:after="120"/>
+      </w:pPr>
+      <w:r>
+        <w:rPr>
+          <w:b w:val="0"/>
+          <w:i/>
+        </w:rPr>
+        <w:t>[Chèn sơ đồ: Sơ đồ 3: 1.3 Phạm vi và giới hạn]</w:t>
+      </w:r>
+    </w:p>
+    <w:p>
+      <w:pPr>
+        <w:pStyle w:val="Heading2"/>
+        <w:spacing w:line="360" w:lineRule="auto" w:after="120"/>
+      </w:pPr>
+      <w:r>
+        <w:t>1.4 Phương pháp thực hiện</w:t>
+      </w:r>
+    </w:p>
+    <w:p>
+      <w:pPr>
+        <w:spacing w:line="360" w:lineRule="auto" w:after="120"/>
+      </w:pPr>
+      <w:r>
+        <w:rPr>
+          <w:b w:val="0"/>
+          <w:i w:val="0"/>
+        </w:rPr>
+        <w:t>Trình bày quy trình phân tích, thiết kế, triển khai và kiểm thử.</w:t>
+      </w:r>
+    </w:p>
+    <w:p>
+      <w:pPr>
+        <w:spacing w:line="360" w:lineRule="auto" w:after="120"/>
+      </w:pPr>
+      <w:r>
+        <w:rPr>
+          <w:b w:val="0"/>
+          <w:i/>
+        </w:rPr>
+        <w:t>[Chèn hình: Hình 4: 1.4 Phương pháp thực hiện]</w:t>
+      </w:r>
+    </w:p>
+    <w:p>
+      <w:pPr>
+        <w:spacing w:line="360" w:lineRule="auto" w:after="120"/>
+      </w:pPr>
+      <w:r>
+        <w:rPr>
+          <w:b w:val="0"/>
+          <w:i/>
+        </w:rPr>
+        <w:t>[Mô tả hình: ............................................................]</w:t>
+      </w:r>
+    </w:p>
+    <w:p>
+      <w:pPr>
+        <w:spacing w:line="360" w:lineRule="auto" w:after="120"/>
+      </w:pPr>
+      <w:r>
+        <w:rPr>
+          <w:b w:val="0"/>
+          <w:i/>
+        </w:rPr>
+        <w:t>[Chèn bảng: Bảng 4: 1.4 Phương pháp thực hiện]</w:t>
+      </w:r>
+    </w:p>
+    <w:p>
+      <w:pPr>
+        <w:spacing w:line="360" w:lineRule="auto" w:after="120"/>
+      </w:pPr>
+      <w:r>
+        <w:rPr>
+          <w:b w:val="0"/>
+          <w:i/>
+        </w:rPr>
+        <w:t>[Chèn sơ đồ: Sơ đồ 4: 1.4 Phương pháp thực hiện]</w:t>
+      </w:r>
+    </w:p>
+    <w:p>
+      <w:pPr>
+        <w:pStyle w:val="Heading1"/>
+        <w:spacing w:line="360" w:lineRule="auto" w:after="120"/>
+      </w:pPr>
+      <w:r>
         <w:t>CHƯƠNG 2. PHÂN TÍCH VÀ THIẾT KẾ HỆ THỐNG</w:t>
       </w:r>
     </w:p>
     <w:p>
       <w:pPr>
+        <w:pStyle w:val="Heading2"/>
+        <w:spacing w:line="360" w:lineRule="auto" w:after="120"/>
+      </w:pPr>
+      <w:r>
+        <w:t>2.1 Kiến trúc tổng thể Frontend–Backend–Blockchain</w:t>
+      </w:r>
+    </w:p>
+    <w:p>
+      <w:pPr>
         <w:spacing w:line="360" w:lineRule="auto" w:after="120"/>
       </w:pPr>
       <w:r>
         <w:rPr>
           <w:b w:val="0"/>
+          <w:i w:val="0"/>
         </w:rPr>
-        <w:t>2.1 Kiến trúc tổng thể</w:t>
+        <w:t>Mô tả vai trò từng lớp và cơ chế tương tác liên lớp.</w:t>
       </w:r>
     </w:p>
     <w:p>
@@ -368,8 +729,9 @@
       <w:r>
         <w:rPr>
           <w:b w:val="0"/>
+          <w:i/>
         </w:rPr>
-        <w:t>Frontend chịu trách nhiệm tương tác người dùng và hiển thị trạng thái sân. Backend cung cấp REST API cho các nghiệp vụ ngoài chuỗi như thống kê, tổng hợp lịch sử và tích hợp dữ liệu phụ trợ. Blockchain đảm nhiệm trạng thái đặt sân và xử lý transaction theo cơ chế bất biến.</w:t>
+        <w:t>[Chèn hình: Hình 5: 2.1 Kiến trúc tổng thể Frontend–Backend–Blockchain]</w:t>
       </w:r>
     </w:p>
     <w:p>
@@ -379,7 +741,41 @@
       <w:r>
         <w:rPr>
           <w:b w:val="0"/>
+          <w:i/>
         </w:rPr>
+        <w:t>[Mô tả hình: ............................................................]</w:t>
+      </w:r>
+    </w:p>
+    <w:p>
+      <w:pPr>
+        <w:spacing w:line="360" w:lineRule="auto" w:after="120"/>
+      </w:pPr>
+      <w:r>
+        <w:rPr>
+          <w:b w:val="0"/>
+          <w:i/>
+        </w:rPr>
+        <w:t>[Chèn bảng: Bảng 5: 2.1 Kiến trúc tổng thể Frontend–Backend–Blockchain]</w:t>
+      </w:r>
+    </w:p>
+    <w:p>
+      <w:pPr>
+        <w:spacing w:line="360" w:lineRule="auto" w:after="120"/>
+      </w:pPr>
+      <w:r>
+        <w:rPr>
+          <w:b w:val="0"/>
+          <w:i/>
+        </w:rPr>
+        <w:t>[Chèn sơ đồ: Sơ đồ 5: 2.1 Kiến trúc tổng thể Frontend–Backend–Blockchain]</w:t>
+      </w:r>
+    </w:p>
+    <w:p>
+      <w:pPr>
+        <w:pStyle w:val="Heading2"/>
+        <w:spacing w:line="360" w:lineRule="auto" w:after="120"/>
+      </w:pPr>
+      <w:r>
         <w:t>2.2 Luồng kết nối MetaMask</w:t>
       </w:r>
     </w:p>
@@ -390,8 +786,9 @@
       <w:r>
         <w:rPr>
           <w:b w:val="0"/>
+          <w:i w:val="0"/>
         </w:rPr>
-        <w:t>Người dùng truy cập giao diện, chọn chức năng Connect Wallet, sau đó MetaMask yêu cầu cấp quyền truy cập tài khoản. Khi chấp thuận, địa chỉ ví được trả về frontend và dùng làm danh tính chính trong toàn bộ phiên làm việc. Cơ chế này thay thế đăng nhập truyền thống bằng xác thực phi tập trung.</w:t>
+        <w:t>Mô tả quy trình định danh người dùng bằng ví.</w:t>
       </w:r>
     </w:p>
     <w:p>
@@ -401,7 +798,53 @@
       <w:r>
         <w:rPr>
           <w:b w:val="0"/>
+          <w:i/>
         </w:rPr>
+        <w:t>[Chèn hình: Hình 6: 2.2 Luồng kết nối MetaMask]</w:t>
+      </w:r>
+    </w:p>
+    <w:p>
+      <w:pPr>
+        <w:spacing w:line="360" w:lineRule="auto" w:after="120"/>
+      </w:pPr>
+      <w:r>
+        <w:rPr>
+          <w:b w:val="0"/>
+          <w:i/>
+        </w:rPr>
+        <w:t>[Mô tả hình: ............................................................]</w:t>
+      </w:r>
+    </w:p>
+    <w:p>
+      <w:pPr>
+        <w:spacing w:line="360" w:lineRule="auto" w:after="120"/>
+      </w:pPr>
+      <w:r>
+        <w:rPr>
+          <w:b w:val="0"/>
+          <w:i/>
+        </w:rPr>
+        <w:t>[Chèn bảng: Bảng 6: 2.2 Luồng kết nối MetaMask]</w:t>
+      </w:r>
+    </w:p>
+    <w:p>
+      <w:pPr>
+        <w:spacing w:line="360" w:lineRule="auto" w:after="120"/>
+      </w:pPr>
+      <w:r>
+        <w:rPr>
+          <w:b w:val="0"/>
+          <w:i/>
+        </w:rPr>
+        <w:t>[Chèn sơ đồ: Sơ đồ 6: 2.2 Luồng kết nối MetaMask]</w:t>
+      </w:r>
+    </w:p>
+    <w:p>
+      <w:pPr>
+        <w:pStyle w:val="Heading2"/>
+        <w:spacing w:line="360" w:lineRule="auto" w:after="120"/>
+      </w:pPr>
+      <w:r>
         <w:t>2.3 Luồng đặt sân và thanh toán ETH</w:t>
       </w:r>
     </w:p>
@@ -412,8 +855,9 @@
       <w:r>
         <w:rPr>
           <w:b w:val="0"/>
+          <w:i w:val="0"/>
         </w:rPr>
-        <w:t>Quy trình đặt sân gồm các bước: người dùng chọn sân còn trống, gửi yêu cầu đặt, MetaMask hiển thị thông tin giao dịch, người dùng ký giao dịch và phát lên node Hardhat qua JSON-RPC. Smart Contract kiểm tra trạng thái sân, ghi nhận giao dịch, cập nhật trạng thái đã đặt và phát sự kiện để UI đồng bộ dữ liệu.</w:t>
+        <w:t>Mô tả sequence từ chọn sân đến xác nhận giao dịch.</w:t>
       </w:r>
     </w:p>
     <w:p>
@@ -423,8 +867,9 @@
       <w:r>
         <w:rPr>
           <w:b w:val="0"/>
+          <w:i/>
         </w:rPr>
-        <w:t>2.4 Thiết kế dữ liệu nghiệp vụ</w:t>
+        <w:t>[Chèn hình: Hình 7: 2.3 Luồng đặt sân và thanh toán ETH]</w:t>
       </w:r>
     </w:p>
     <w:p>
@@ -434,8 +879,9 @@
       <w:r>
         <w:rPr>
           <w:b w:val="0"/>
+          <w:i/>
         </w:rPr>
-        <w:t>Dữ liệu on-chain lưu các thuộc tính trọng yếu gồm mã sân, giá thuê, trạng thái và lịch sử giao dịch. Dữ liệu off-chain tại backend lưu thông tin bổ sung như hồ sơ người dùng, báo cáo doanh thu theo mốc thời gian và nhật ký thao tác quản trị. Cách tách này tối ưu chi phí lưu trữ blockchain nhưng vẫn bảo đảm khả năng truy vết.</w:t>
+        <w:t>[Mô tả hình: ............................................................]</w:t>
       </w:r>
     </w:p>
     <w:p>
@@ -445,8 +891,9 @@
       <w:r>
         <w:rPr>
           <w:b w:val="0"/>
+          <w:i/>
         </w:rPr>
-        <w:t>[Sơ đồ 2.1] Sequence đặt sân từ User đến Smart Contract</w:t>
+        <w:t>[Chèn bảng: Bảng 7: 2.3 Luồng đặt sân và thanh toán ETH]</w:t>
       </w:r>
     </w:p>
     <w:p>
@@ -456,19 +903,18 @@
       <w:r>
         <w:rPr>
           <w:b w:val="0"/>
+          <w:i/>
         </w:rPr>
-        <w:t>[Bảng 2.1] Mô tả trường dữ liệu sân và giao dịch</w:t>
+        <w:t>[Chèn sơ đồ: Sơ đồ 7: 2.3 Luồng đặt sân và thanh toán ETH]</w:t>
       </w:r>
     </w:p>
     <w:p>
       <w:pPr>
+        <w:pStyle w:val="Heading2"/>
         <w:spacing w:line="360" w:lineRule="auto" w:after="120"/>
       </w:pPr>
       <w:r>
-        <w:rPr>
-          <w:b/>
-        </w:rPr>
-        <w:t>CHƯƠNG 3. TRIỂN KHAI KỸ THUẬT</w:t>
+        <w:t>2.4 Thiết kế dữ liệu on-chain/off-chain</w:t>
       </w:r>
     </w:p>
     <w:p>
@@ -478,8 +924,9 @@
       <w:r>
         <w:rPr>
           <w:b w:val="0"/>
+          <w:i w:val="0"/>
         </w:rPr>
-        <w:t>3.1 Triển khai Smart Contract</w:t>
+        <w:t>Nêu cấu trúc dữ liệu, khóa định danh và chiến lược lưu trữ.</w:t>
       </w:r>
     </w:p>
     <w:p>
@@ -489,8 +936,9 @@
       <w:r>
         <w:rPr>
           <w:b w:val="0"/>
+          <w:i/>
         </w:rPr>
-        <w:t>Hợp đồng thông minh xây dựng bằng Solidity theo nguyên tắc kiểm tra điều kiện trước khi cập nhật trạng thái. Các hàm quản trị được bảo vệ quyền bằng địa chỉ admin, trong khi hàm đặt sân yêu cầu sân khả dụng và giá trị ETH hợp lệ. Mọi giao dịch thành công đều tạo transaction hash để đối soát.</w:t>
+        <w:t>[Chèn hình: Hình 8: 2.4 Thiết kế dữ liệu on-chain/off-chain]</w:t>
       </w:r>
     </w:p>
     <w:p>
@@ -500,8 +948,9 @@
       <w:r>
         <w:rPr>
           <w:b w:val="0"/>
+          <w:i/>
         </w:rPr>
-        <w:t>3.2 Kết nối blockchain từ ứng dụng</w:t>
+        <w:t>[Mô tả hình: ............................................................]</w:t>
       </w:r>
     </w:p>
     <w:p>
@@ -511,8 +960,9 @@
       <w:r>
         <w:rPr>
           <w:b w:val="0"/>
+          <w:i/>
         </w:rPr>
-        <w:t>Ứng dụng frontend sử dụng thư viện Web3/Ethers để tương tác hợp đồng thông minh. Request được gửi qua provider của MetaMask, bảo đảm transaction signing diễn ra ở phía người dùng. Backend chỉ giữ vai trò hỗ trợ nghiệp vụ ngoài chuỗi, không nắm private key và không can thiệp vào chữ ký giao dịch.</w:t>
+        <w:t>[Chèn bảng: Bảng 8: 2.4 Thiết kế dữ liệu on-chain/off-chain]</w:t>
       </w:r>
     </w:p>
     <w:p>
@@ -522,19 +972,30 @@
       <w:r>
         <w:rPr>
           <w:b w:val="0"/>
+          <w:i/>
         </w:rPr>
-        <w:t>3.3 Xây dựng backend API</w:t>
+        <w:t>[Chèn sơ đồ: Sơ đồ 8: 2.4 Thiết kế dữ liệu on-chain/off-chain]</w:t>
       </w:r>
     </w:p>
     <w:p>
       <w:pPr>
+        <w:pStyle w:val="Heading2"/>
+        <w:spacing w:line="360" w:lineRule="auto" w:after="120"/>
+      </w:pPr>
+      <w:r>
+        <w:t>2.5 Yêu cầu bảo mật và phân quyền</w:t>
+      </w:r>
+    </w:p>
+    <w:p>
+      <w:pPr>
         <w:spacing w:line="360" w:lineRule="auto" w:after="120"/>
       </w:pPr>
       <w:r>
         <w:rPr>
           <w:b w:val="0"/>
+          <w:i w:val="0"/>
         </w:rPr>
-        <w:t>Backend tổ chức theo mô hình lớp với Controller, Service và Middleware. Các endpoint chính gồm lấy danh sách sân, truy vấn lịch sử đặt, thống kê doanh thu và quản trị sân. Middleware xử lý chuẩn hóa response, kiểm soát lỗi và xác thực vai trò admin đối với API nhạy cảm.</w:t>
+        <w:t>Mô tả quy tắc authorization và kiểm soát input.</w:t>
       </w:r>
     </w:p>
     <w:p>
@@ -544,8 +1005,9 @@
       <w:r>
         <w:rPr>
           <w:b w:val="0"/>
+          <w:i/>
         </w:rPr>
-        <w:t>3.4 Triển khai môi trường</w:t>
+        <w:t>[Chèn hình: Hình 9: 2.5 Yêu cầu bảo mật và phân quyền]</w:t>
       </w:r>
     </w:p>
     <w:p>
@@ -555,8 +1017,9 @@
       <w:r>
         <w:rPr>
           <w:b w:val="0"/>
+          <w:i/>
         </w:rPr>
-        <w:t>Hệ thống được chuẩn bị cho mô hình hybrid: frontend và backend có thể triển khai trên Azure, còn blockchain thử nghiệm duy trì ở Hardhat localhost trong giai đoạn đánh giá học thuật. Cách triển khai này giúp tối ưu kiểm thử tính năng trước khi chuyển sang testnet công khai.</w:t>
+        <w:t>[Mô tả hình: ............................................................]</w:t>
       </w:r>
     </w:p>
     <w:p>
@@ -566,8 +1029,9 @@
       <w:r>
         <w:rPr>
           <w:b w:val="0"/>
+          <w:i/>
         </w:rPr>
-        <w:t>[Hình 3.1] Luồng ký giao dịch trên MetaMask</w:t>
+        <w:t>[Chèn bảng: Bảng 9: 2.5 Yêu cầu bảo mật và phân quyền]</w:t>
       </w:r>
     </w:p>
     <w:p>
@@ -576,20 +1040,40 @@
       </w:pPr>
       <w:r>
         <w:rPr>
-          <w:b/>
+          <w:b w:val="0"/>
+          <w:i/>
         </w:rPr>
-        <w:t>CHƯƠNG 4. CHỨC NĂNG NGHIỆP VỤ</w:t>
+        <w:t>[Chèn sơ đồ: Sơ đồ 9: 2.5 Yêu cầu bảo mật và phân quyền]</w:t>
       </w:r>
     </w:p>
     <w:p>
       <w:pPr>
+        <w:pStyle w:val="Heading1"/>
+        <w:spacing w:line="360" w:lineRule="auto" w:after="120"/>
+      </w:pPr>
+      <w:r>
+        <w:t>CHƯƠNG 3. TRIỂN KHAI HỆ THỐNG</w:t>
+      </w:r>
+    </w:p>
+    <w:p>
+      <w:pPr>
+        <w:pStyle w:val="Heading2"/>
+        <w:spacing w:line="360" w:lineRule="auto" w:after="120"/>
+      </w:pPr>
+      <w:r>
+        <w:t>3.1 Triển khai Smart Contract bằng Solidity</w:t>
+      </w:r>
+    </w:p>
+    <w:p>
+      <w:pPr>
         <w:spacing w:line="360" w:lineRule="auto" w:after="120"/>
       </w:pPr>
       <w:r>
         <w:rPr>
           <w:b w:val="0"/>
+          <w:i w:val="0"/>
         </w:rPr>
-        <w:t>4.1 Chức năng dành cho người dùng</w:t>
+        <w:t>Đặc tả các hàm chính, điều kiện kiểm tra và event.</w:t>
       </w:r>
     </w:p>
     <w:p>
@@ -599,8 +1083,9 @@
       <w:r>
         <w:rPr>
           <w:b w:val="0"/>
+          <w:i/>
         </w:rPr>
-        <w:t>Người dùng thực hiện kết nối ví, xem danh sách sân, đặt sân, xác nhận giao dịch ETH và theo dõi lịch sử đặt sân. Sau khi giao dịch hoàn tất, giao diện cập nhật trạng thái Available/Booked theo sự kiện từ blockchain, giúp thông tin luôn nhất quán.</w:t>
+        <w:t>[Chèn hình: Hình 10: 3.1 Triển khai Smart Contract bằng Solidity]</w:t>
       </w:r>
     </w:p>
     <w:p>
@@ -610,8 +1095,9 @@
       <w:r>
         <w:rPr>
           <w:b w:val="0"/>
+          <w:i/>
         </w:rPr>
-        <w:t>4.2 Chức năng dành cho quản trị viên</w:t>
+        <w:t>[Mô tả hình: ............................................................]</w:t>
       </w:r>
     </w:p>
     <w:p>
@@ -621,8 +1107,9 @@
       <w:r>
         <w:rPr>
           <w:b w:val="0"/>
+          <w:i/>
         </w:rPr>
-        <w:t>Quản trị viên được nhận diện bằng địa chỉ ví có quyền, có thể tạo sân mới, cập nhật giá hoặc trạng thái, xóa sân không còn khai thác và theo dõi tổng doanh thu. Tất cả thao tác quản trị đều cần Authorization hợp lệ để tránh thay đổi trái phép.</w:t>
+        <w:t>[Chèn bảng: Bảng 10: 3.1 Triển khai Smart Contract bằng Solidity]</w:t>
       </w:r>
     </w:p>
     <w:p>
@@ -632,19 +1119,30 @@
       <w:r>
         <w:rPr>
           <w:b w:val="0"/>
+          <w:i/>
         </w:rPr>
-        <w:t>4.3 Phân tích các ô chức năng trên giao diện</w:t>
+        <w:t>[Chèn sơ đồ: Sơ đồ 10: 3.1 Triển khai Smart Contract bằng Solidity]</w:t>
       </w:r>
     </w:p>
     <w:p>
       <w:pPr>
+        <w:pStyle w:val="Heading2"/>
+        <w:spacing w:line="360" w:lineRule="auto" w:after="120"/>
+      </w:pPr>
+      <w:r>
+        <w:t>3.2 Tích hợp blockchain qua JSON-RPC</w:t>
+      </w:r>
+    </w:p>
+    <w:p>
+      <w:pPr>
         <w:spacing w:line="360" w:lineRule="auto" w:after="120"/>
       </w:pPr>
       <w:r>
         <w:rPr>
           <w:b w:val="0"/>
+          <w:i w:val="0"/>
         </w:rPr>
-        <w:t>Khối Connect Wallet thực hiện ethereum.request để lấy account hiện hành. Khối Danh sách sân hiển thị dữ liệu đồng bộ từ hợp đồng hoặc API. Khối Đặt sân kích hoạt transaction MetaMask. Khối Admin Dashboard cung cấp CRUD sân và tổng hợp doanh thu theo kỳ.</w:t>
+        <w:t>Mô tả giao tiếp từ frontend đến node blockchain.</w:t>
       </w:r>
     </w:p>
     <w:p>
@@ -654,8 +1152,9 @@
       <w:r>
         <w:rPr>
           <w:b w:val="0"/>
+          <w:i/>
         </w:rPr>
-        <w:t>[Bảng 4.1] Mapping chức năng User/Admin và quyền truy cập</w:t>
+        <w:t>[Chèn hình: Hình 11: 3.2 Tích hợp blockchain qua JSON-RPC]</w:t>
       </w:r>
     </w:p>
     <w:p>
@@ -664,9 +1163,10 @@
       </w:pPr>
       <w:r>
         <w:rPr>
-          <w:b/>
+          <w:b w:val="0"/>
+          <w:i/>
         </w:rPr>
-        <w:t>CHƯƠNG 5. KIỂM THỬ HỆ THỐNG</w:t>
+        <w:t>[Mô tả hình: ............................................................]</w:t>
       </w:r>
     </w:p>
     <w:p>
@@ -676,7 +1176,530 @@
       <w:r>
         <w:rPr>
           <w:b w:val="0"/>
+          <w:i/>
         </w:rPr>
+        <w:t>[Chèn bảng: Bảng 11: 3.2 Tích hợp blockchain qua JSON-RPC]</w:t>
+      </w:r>
+    </w:p>
+    <w:p>
+      <w:pPr>
+        <w:spacing w:line="360" w:lineRule="auto" w:after="120"/>
+      </w:pPr>
+      <w:r>
+        <w:rPr>
+          <w:b w:val="0"/>
+          <w:i/>
+        </w:rPr>
+        <w:t>[Chèn sơ đồ: Sơ đồ 11: 3.2 Tích hợp blockchain qua JSON-RPC]</w:t>
+      </w:r>
+    </w:p>
+    <w:p>
+      <w:pPr>
+        <w:pStyle w:val="Heading2"/>
+        <w:spacing w:line="360" w:lineRule="auto" w:after="120"/>
+      </w:pPr>
+      <w:r>
+        <w:t>3.3 Xây dựng backend REST API</w:t>
+      </w:r>
+    </w:p>
+    <w:p>
+      <w:pPr>
+        <w:spacing w:line="360" w:lineRule="auto" w:after="120"/>
+      </w:pPr>
+      <w:r>
+        <w:rPr>
+          <w:b w:val="0"/>
+          <w:i w:val="0"/>
+        </w:rPr>
+        <w:t>Mô tả endpoint nghiệp vụ, middleware và chuẩn response.</w:t>
+      </w:r>
+    </w:p>
+    <w:p>
+      <w:pPr>
+        <w:spacing w:line="360" w:lineRule="auto" w:after="120"/>
+      </w:pPr>
+      <w:r>
+        <w:rPr>
+          <w:b w:val="0"/>
+          <w:i/>
+        </w:rPr>
+        <w:t>[Chèn hình: Hình 12: 3.3 Xây dựng backend REST API]</w:t>
+      </w:r>
+    </w:p>
+    <w:p>
+      <w:pPr>
+        <w:spacing w:line="360" w:lineRule="auto" w:after="120"/>
+      </w:pPr>
+      <w:r>
+        <w:rPr>
+          <w:b w:val="0"/>
+          <w:i/>
+        </w:rPr>
+        <w:t>[Mô tả hình: ............................................................]</w:t>
+      </w:r>
+    </w:p>
+    <w:p>
+      <w:pPr>
+        <w:spacing w:line="360" w:lineRule="auto" w:after="120"/>
+      </w:pPr>
+      <w:r>
+        <w:rPr>
+          <w:b w:val="0"/>
+          <w:i/>
+        </w:rPr>
+        <w:t>[Chèn bảng: Bảng 12: 3.3 Xây dựng backend REST API]</w:t>
+      </w:r>
+    </w:p>
+    <w:p>
+      <w:pPr>
+        <w:spacing w:line="360" w:lineRule="auto" w:after="120"/>
+      </w:pPr>
+      <w:r>
+        <w:rPr>
+          <w:b w:val="0"/>
+          <w:i/>
+        </w:rPr>
+        <w:t>[Chèn sơ đồ: Sơ đồ 12: 3.3 Xây dựng backend REST API]</w:t>
+      </w:r>
+    </w:p>
+    <w:p>
+      <w:pPr>
+        <w:pStyle w:val="Heading2"/>
+        <w:spacing w:line="360" w:lineRule="auto" w:after="120"/>
+      </w:pPr>
+      <w:r>
+        <w:t>3.4 Cấu hình Hardhat localhost và MetaMask</w:t>
+      </w:r>
+    </w:p>
+    <w:p>
+      <w:pPr>
+        <w:spacing w:line="360" w:lineRule="auto" w:after="120"/>
+      </w:pPr>
+      <w:r>
+        <w:rPr>
+          <w:b w:val="0"/>
+          <w:i w:val="0"/>
+        </w:rPr>
+        <w:t>Trình bày cách cấu hình môi trường dev.</w:t>
+      </w:r>
+    </w:p>
+    <w:p>
+      <w:pPr>
+        <w:spacing w:line="360" w:lineRule="auto" w:after="120"/>
+      </w:pPr>
+      <w:r>
+        <w:rPr>
+          <w:b w:val="0"/>
+          <w:i/>
+        </w:rPr>
+        <w:t>[Chèn hình: Hình 13: 3.4 Cấu hình Hardhat localhost và MetaMask]</w:t>
+      </w:r>
+    </w:p>
+    <w:p>
+      <w:pPr>
+        <w:spacing w:line="360" w:lineRule="auto" w:after="120"/>
+      </w:pPr>
+      <w:r>
+        <w:rPr>
+          <w:b w:val="0"/>
+          <w:i/>
+        </w:rPr>
+        <w:t>[Mô tả hình: ............................................................]</w:t>
+      </w:r>
+    </w:p>
+    <w:p>
+      <w:pPr>
+        <w:spacing w:line="360" w:lineRule="auto" w:after="120"/>
+      </w:pPr>
+      <w:r>
+        <w:rPr>
+          <w:b w:val="0"/>
+          <w:i/>
+        </w:rPr>
+        <w:t>[Chèn bảng: Bảng 13: 3.4 Cấu hình Hardhat localhost và MetaMask]</w:t>
+      </w:r>
+    </w:p>
+    <w:p>
+      <w:pPr>
+        <w:spacing w:line="360" w:lineRule="auto" w:after="120"/>
+      </w:pPr>
+      <w:r>
+        <w:rPr>
+          <w:b w:val="0"/>
+          <w:i/>
+        </w:rPr>
+        <w:t>[Chèn sơ đồ: Sơ đồ 13: 3.4 Cấu hình Hardhat localhost và MetaMask]</w:t>
+      </w:r>
+    </w:p>
+    <w:p>
+      <w:pPr>
+        <w:pStyle w:val="Heading2"/>
+        <w:spacing w:line="360" w:lineRule="auto" w:after="120"/>
+      </w:pPr>
+      <w:r>
+        <w:t>3.5 Phương án deploy frontend/backend</w:t>
+      </w:r>
+    </w:p>
+    <w:p>
+      <w:pPr>
+        <w:spacing w:line="360" w:lineRule="auto" w:after="120"/>
+      </w:pPr>
+      <w:r>
+        <w:rPr>
+          <w:b w:val="0"/>
+          <w:i w:val="0"/>
+        </w:rPr>
+        <w:t>Mô tả phương án triển khai Azure và chuẩn bị production.</w:t>
+      </w:r>
+    </w:p>
+    <w:p>
+      <w:pPr>
+        <w:spacing w:line="360" w:lineRule="auto" w:after="120"/>
+      </w:pPr>
+      <w:r>
+        <w:rPr>
+          <w:b w:val="0"/>
+          <w:i/>
+        </w:rPr>
+        <w:t>[Chèn hình: Hình 14: 3.5 Phương án deploy frontend/backend]</w:t>
+      </w:r>
+    </w:p>
+    <w:p>
+      <w:pPr>
+        <w:spacing w:line="360" w:lineRule="auto" w:after="120"/>
+      </w:pPr>
+      <w:r>
+        <w:rPr>
+          <w:b w:val="0"/>
+          <w:i/>
+        </w:rPr>
+        <w:t>[Mô tả hình: ............................................................]</w:t>
+      </w:r>
+    </w:p>
+    <w:p>
+      <w:pPr>
+        <w:spacing w:line="360" w:lineRule="auto" w:after="120"/>
+      </w:pPr>
+      <w:r>
+        <w:rPr>
+          <w:b w:val="0"/>
+          <w:i/>
+        </w:rPr>
+        <w:t>[Chèn bảng: Bảng 14: 3.5 Phương án deploy frontend/backend]</w:t>
+      </w:r>
+    </w:p>
+    <w:p>
+      <w:pPr>
+        <w:spacing w:line="360" w:lineRule="auto" w:after="120"/>
+      </w:pPr>
+      <w:r>
+        <w:rPr>
+          <w:b w:val="0"/>
+          <w:i/>
+        </w:rPr>
+        <w:t>[Chèn sơ đồ: Sơ đồ 14: 3.5 Phương án deploy frontend/backend]</w:t>
+      </w:r>
+    </w:p>
+    <w:p>
+      <w:pPr>
+        <w:pStyle w:val="Heading1"/>
+        <w:spacing w:line="360" w:lineRule="auto" w:after="120"/>
+      </w:pPr>
+      <w:r>
+        <w:t>CHƯƠNG 4. MÔ TẢ CHỨC NĂNG NGHIỆP VỤ</w:t>
+      </w:r>
+    </w:p>
+    <w:p>
+      <w:pPr>
+        <w:pStyle w:val="Heading2"/>
+        <w:spacing w:line="360" w:lineRule="auto" w:after="120"/>
+      </w:pPr>
+      <w:r>
+        <w:t>4.1 Chức năng người dùng</w:t>
+      </w:r>
+    </w:p>
+    <w:p>
+      <w:pPr>
+        <w:spacing w:line="360" w:lineRule="auto" w:after="120"/>
+      </w:pPr>
+      <w:r>
+        <w:rPr>
+          <w:b w:val="0"/>
+          <w:i w:val="0"/>
+        </w:rPr>
+        <w:t>Kết nối ví, xem sân, đặt sân, xem lịch sử giao dịch.</w:t>
+      </w:r>
+    </w:p>
+    <w:p>
+      <w:pPr>
+        <w:spacing w:line="360" w:lineRule="auto" w:after="120"/>
+      </w:pPr>
+      <w:r>
+        <w:rPr>
+          <w:b w:val="0"/>
+          <w:i/>
+        </w:rPr>
+        <w:t>[Chèn hình: Hình 15: 4.1 Chức năng người dùng]</w:t>
+      </w:r>
+    </w:p>
+    <w:p>
+      <w:pPr>
+        <w:spacing w:line="360" w:lineRule="auto" w:after="120"/>
+      </w:pPr>
+      <w:r>
+        <w:rPr>
+          <w:b w:val="0"/>
+          <w:i/>
+        </w:rPr>
+        <w:t>[Mô tả hình: ............................................................]</w:t>
+      </w:r>
+    </w:p>
+    <w:p>
+      <w:pPr>
+        <w:spacing w:line="360" w:lineRule="auto" w:after="120"/>
+      </w:pPr>
+      <w:r>
+        <w:rPr>
+          <w:b w:val="0"/>
+          <w:i/>
+        </w:rPr>
+        <w:t>[Chèn bảng: Bảng 15: 4.1 Chức năng người dùng]</w:t>
+      </w:r>
+    </w:p>
+    <w:p>
+      <w:pPr>
+        <w:spacing w:line="360" w:lineRule="auto" w:after="120"/>
+      </w:pPr>
+      <w:r>
+        <w:rPr>
+          <w:b w:val="0"/>
+          <w:i/>
+        </w:rPr>
+        <w:t>[Chèn sơ đồ: Sơ đồ 15: 4.1 Chức năng người dùng]</w:t>
+      </w:r>
+    </w:p>
+    <w:p>
+      <w:pPr>
+        <w:pStyle w:val="Heading2"/>
+        <w:spacing w:line="360" w:lineRule="auto" w:after="120"/>
+      </w:pPr>
+      <w:r>
+        <w:t>4.2 Chức năng quản trị viên</w:t>
+      </w:r>
+    </w:p>
+    <w:p>
+      <w:pPr>
+        <w:spacing w:line="360" w:lineRule="auto" w:after="120"/>
+      </w:pPr>
+      <w:r>
+        <w:rPr>
+          <w:b w:val="0"/>
+          <w:i w:val="0"/>
+        </w:rPr>
+        <w:t>CRUD sân, thống kê doanh thu, giám sát trạng thái sân.</w:t>
+      </w:r>
+    </w:p>
+    <w:p>
+      <w:pPr>
+        <w:spacing w:line="360" w:lineRule="auto" w:after="120"/>
+      </w:pPr>
+      <w:r>
+        <w:rPr>
+          <w:b w:val="0"/>
+          <w:i/>
+        </w:rPr>
+        <w:t>[Chèn hình: Hình 16: 4.2 Chức năng quản trị viên]</w:t>
+      </w:r>
+    </w:p>
+    <w:p>
+      <w:pPr>
+        <w:spacing w:line="360" w:lineRule="auto" w:after="120"/>
+      </w:pPr>
+      <w:r>
+        <w:rPr>
+          <w:b w:val="0"/>
+          <w:i/>
+        </w:rPr>
+        <w:t>[Mô tả hình: ............................................................]</w:t>
+      </w:r>
+    </w:p>
+    <w:p>
+      <w:pPr>
+        <w:spacing w:line="360" w:lineRule="auto" w:after="120"/>
+      </w:pPr>
+      <w:r>
+        <w:rPr>
+          <w:b w:val="0"/>
+          <w:i/>
+        </w:rPr>
+        <w:t>[Chèn bảng: Bảng 16: 4.2 Chức năng quản trị viên]</w:t>
+      </w:r>
+    </w:p>
+    <w:p>
+      <w:pPr>
+        <w:spacing w:line="360" w:lineRule="auto" w:after="120"/>
+      </w:pPr>
+      <w:r>
+        <w:rPr>
+          <w:b w:val="0"/>
+          <w:i/>
+        </w:rPr>
+        <w:t>[Chèn sơ đồ: Sơ đồ 16: 4.2 Chức năng quản trị viên]</w:t>
+      </w:r>
+    </w:p>
+    <w:p>
+      <w:pPr>
+        <w:pStyle w:val="Heading2"/>
+        <w:spacing w:line="360" w:lineRule="auto" w:after="120"/>
+      </w:pPr>
+      <w:r>
+        <w:t>4.3 Ma trận phân quyền</w:t>
+      </w:r>
+    </w:p>
+    <w:p>
+      <w:pPr>
+        <w:spacing w:line="360" w:lineRule="auto" w:after="120"/>
+      </w:pPr>
+      <w:r>
+        <w:rPr>
+          <w:b w:val="0"/>
+          <w:i w:val="0"/>
+        </w:rPr>
+        <w:t>Bảng quyền thao tác theo từng vai trò.</w:t>
+      </w:r>
+    </w:p>
+    <w:p>
+      <w:pPr>
+        <w:spacing w:line="360" w:lineRule="auto" w:after="120"/>
+      </w:pPr>
+      <w:r>
+        <w:rPr>
+          <w:b w:val="0"/>
+          <w:i/>
+        </w:rPr>
+        <w:t>[Chèn hình: Hình 17: 4.3 Ma trận phân quyền]</w:t>
+      </w:r>
+    </w:p>
+    <w:p>
+      <w:pPr>
+        <w:spacing w:line="360" w:lineRule="auto" w:after="120"/>
+      </w:pPr>
+      <w:r>
+        <w:rPr>
+          <w:b w:val="0"/>
+          <w:i/>
+        </w:rPr>
+        <w:t>[Mô tả hình: ............................................................]</w:t>
+      </w:r>
+    </w:p>
+    <w:p>
+      <w:pPr>
+        <w:spacing w:line="360" w:lineRule="auto" w:after="120"/>
+      </w:pPr>
+      <w:r>
+        <w:rPr>
+          <w:b w:val="0"/>
+          <w:i/>
+        </w:rPr>
+        <w:t>[Chèn bảng: Bảng 17: 4.3 Ma trận phân quyền]</w:t>
+      </w:r>
+    </w:p>
+    <w:p>
+      <w:pPr>
+        <w:spacing w:line="360" w:lineRule="auto" w:after="120"/>
+      </w:pPr>
+      <w:r>
+        <w:rPr>
+          <w:b w:val="0"/>
+          <w:i/>
+        </w:rPr>
+        <w:t>[Chèn sơ đồ: Sơ đồ 17: 4.3 Ma trận phân quyền]</w:t>
+      </w:r>
+    </w:p>
+    <w:p>
+      <w:pPr>
+        <w:pStyle w:val="Heading2"/>
+        <w:spacing w:line="360" w:lineRule="auto" w:after="120"/>
+      </w:pPr>
+      <w:r>
+        <w:t>4.4 Xử lý ngoại lệ nghiệp vụ</w:t>
+      </w:r>
+    </w:p>
+    <w:p>
+      <w:pPr>
+        <w:spacing w:line="360" w:lineRule="auto" w:after="120"/>
+      </w:pPr>
+      <w:r>
+        <w:rPr>
+          <w:b w:val="0"/>
+          <w:i w:val="0"/>
+        </w:rPr>
+        <w:t>Mô tả các lỗi và chiến lược xử lý an toàn.</w:t>
+      </w:r>
+    </w:p>
+    <w:p>
+      <w:pPr>
+        <w:spacing w:line="360" w:lineRule="auto" w:after="120"/>
+      </w:pPr>
+      <w:r>
+        <w:rPr>
+          <w:b w:val="0"/>
+          <w:i/>
+        </w:rPr>
+        <w:t>[Chèn hình: Hình 18: 4.4 Xử lý ngoại lệ nghiệp vụ]</w:t>
+      </w:r>
+    </w:p>
+    <w:p>
+      <w:pPr>
+        <w:spacing w:line="360" w:lineRule="auto" w:after="120"/>
+      </w:pPr>
+      <w:r>
+        <w:rPr>
+          <w:b w:val="0"/>
+          <w:i/>
+        </w:rPr>
+        <w:t>[Mô tả hình: ............................................................]</w:t>
+      </w:r>
+    </w:p>
+    <w:p>
+      <w:pPr>
+        <w:spacing w:line="360" w:lineRule="auto" w:after="120"/>
+      </w:pPr>
+      <w:r>
+        <w:rPr>
+          <w:b w:val="0"/>
+          <w:i/>
+        </w:rPr>
+        <w:t>[Chèn bảng: Bảng 18: 4.4 Xử lý ngoại lệ nghiệp vụ]</w:t>
+      </w:r>
+    </w:p>
+    <w:p>
+      <w:pPr>
+        <w:spacing w:line="360" w:lineRule="auto" w:after="120"/>
+      </w:pPr>
+      <w:r>
+        <w:rPr>
+          <w:b w:val="0"/>
+          <w:i/>
+        </w:rPr>
+        <w:t>[Chèn sơ đồ: Sơ đồ 18: 4.4 Xử lý ngoại lệ nghiệp vụ]</w:t>
+      </w:r>
+    </w:p>
+    <w:p>
+      <w:pPr>
+        <w:pStyle w:val="Heading1"/>
+        <w:spacing w:line="360" w:lineRule="auto" w:after="120"/>
+      </w:pPr>
+      <w:r>
+        <w:t>CHƯƠNG 5. KIỂM THỬ VÀ ĐÁNH GIÁ KẾT QUẢ</w:t>
+      </w:r>
+    </w:p>
+    <w:p>
+      <w:pPr>
+        <w:pStyle w:val="Heading2"/>
+        <w:spacing w:line="360" w:lineRule="auto" w:after="120"/>
+      </w:pPr>
+      <w:r>
         <w:t>5.1 Kế hoạch kiểm thử</w:t>
       </w:r>
     </w:p>
@@ -687,8 +1710,9 @@
       <w:r>
         <w:rPr>
           <w:b w:val="0"/>
+          <w:i w:val="0"/>
         </w:rPr>
-        <w:t>Kiểm thử bao gồm kiểm thử chức năng, kiểm thử tích hợp và kiểm thử nghiệp vụ giao dịch. Các kịch bản trọng tâm gồm kết nối ví, đặt sân thành công, đặt sân khi đã bị đặt, kiểm tra phân quyền admin và truy xuất lịch sử.</w:t>
+        <w:t>Nêu phạm vi, kịch bản và tiêu chí pass/fail.</w:t>
       </w:r>
     </w:p>
     <w:p>
@@ -698,8 +1722,9 @@
       <w:r>
         <w:rPr>
           <w:b w:val="0"/>
+          <w:i/>
         </w:rPr>
-        <w:t>5.2 Kết quả kiểm thử tiêu biểu</w:t>
+        <w:t>[Chèn hình: Hình 19: 5.1 Kế hoạch kiểm thử]</w:t>
       </w:r>
     </w:p>
     <w:p>
@@ -709,8 +1734,9 @@
       <w:r>
         <w:rPr>
           <w:b w:val="0"/>
+          <w:i/>
         </w:rPr>
-        <w:t>Kịch bản đặt sân hợp lệ cho kết quả tạo transaction hash và cập nhật trạng thái sân chính xác. Kịch bản đặt trùng trả về lỗi đúng thiết kế từ Smart Contract. Kịch bản admin CRUD sân thực thi thành công với tài khoản có quyền và bị từ chối với tài khoản không đủ quyền.</w:t>
+        <w:t>[Mô tả hình: ............................................................]</w:t>
       </w:r>
     </w:p>
     <w:p>
@@ -720,8 +1746,9 @@
       <w:r>
         <w:rPr>
           <w:b w:val="0"/>
+          <w:i/>
         </w:rPr>
-        <w:t>5.3 Đánh giá chất lượng</w:t>
+        <w:t>[Chèn bảng: Bảng 19: 5.1 Kế hoạch kiểm thử]</w:t>
       </w:r>
     </w:p>
     <w:p>
@@ -731,19 +1758,30 @@
       <w:r>
         <w:rPr>
           <w:b w:val="0"/>
+          <w:i/>
         </w:rPr>
-        <w:t>Hệ thống đáp ứng mục tiêu minh bạch giao dịch và đồng bộ trạng thái giữa blockchain và giao diện. Trong môi trường Hardhat, thời gian phản hồi nhanh và gas fee gần như bằng 0, phù hợp cho giai đoạn thử nghiệm và trình diễn nghiệp vụ.</w:t>
+        <w:t>[Chèn sơ đồ: Sơ đồ 19: 5.1 Kế hoạch kiểm thử]</w:t>
       </w:r>
     </w:p>
     <w:p>
       <w:pPr>
+        <w:pStyle w:val="Heading2"/>
+        <w:spacing w:line="360" w:lineRule="auto" w:after="120"/>
+      </w:pPr>
+      <w:r>
+        <w:t>5.2 Bộ test case chi tiết</w:t>
+      </w:r>
+    </w:p>
+    <w:p>
+      <w:pPr>
         <w:spacing w:line="360" w:lineRule="auto" w:after="120"/>
       </w:pPr>
       <w:r>
         <w:rPr>
           <w:b w:val="0"/>
+          <w:i w:val="0"/>
         </w:rPr>
-        <w:t>[Bảng 5.1] Bảng kết quả kiểm thử chi tiết</w:t>
+        <w:t>Liệt kê các test case cốt lõi và expected output.</w:t>
       </w:r>
     </w:p>
     <w:p>
@@ -752,9 +1790,10 @@
       </w:pPr>
       <w:r>
         <w:rPr>
-          <w:b/>
+          <w:b w:val="0"/>
+          <w:i/>
         </w:rPr>
-        <w:t>CHƯƠNG 6. ĐÁNH GIÁ VÀ HƯỚNG PHÁT TRIỂN</w:t>
+        <w:t>[Chèn hình: Hình 20: 5.2 Bộ test case chi tiết]</w:t>
       </w:r>
     </w:p>
     <w:p>
@@ -764,8 +1803,9 @@
       <w:r>
         <w:rPr>
           <w:b w:val="0"/>
+          <w:i/>
         </w:rPr>
-        <w:t>6.1 Ưu điểm hệ thống</w:t>
+        <w:t>[Mô tả hình: ............................................................]</w:t>
       </w:r>
     </w:p>
     <w:p>
@@ -775,8 +1815,9 @@
       <w:r>
         <w:rPr>
           <w:b w:val="0"/>
+          <w:i/>
         </w:rPr>
-        <w:t>Kiến trúc ba lớp giúp tách bạch trách nhiệm, tăng khả năng bảo trì. Transaction signing phía client giúp giảm rủi ro lộ khóa bí mật. Cơ chế on-chain nâng cao tính toàn vẹn và khả năng kiểm chứng dữ liệu đặt sân.</w:t>
+        <w:t>[Chèn bảng: Bảng 20: 5.2 Bộ test case chi tiết]</w:t>
       </w:r>
     </w:p>
     <w:p>
@@ -786,19 +1827,30 @@
       <w:r>
         <w:rPr>
           <w:b w:val="0"/>
+          <w:i/>
         </w:rPr>
-        <w:t>6.2 Hạn chế hiện tại</w:t>
+        <w:t>[Chèn sơ đồ: Sơ đồ 20: 5.2 Bộ test case chi tiết]</w:t>
       </w:r>
     </w:p>
     <w:p>
       <w:pPr>
+        <w:pStyle w:val="Heading2"/>
+        <w:spacing w:line="360" w:lineRule="auto" w:after="120"/>
+      </w:pPr>
+      <w:r>
+        <w:t>5.3 Kết quả thực nghiệm</w:t>
+      </w:r>
+    </w:p>
+    <w:p>
+      <w:pPr>
         <w:spacing w:line="360" w:lineRule="auto" w:after="120"/>
       </w:pPr>
       <w:r>
         <w:rPr>
           <w:b w:val="0"/>
+          <w:i w:val="0"/>
         </w:rPr>
-        <w:t>Hệ thống còn phụ thuộc Hardhat localhost nên chưa phản ánh đầy đủ điều kiện mạng công khai như dao động gas fee, độ trễ xác nhận khối và rủi ro mạng. Ngoài ra, phần giám sát vận hành và cảnh báo giao dịch lỗi chưa được tự động hóa toàn diện.</w:t>
+        <w:t>Trình bày số liệu và mức độ đáp ứng yêu cầu.</w:t>
       </w:r>
     </w:p>
     <w:p>
@@ -808,8 +1860,9 @@
       <w:r>
         <w:rPr>
           <w:b w:val="0"/>
+          <w:i/>
         </w:rPr>
-        <w:t>6.3 Hướng phát triển</w:t>
+        <w:t>[Chèn hình: Hình 21: 5.3 Kết quả thực nghiệm]</w:t>
       </w:r>
     </w:p>
     <w:p>
@@ -819,8 +1872,9 @@
       <w:r>
         <w:rPr>
           <w:b w:val="0"/>
+          <w:i/>
         </w:rPr>
-        <w:t>Giai đoạn tiếp theo cần mở rộng triển khai lên testnet Sepolia, bổ sung cơ chế theo dõi event theo thời gian thực, tối ưu middleware backend cho thống kê nâng cao và tích hợp dashboard quan sát hiệu năng. Song song đó, cần hoàn thiện quy trình bảo mật ứng dụng theo chuẩn production.</w:t>
+        <w:t>[Mô tả hình: ............................................................]</w:t>
       </w:r>
     </w:p>
     <w:p>
@@ -830,8 +1884,9 @@
       <w:r>
         <w:rPr>
           <w:b w:val="0"/>
+          <w:i/>
         </w:rPr>
-        <w:t>[Sơ đồ 6.1] Lộ trình chuyển từ localhost sang Sepolia</w:t>
+        <w:t>[Chèn bảng: Bảng 21: 5.3 Kết quả thực nghiệm]</w:t>
       </w:r>
     </w:p>
     <w:p>
@@ -840,20 +1895,325 @@
       </w:pPr>
       <w:r>
         <w:rPr>
-          <w:b/>
+          <w:b w:val="0"/>
+          <w:i/>
         </w:rPr>
+        <w:t>[Chèn sơ đồ: Sơ đồ 21: 5.3 Kết quả thực nghiệm]</w:t>
+      </w:r>
+    </w:p>
+    <w:p>
+      <w:pPr>
+        <w:pStyle w:val="Heading2"/>
+        <w:spacing w:line="360" w:lineRule="auto" w:after="120"/>
+      </w:pPr>
+      <w:r>
+        <w:t>5.4 Nhận xét</w:t>
+      </w:r>
+    </w:p>
+    <w:p>
+      <w:pPr>
+        <w:spacing w:line="360" w:lineRule="auto" w:after="120"/>
+      </w:pPr>
+      <w:r>
+        <w:rPr>
+          <w:b w:val="0"/>
+          <w:i w:val="0"/>
+        </w:rPr>
+        <w:t>Đánh giá các điểm đạt được và tồn tại.</w:t>
+      </w:r>
+    </w:p>
+    <w:p>
+      <w:pPr>
+        <w:spacing w:line="360" w:lineRule="auto" w:after="120"/>
+      </w:pPr>
+      <w:r>
+        <w:rPr>
+          <w:b w:val="0"/>
+          <w:i/>
+        </w:rPr>
+        <w:t>[Chèn hình: Hình 22: 5.4 Nhận xét]</w:t>
+      </w:r>
+    </w:p>
+    <w:p>
+      <w:pPr>
+        <w:spacing w:line="360" w:lineRule="auto" w:after="120"/>
+      </w:pPr>
+      <w:r>
+        <w:rPr>
+          <w:b w:val="0"/>
+          <w:i/>
+        </w:rPr>
+        <w:t>[Mô tả hình: ............................................................]</w:t>
+      </w:r>
+    </w:p>
+    <w:p>
+      <w:pPr>
+        <w:spacing w:line="360" w:lineRule="auto" w:after="120"/>
+      </w:pPr>
+      <w:r>
+        <w:rPr>
+          <w:b w:val="0"/>
+          <w:i/>
+        </w:rPr>
+        <w:t>[Chèn bảng: Bảng 22: 5.4 Nhận xét]</w:t>
+      </w:r>
+    </w:p>
+    <w:p>
+      <w:pPr>
+        <w:spacing w:line="360" w:lineRule="auto" w:after="120"/>
+      </w:pPr>
+      <w:r>
+        <w:rPr>
+          <w:b w:val="0"/>
+          <w:i/>
+        </w:rPr>
+        <w:t>[Chèn sơ đồ: Sơ đồ 22: 5.4 Nhận xét]</w:t>
+      </w:r>
+    </w:p>
+    <w:p>
+      <w:pPr>
+        <w:pStyle w:val="Heading1"/>
+        <w:spacing w:line="360" w:lineRule="auto" w:after="120"/>
+      </w:pPr>
+      <w:r>
+        <w:t>CHƯƠNG 6. ĐÁNH GIÁ HỆ THỐNG VÀ HƯỚNG PHÁT TRIỂN</w:t>
+      </w:r>
+    </w:p>
+    <w:p>
+      <w:pPr>
+        <w:pStyle w:val="Heading2"/>
+        <w:spacing w:line="360" w:lineRule="auto" w:after="120"/>
+      </w:pPr>
+      <w:r>
+        <w:t>6.1 Ưu điểm</w:t>
+      </w:r>
+    </w:p>
+    <w:p>
+      <w:pPr>
+        <w:spacing w:line="360" w:lineRule="auto" w:after="120"/>
+      </w:pPr>
+      <w:r>
+        <w:rPr>
+          <w:b w:val="0"/>
+          <w:i w:val="0"/>
+        </w:rPr>
+        <w:t>Phân tích các điểm mạnh về tính minh bạch và khả năng mở rộng.</w:t>
+      </w:r>
+    </w:p>
+    <w:p>
+      <w:pPr>
+        <w:spacing w:line="360" w:lineRule="auto" w:after="120"/>
+      </w:pPr>
+      <w:r>
+        <w:rPr>
+          <w:b w:val="0"/>
+          <w:i/>
+        </w:rPr>
+        <w:t>[Chèn hình: Hình 23: 6.1 Ưu điểm]</w:t>
+      </w:r>
+    </w:p>
+    <w:p>
+      <w:pPr>
+        <w:spacing w:line="360" w:lineRule="auto" w:after="120"/>
+      </w:pPr>
+      <w:r>
+        <w:rPr>
+          <w:b w:val="0"/>
+          <w:i/>
+        </w:rPr>
+        <w:t>[Mô tả hình: ............................................................]</w:t>
+      </w:r>
+    </w:p>
+    <w:p>
+      <w:pPr>
+        <w:spacing w:line="360" w:lineRule="auto" w:after="120"/>
+      </w:pPr>
+      <w:r>
+        <w:rPr>
+          <w:b w:val="0"/>
+          <w:i/>
+        </w:rPr>
+        <w:t>[Chèn bảng: Bảng 23: 6.1 Ưu điểm]</w:t>
+      </w:r>
+    </w:p>
+    <w:p>
+      <w:pPr>
+        <w:spacing w:line="360" w:lineRule="auto" w:after="120"/>
+      </w:pPr>
+      <w:r>
+        <w:rPr>
+          <w:b w:val="0"/>
+          <w:i/>
+        </w:rPr>
+        <w:t>[Chèn sơ đồ: Sơ đồ 23: 6.1 Ưu điểm]</w:t>
+      </w:r>
+    </w:p>
+    <w:p>
+      <w:pPr>
+        <w:pStyle w:val="Heading2"/>
+        <w:spacing w:line="360" w:lineRule="auto" w:after="120"/>
+      </w:pPr>
+      <w:r>
+        <w:t>6.2 Hạn chế của Hardhat localhost</w:t>
+      </w:r>
+    </w:p>
+    <w:p>
+      <w:pPr>
+        <w:spacing w:line="360" w:lineRule="auto" w:after="120"/>
+      </w:pPr>
+      <w:r>
+        <w:rPr>
+          <w:b w:val="0"/>
+          <w:i w:val="0"/>
+        </w:rPr>
+        <w:t>Nêu giới hạn so với mạng công khai.</w:t>
+      </w:r>
+    </w:p>
+    <w:p>
+      <w:pPr>
+        <w:spacing w:line="360" w:lineRule="auto" w:after="120"/>
+      </w:pPr>
+      <w:r>
+        <w:rPr>
+          <w:b w:val="0"/>
+          <w:i/>
+        </w:rPr>
+        <w:t>[Chèn hình: Hình 24: 6.2 Hạn chế của Hardhat localhost]</w:t>
+      </w:r>
+    </w:p>
+    <w:p>
+      <w:pPr>
+        <w:spacing w:line="360" w:lineRule="auto" w:after="120"/>
+      </w:pPr>
+      <w:r>
+        <w:rPr>
+          <w:b w:val="0"/>
+          <w:i/>
+        </w:rPr>
+        <w:t>[Mô tả hình: ............................................................]</w:t>
+      </w:r>
+    </w:p>
+    <w:p>
+      <w:pPr>
+        <w:spacing w:line="360" w:lineRule="auto" w:after="120"/>
+      </w:pPr>
+      <w:r>
+        <w:rPr>
+          <w:b w:val="0"/>
+          <w:i/>
+        </w:rPr>
+        <w:t>[Chèn bảng: Bảng 24: 6.2 Hạn chế của Hardhat localhost]</w:t>
+      </w:r>
+    </w:p>
+    <w:p>
+      <w:pPr>
+        <w:spacing w:line="360" w:lineRule="auto" w:after="120"/>
+      </w:pPr>
+      <w:r>
+        <w:rPr>
+          <w:b w:val="0"/>
+          <w:i/>
+        </w:rPr>
+        <w:t>[Chèn sơ đồ: Sơ đồ 24: 6.2 Hạn chế của Hardhat localhost]</w:t>
+      </w:r>
+    </w:p>
+    <w:p>
+      <w:pPr>
+        <w:pStyle w:val="Heading2"/>
+        <w:spacing w:line="360" w:lineRule="auto" w:after="120"/>
+      </w:pPr>
+      <w:r>
+        <w:t>6.3 Hướng phát triển lên Sepolia</w:t>
+      </w:r>
+    </w:p>
+    <w:p>
+      <w:pPr>
+        <w:spacing w:line="360" w:lineRule="auto" w:after="120"/>
+      </w:pPr>
+      <w:r>
+        <w:rPr>
+          <w:b w:val="0"/>
+          <w:i w:val="0"/>
+        </w:rPr>
+        <w:t>Lộ trình triển khai testnet và cải tiến tiếp theo.</w:t>
+      </w:r>
+    </w:p>
+    <w:p>
+      <w:pPr>
+        <w:spacing w:line="360" w:lineRule="auto" w:after="120"/>
+      </w:pPr>
+      <w:r>
+        <w:rPr>
+          <w:b w:val="0"/>
+          <w:i/>
+        </w:rPr>
+        <w:t>[Chèn hình: Hình 25: 6.3 Hướng phát triển lên Sepolia]</w:t>
+      </w:r>
+    </w:p>
+    <w:p>
+      <w:pPr>
+        <w:spacing w:line="360" w:lineRule="auto" w:after="120"/>
+      </w:pPr>
+      <w:r>
+        <w:rPr>
+          <w:b w:val="0"/>
+          <w:i/>
+        </w:rPr>
+        <w:t>[Mô tả hình: ............................................................]</w:t>
+      </w:r>
+    </w:p>
+    <w:p>
+      <w:pPr>
+        <w:spacing w:line="360" w:lineRule="auto" w:after="120"/>
+      </w:pPr>
+      <w:r>
+        <w:rPr>
+          <w:b w:val="0"/>
+          <w:i/>
+        </w:rPr>
+        <w:t>[Chèn bảng: Bảng 25: 6.3 Hướng phát triển lên Sepolia]</w:t>
+      </w:r>
+    </w:p>
+    <w:p>
+      <w:pPr>
+        <w:spacing w:line="360" w:lineRule="auto" w:after="120"/>
+      </w:pPr>
+      <w:r>
+        <w:rPr>
+          <w:b w:val="0"/>
+          <w:i/>
+        </w:rPr>
+        <w:t>[Chèn sơ đồ: Sơ đồ 25: 6.3 Hướng phát triển lên Sepolia]</w:t>
+      </w:r>
+    </w:p>
+    <w:p>
+      <w:pPr>
+        <w:pStyle w:val="Heading1"/>
+        <w:spacing w:line="360" w:lineRule="auto" w:after="120"/>
+      </w:pPr>
+      <w:r>
         <w:t>CHƯƠNG 7. KẾT LUẬN</w:t>
       </w:r>
     </w:p>
     <w:p>
       <w:pPr>
+        <w:pStyle w:val="Heading2"/>
+        <w:spacing w:line="360" w:lineRule="auto" w:after="120"/>
+      </w:pPr>
+      <w:r>
+        <w:t>7.1 Kết quả đạt được</w:t>
+      </w:r>
+    </w:p>
+    <w:p>
+      <w:pPr>
         <w:spacing w:line="360" w:lineRule="auto" w:after="120"/>
       </w:pPr>
       <w:r>
         <w:rPr>
           <w:b w:val="0"/>
+          <w:i w:val="0"/>
         </w:rPr>
-        <w:t>Đề tài đã xây dựng thành công mô hình DApp đặt sân thể thao tích hợp blockchain, đáp ứng đầy đủ các luồng cốt lõi gồm xác thực bằng ví, đặt sân, thanh toán ETH, quản trị sân và theo dõi doanh thu. Kết quả triển khai cho thấy giải pháp blockchain phù hợp để xử lý các nghiệp vụ cần tính minh bạch và chống sửa đổi dữ liệu.</w:t>
+        <w:t>Tổng kết mục tiêu đã hoàn thành.</w:t>
       </w:r>
     </w:p>
     <w:p>
@@ -863,8 +2223,9 @@
       <w:r>
         <w:rPr>
           <w:b w:val="0"/>
+          <w:i/>
         </w:rPr>
-        <w:t>Về mặt học thuật, nhóm đã vận dụng hiệu quả kiến thức về Smart Contract, EVM, JSON-RPC, REST API và Authorization trong một sản phẩm có tính ứng dụng thực tế. Về mặt thực tiễn, hệ thống là nền tảng khả thi để mở rộng thành dịch vụ đặt sân trực tuyến quy mô lớn khi được triển khai trên hạ tầng mạng công khai.</w:t>
+        <w:t>[Chèn hình: Hình 26: 7.1 Kết quả đạt được]</w:t>
       </w:r>
     </w:p>
     <w:p>
@@ -873,8 +2234,180 @@
       </w:pPr>
       <w:r>
         <w:rPr>
-          <w:b/>
+          <w:b w:val="0"/>
+          <w:i/>
         </w:rPr>
+        <w:t>[Mô tả hình: ............................................................]</w:t>
+      </w:r>
+    </w:p>
+    <w:p>
+      <w:pPr>
+        <w:spacing w:line="360" w:lineRule="auto" w:after="120"/>
+      </w:pPr>
+      <w:r>
+        <w:rPr>
+          <w:b w:val="0"/>
+          <w:i/>
+        </w:rPr>
+        <w:t>[Chèn bảng: Bảng 26: 7.1 Kết quả đạt được]</w:t>
+      </w:r>
+    </w:p>
+    <w:p>
+      <w:pPr>
+        <w:spacing w:line="360" w:lineRule="auto" w:after="120"/>
+      </w:pPr>
+      <w:r>
+        <w:rPr>
+          <w:b w:val="0"/>
+          <w:i/>
+        </w:rPr>
+        <w:t>[Chèn sơ đồ: Sơ đồ 26: 7.1 Kết quả đạt được]</w:t>
+      </w:r>
+    </w:p>
+    <w:p>
+      <w:pPr>
+        <w:pStyle w:val="Heading2"/>
+        <w:spacing w:line="360" w:lineRule="auto" w:after="120"/>
+      </w:pPr>
+      <w:r>
+        <w:t>7.2 Đóng góp</w:t>
+      </w:r>
+    </w:p>
+    <w:p>
+      <w:pPr>
+        <w:spacing w:line="360" w:lineRule="auto" w:after="120"/>
+      </w:pPr>
+      <w:r>
+        <w:rPr>
+          <w:b w:val="0"/>
+          <w:i w:val="0"/>
+        </w:rPr>
+        <w:t>Nêu giá trị học thuật và thực tiễn.</w:t>
+      </w:r>
+    </w:p>
+    <w:p>
+      <w:pPr>
+        <w:spacing w:line="360" w:lineRule="auto" w:after="120"/>
+      </w:pPr>
+      <w:r>
+        <w:rPr>
+          <w:b w:val="0"/>
+          <w:i/>
+        </w:rPr>
+        <w:t>[Chèn hình: Hình 27: 7.2 Đóng góp]</w:t>
+      </w:r>
+    </w:p>
+    <w:p>
+      <w:pPr>
+        <w:spacing w:line="360" w:lineRule="auto" w:after="120"/>
+      </w:pPr>
+      <w:r>
+        <w:rPr>
+          <w:b w:val="0"/>
+          <w:i/>
+        </w:rPr>
+        <w:t>[Mô tả hình: ............................................................]</w:t>
+      </w:r>
+    </w:p>
+    <w:p>
+      <w:pPr>
+        <w:spacing w:line="360" w:lineRule="auto" w:after="120"/>
+      </w:pPr>
+      <w:r>
+        <w:rPr>
+          <w:b w:val="0"/>
+          <w:i/>
+        </w:rPr>
+        <w:t>[Chèn bảng: Bảng 27: 7.2 Đóng góp]</w:t>
+      </w:r>
+    </w:p>
+    <w:p>
+      <w:pPr>
+        <w:spacing w:line="360" w:lineRule="auto" w:after="120"/>
+      </w:pPr>
+      <w:r>
+        <w:rPr>
+          <w:b w:val="0"/>
+          <w:i/>
+        </w:rPr>
+        <w:t>[Chèn sơ đồ: Sơ đồ 27: 7.2 Đóng góp]</w:t>
+      </w:r>
+    </w:p>
+    <w:p>
+      <w:pPr>
+        <w:pStyle w:val="Heading2"/>
+        <w:spacing w:line="360" w:lineRule="auto" w:after="120"/>
+      </w:pPr>
+      <w:r>
+        <w:t>7.3 Đề xuất mở rộng</w:t>
+      </w:r>
+    </w:p>
+    <w:p>
+      <w:pPr>
+        <w:spacing w:line="360" w:lineRule="auto" w:after="120"/>
+      </w:pPr>
+      <w:r>
+        <w:rPr>
+          <w:b w:val="0"/>
+          <w:i w:val="0"/>
+        </w:rPr>
+        <w:t>Đề xuất nâng cấp kỹ thuật trong tương lai.</w:t>
+      </w:r>
+    </w:p>
+    <w:p>
+      <w:pPr>
+        <w:spacing w:line="360" w:lineRule="auto" w:after="120"/>
+      </w:pPr>
+      <w:r>
+        <w:rPr>
+          <w:b w:val="0"/>
+          <w:i/>
+        </w:rPr>
+        <w:t>[Chèn hình: Hình 28: 7.3 Đề xuất mở rộng]</w:t>
+      </w:r>
+    </w:p>
+    <w:p>
+      <w:pPr>
+        <w:spacing w:line="360" w:lineRule="auto" w:after="120"/>
+      </w:pPr>
+      <w:r>
+        <w:rPr>
+          <w:b w:val="0"/>
+          <w:i/>
+        </w:rPr>
+        <w:t>[Mô tả hình: ............................................................]</w:t>
+      </w:r>
+    </w:p>
+    <w:p>
+      <w:pPr>
+        <w:spacing w:line="360" w:lineRule="auto" w:after="120"/>
+      </w:pPr>
+      <w:r>
+        <w:rPr>
+          <w:b w:val="0"/>
+          <w:i/>
+        </w:rPr>
+        <w:t>[Chèn bảng: Bảng 28: 7.3 Đề xuất mở rộng]</w:t>
+      </w:r>
+    </w:p>
+    <w:p>
+      <w:pPr>
+        <w:spacing w:line="360" w:lineRule="auto" w:after="120"/>
+      </w:pPr>
+      <w:r>
+        <w:rPr>
+          <w:b w:val="0"/>
+          <w:i/>
+        </w:rPr>
+        <w:t>[Chèn sơ đồ: Sơ đồ 28: 7.3 Đề xuất mở rộng]</w:t>
+      </w:r>
+    </w:p>
+    <w:p>
+      <w:pPr>
+        <w:pStyle w:val="Heading1"/>
+        <w:spacing w:line="360" w:lineRule="auto" w:after="120"/>
+      </w:pPr>
+      <w:r>
         <w:t>PHỤ LỤC</w:t>
       </w:r>
     </w:p>
@@ -885,8 +2418,9 @@
       <w:r>
         <w:rPr>
           <w:b w:val="0"/>
+          <w:i w:val="0"/>
         </w:rPr>
-        <w:t>Phụ lục A: Danh sách endpoint backend và tham số request/response.</w:t>
+        <w:t>Phụ lục A: Danh sách API và mẫu request/response.</w:t>
       </w:r>
     </w:p>
     <w:p>
@@ -896,6 +2430,7 @@
       <w:r>
         <w:rPr>
           <w:b w:val="0"/>
+          <w:i w:val="0"/>
         </w:rPr>
         <w:t>Phụ lục B: Danh sách hàm Smart Contract và điều kiện kiểm tra.</w:t>
       </w:r>
@@ -907,18 +2442,17 @@
       <w:r>
         <w:rPr>
           <w:b w:val="0"/>
+          <w:i w:val="0"/>
         </w:rPr>
-        <w:t>Phụ lục C: Nhật ký giao dịch mẫu, transaction hash và trạng thái xác nhận.</w:t>
+        <w:t>Phụ lục C: Ảnh chụp màn hình giao diện và giao dịch thực tế.</w:t>
       </w:r>
     </w:p>
     <w:p>
       <w:pPr>
+        <w:pStyle w:val="Heading1"/>
         <w:spacing w:line="360" w:lineRule="auto" w:after="120"/>
       </w:pPr>
       <w:r>
-        <w:rPr>
-          <w:b/>
-        </w:rPr>
         <w:t>TÀI LIỆU THAM KHẢO</w:t>
       </w:r>
     </w:p>
@@ -929,8 +2463,9 @@
       <w:r>
         <w:rPr>
           <w:b w:val="0"/>
+          <w:i w:val="0"/>
         </w:rPr>
-        <w:t>Ethereum Foundation, Ethereum Whitepaper và tài liệu chính thức về EVM.</w:t>
+        <w:t>Ethereum Documentation</w:t>
       </w:r>
     </w:p>
     <w:p>
@@ -940,8 +2475,9 @@
       <w:r>
         <w:rPr>
           <w:b w:val="0"/>
+          <w:i w:val="0"/>
         </w:rPr>
-        <w:t>Hardhat Documentation, hướng dẫn phát triển và kiểm thử Smart Contract.</w:t>
+        <w:t>Hardhat Documentation</w:t>
       </w:r>
     </w:p>
     <w:p>
@@ -951,8 +2487,9 @@
       <w:r>
         <w:rPr>
           <w:b w:val="0"/>
+          <w:i w:val="0"/>
         </w:rPr>
-        <w:t>MetaMask Developer Docs, cơ chế provider và transaction signing.</w:t>
+        <w:t>MetaMask Developer Docs</w:t>
       </w:r>
     </w:p>
     <w:p>
@@ -962,8 +2499,9 @@
       <w:r>
         <w:rPr>
           <w:b w:val="0"/>
+          <w:i w:val="0"/>
         </w:rPr>
-        <w:t>Solidity Documentation, chuẩn ngôn ngữ và lưu ý bảo mật hợp đồng thông minh.</w:t>
+        <w:t>Solidity Documentation</w:t>
       </w:r>
     </w:p>
     <w:p>
@@ -973,15 +2511,22 @@
       <w:r>
         <w:rPr>
           <w:b w:val="0"/>
+          <w:i w:val="0"/>
         </w:rPr>
-        <w:t>Microsoft Azure Documentation, triển khai ứng dụng web và API trong môi trường đám mây.</w:t>
+        <w:t>Microsoft Azure Documentation</w:t>
       </w:r>
     </w:p>
     <w:sectPr>
       <w:pgSz w:w="12240" w:h="15840"/>
-      <w:pgMar w:top="1440" w:right="1800" w:bottom="1440" w:left="1800" w:header="720" w:footer="720" w:gutter="0"/>
+      <w:pgMar w:top="1134" w:right="1417" w:bottom="1134" w:left="1417" w:header="720" w:footer="720" w:gutter="0"/>
       <w:cols w:space="720"/>
       <w:docGrid w:linePitch="360"/>
+      <w:pgBorders w:offsetFrom="page">
+        <w:top w:val="single" w:sz="18" w:space="24" w:color="000000"/>
+        <w:left w:val="single" w:sz="18" w:space="24" w:color="000000"/>
+        <w:bottom w:val="single" w:sz="18" w:space="24" w:color="000000"/>
+        <w:right w:val="single" w:sz="18" w:space="24" w:color="000000"/>
+      </w:pgBorders>
     </w:sectPr>
   </w:body>
 </w:document>
@@ -1414,11 +2959,11 @@
       <w:outlineLvl w:val="0"/>
     </w:pPr>
     <w:rPr>
-      <w:rFonts w:asciiTheme="majorHAnsi" w:eastAsiaTheme="majorEastAsia" w:hAnsiTheme="majorHAnsi" w:cstheme="majorBidi"/>
+      <w:rFonts w:asciiTheme="majorHAnsi" w:eastAsiaTheme="majorEastAsia" w:hAnsiTheme="majorHAnsi" w:cstheme="majorBidi" w:ascii="Times New Roman" w:hAnsi="Times New Roman" w:eastAsia="Times New Roman"/>
       <w:b/>
       <w:bCs/>
       <w:color w:val="365F91" w:themeColor="accent1" w:themeShade="BF"/>
-      <w:sz w:val="28"/>
+      <w:sz w:val="26"/>
       <w:szCs w:val="28"/>
     </w:rPr>
   </w:style>
@@ -1438,7 +2983,7 @@
       <w:outlineLvl w:val="1"/>
     </w:pPr>
     <w:rPr>
-      <w:rFonts w:asciiTheme="majorHAnsi" w:eastAsiaTheme="majorEastAsia" w:hAnsiTheme="majorHAnsi" w:cstheme="majorBidi"/>
+      <w:rFonts w:asciiTheme="majorHAnsi" w:eastAsiaTheme="majorEastAsia" w:hAnsiTheme="majorHAnsi" w:cstheme="majorBidi" w:ascii="Times New Roman" w:hAnsi="Times New Roman" w:eastAsia="Times New Roman"/>
       <w:b/>
       <w:bCs/>
       <w:color w:val="4F81BD" w:themeColor="accent1"/>
@@ -1462,10 +3007,11 @@
       <w:outlineLvl w:val="2"/>
     </w:pPr>
     <w:rPr>
-      <w:rFonts w:asciiTheme="majorHAnsi" w:eastAsiaTheme="majorEastAsia" w:hAnsiTheme="majorHAnsi" w:cstheme="majorBidi"/>
+      <w:rFonts w:asciiTheme="majorHAnsi" w:eastAsiaTheme="majorEastAsia" w:hAnsiTheme="majorHAnsi" w:cstheme="majorBidi" w:ascii="Times New Roman" w:hAnsi="Times New Roman" w:eastAsia="Times New Roman"/>
       <w:b/>
       <w:bCs/>
       <w:color w:val="4F81BD" w:themeColor="accent1"/>
+      <w:sz w:val="26"/>
     </w:rPr>
   </w:style>
   <w:style w:type="paragraph" w:styleId="Heading4">

</xml_diff>

<commit_message>
Redo report to match original Word template style
Agent-Logs-Url: https://github.com/TanQui-Ovnatiuq/BlockChain/sessions/0e27cdfc-34f0-4e61-b075-9bb1b77514ee

Co-authored-by: TanQui-Ovnatiuq <253677590+TanQui-Ovnatiuq@users.noreply.github.com>
</commit_message>
<xml_diff>
--- a/BAOCAO_DAPP_DAT_SAN_20042026.docx
+++ b/BAOCAO_DAPP_DAT_SAN_20042026.docx
@@ -4,39 +4,43 @@
   <w:body>
     <w:p>
       <w:pPr>
-        <w:spacing w:line="360" w:lineRule="auto" w:after="120"/>
+        <w:spacing w:line="360" w:lineRule="auto" w:before="240" w:after="0"/>
         <w:jc w:val="center"/>
       </w:pPr>
       <w:r>
         <w:rPr>
-          <w:b/>
+          <w:rFonts w:ascii="Times New Roman" w:hAnsi="Times New Roman" w:eastAsia="Times New Roman"/>
+          <w:b w:val="0"/>
           <w:i w:val="0"/>
+          <w:sz w:val="28"/>
         </w:rPr>
         <w:t>TRƯỜNG ĐẠI HỌC ĐỒNG THÁP</w:t>
       </w:r>
     </w:p>
     <w:p>
       <w:pPr>
-        <w:spacing w:line="360" w:lineRule="auto" w:after="120"/>
+        <w:spacing w:line="360" w:lineRule="auto" w:before="0" w:after="0"/>
         <w:jc w:val="center"/>
       </w:pPr>
       <w:r>
         <w:rPr>
-          <w:b/>
+          <w:rFonts w:ascii="Times New Roman" w:hAnsi="Times New Roman" w:eastAsia="Times New Roman"/>
+          <w:b w:val="0"/>
           <w:i w:val="0"/>
+          <w:sz w:val="28"/>
         </w:rPr>
         <w:t>KHOA CÔNG NGHỆ VÀ KỸ THUẬT</w:t>
       </w:r>
     </w:p>
     <w:p>
       <w:pPr>
-        <w:spacing w:line="360" w:lineRule="auto"/>
+        <w:spacing w:line="360" w:lineRule="auto" w:before="80" w:after="120"/>
         <w:jc w:val="center"/>
       </w:pPr>
       <w:r>
         <w:drawing>
           <wp:inline xmlns:a="http://schemas.openxmlformats.org/drawingml/2006/main" xmlns:pic="http://schemas.openxmlformats.org/drawingml/2006/picture">
-            <wp:extent cx="1260000" cy="1260000"/>
+            <wp:extent cx="1080000" cy="1080000"/>
             <wp:docPr id="1" name="Picture 1"/>
             <wp:cNvGraphicFramePr>
               <a:graphicFrameLocks noChangeAspect="1"/>
@@ -57,7 +61,7 @@
                   <pic:spPr>
                     <a:xfrm>
                       <a:off x="0" y="0"/>
-                      <a:ext cx="1260000" cy="1260000"/>
+                      <a:ext cx="1080000" cy="1080000"/>
                     </a:xfrm>
                     <a:prstGeom prst="rect"/>
                   </pic:spPr>
@@ -70,154 +74,195 @@
     </w:p>
     <w:p>
       <w:pPr>
-        <w:spacing w:line="360" w:lineRule="auto" w:after="120"/>
+        <w:spacing w:line="360" w:lineRule="auto" w:before="0" w:after="0"/>
         <w:jc w:val="center"/>
       </w:pPr>
       <w:r>
         <w:rPr>
+          <w:rFonts w:ascii="Times New Roman" w:hAnsi="Times New Roman" w:eastAsia="Times New Roman"/>
           <w:b w:val="0"/>
           <w:i w:val="0"/>
+          <w:sz w:val="26"/>
         </w:rPr>
-        <w:t>Lê Thanh Trân - [MSSV]</w:t>
+        <w:t>Hồ Nguyễn Đức Anh Hào - 0023411634</w:t>
       </w:r>
     </w:p>
     <w:p>
       <w:pPr>
-        <w:spacing w:line="360" w:lineRule="auto" w:after="120"/>
+        <w:spacing w:line="360" w:lineRule="auto" w:before="0" w:after="0"/>
         <w:jc w:val="center"/>
       </w:pPr>
       <w:r>
         <w:rPr>
+          <w:rFonts w:ascii="Times New Roman" w:hAnsi="Times New Roman" w:eastAsia="Times New Roman"/>
           <w:b w:val="0"/>
           <w:i w:val="0"/>
+          <w:sz w:val="26"/>
         </w:rPr>
-        <w:t>Lê Mai Trường Chinh - [MSSV]</w:t>
+        <w:t>Võ Tấn Qui - 000023412943</w:t>
       </w:r>
     </w:p>
     <w:p>
       <w:pPr>
-        <w:spacing w:line="360" w:lineRule="auto" w:after="120"/>
+        <w:spacing w:line="360" w:lineRule="auto" w:before="0" w:after="0"/>
         <w:jc w:val="center"/>
       </w:pPr>
       <w:r>
         <w:rPr>
+          <w:rFonts w:ascii="Times New Roman" w:hAnsi="Times New Roman" w:eastAsia="Times New Roman"/>
           <w:b w:val="0"/>
           <w:i w:val="0"/>
+          <w:sz w:val="26"/>
         </w:rPr>
-        <w:t>Hồ Nguyễn Đức Anh Hào - [MSSV]</w:t>
+        <w:t>Trương Đăng Huy - 0023414179</w:t>
       </w:r>
     </w:p>
     <w:p>
       <w:pPr>
-        <w:spacing w:line="360" w:lineRule="auto" w:after="120"/>
+        <w:spacing w:line="360" w:lineRule="auto" w:before="0" w:after="0"/>
         <w:jc w:val="center"/>
       </w:pPr>
       <w:r>
         <w:rPr>
+          <w:rFonts w:ascii="Times New Roman" w:hAnsi="Times New Roman" w:eastAsia="Times New Roman"/>
           <w:b w:val="0"/>
           <w:i w:val="0"/>
+          <w:sz w:val="26"/>
         </w:rPr>
-        <w:t>Võ Tấn Qui - [MSSV]</w:t>
+        <w:t>Lê Thanh Trân - 0023414231</w:t>
       </w:r>
     </w:p>
     <w:p>
       <w:pPr>
-        <w:spacing w:line="360" w:lineRule="auto" w:after="480"/>
+        <w:spacing w:line="360" w:lineRule="auto" w:before="0" w:after="0"/>
+        <w:jc w:val="center"/>
       </w:pPr>
       <w:r>
         <w:rPr>
+          <w:rFonts w:ascii="Times New Roman" w:hAnsi="Times New Roman" w:eastAsia="Times New Roman"/>
           <w:b w:val="0"/>
           <w:i w:val="0"/>
+          <w:sz w:val="26"/>
+        </w:rPr>
+        <w:t>Lê Mai Trường Chinh - 023413704</w:t>
+      </w:r>
+    </w:p>
+    <w:p>
+      <w:pPr>
+        <w:spacing w:line="360" w:lineRule="auto" w:before="0" w:after="520"/>
+        <w:jc w:val="left"/>
+      </w:pPr>
+      <w:r>
+        <w:rPr>
+          <w:rFonts w:ascii="Times New Roman" w:hAnsi="Times New Roman" w:eastAsia="Times New Roman"/>
+          <w:b w:val="0"/>
+          <w:i w:val="0"/>
+          <w:sz w:val="28"/>
         </w:rPr>
       </w:r>
     </w:p>
     <w:p>
       <w:pPr>
-        <w:spacing w:line="360" w:lineRule="auto" w:after="120"/>
+        <w:spacing w:line="360" w:lineRule="auto" w:before="0" w:after="0"/>
         <w:jc w:val="center"/>
       </w:pPr>
       <w:r>
         <w:rPr>
-          <w:b/>
+          <w:rFonts w:ascii="Times New Roman" w:hAnsi="Times New Roman" w:eastAsia="Times New Roman"/>
+          <w:b w:val="0"/>
           <w:i w:val="0"/>
+          <w:sz w:val="28"/>
         </w:rPr>
-        <w:t>BÁO CÁO KẾT THÚC HỌC PHẦN BLOCKCHAIN VÀ ỨNG DỤNG</w:t>
+        <w:t>BÁO CÁO KẾT THÚC MÔN BLOCKCHAIN VÀ ỨNG DỤNG:</w:t>
       </w:r>
     </w:p>
     <w:p>
       <w:pPr>
-        <w:spacing w:line="360" w:lineRule="auto" w:after="120"/>
+        <w:spacing w:line="360" w:lineRule="auto" w:before="0" w:after="0"/>
         <w:jc w:val="center"/>
       </w:pPr>
       <w:r>
         <w:rPr>
-          <w:b/>
+          <w:rFonts w:ascii="Times New Roman" w:hAnsi="Times New Roman" w:eastAsia="Times New Roman"/>
+          <w:b w:val="0"/>
           <w:i w:val="0"/>
+          <w:sz w:val="28"/>
         </w:rPr>
-        <w:t>ĐỀ TÀI: XÂY DỰNG ỨNG DỤNG DAPP ĐẶT SÂN THỂ THAO SỬ DỤNG BLOCKCHAIN</w:t>
+        <w:t>TRANG WEB DAPP ĐẶT SÂN THỂ THAO</w:t>
       </w:r>
     </w:p>
     <w:p>
       <w:pPr>
-        <w:spacing w:line="360" w:lineRule="auto" w:after="600"/>
+        <w:spacing w:line="360" w:lineRule="auto" w:before="0" w:after="1160"/>
+        <w:jc w:val="left"/>
       </w:pPr>
       <w:r>
         <w:rPr>
+          <w:rFonts w:ascii="Times New Roman" w:hAnsi="Times New Roman" w:eastAsia="Times New Roman"/>
           <w:b w:val="0"/>
           <w:i w:val="0"/>
+          <w:sz w:val="28"/>
         </w:rPr>
       </w:r>
     </w:p>
     <w:p>
       <w:pPr>
-        <w:spacing w:line="360" w:lineRule="auto" w:after="120"/>
+        <w:spacing w:line="360" w:lineRule="auto" w:before="0" w:after="0"/>
         <w:jc w:val="center"/>
       </w:pPr>
       <w:r>
         <w:rPr>
+          <w:rFonts w:ascii="Times New Roman" w:hAnsi="Times New Roman" w:eastAsia="Times New Roman"/>
           <w:b w:val="0"/>
           <w:i w:val="0"/>
+          <w:sz w:val="28"/>
         </w:rPr>
         <w:t>NGÀNH: KHOA HỌC MÁY TÍNH</w:t>
       </w:r>
     </w:p>
     <w:p>
       <w:pPr>
-        <w:spacing w:line="360" w:lineRule="auto" w:after="120"/>
+        <w:spacing w:line="360" w:lineRule="auto" w:before="0" w:after="0"/>
         <w:jc w:val="center"/>
       </w:pPr>
       <w:r>
         <w:rPr>
+          <w:rFonts w:ascii="Times New Roman" w:hAnsi="Times New Roman" w:eastAsia="Times New Roman"/>
           <w:b w:val="0"/>
           <w:i w:val="0"/>
+          <w:sz w:val="28"/>
         </w:rPr>
-        <w:t>LỚP: DHCNTT23A-CS</w:t>
+        <w:t>LỚP: ĐHCNTT23A-CS.....</w:t>
       </w:r>
     </w:p>
     <w:p>
       <w:pPr>
-        <w:spacing w:line="360" w:lineRule="auto" w:after="120"/>
+        <w:spacing w:line="360" w:lineRule="auto" w:before="0" w:after="0"/>
         <w:jc w:val="center"/>
       </w:pPr>
       <w:r>
         <w:rPr>
+          <w:rFonts w:ascii="Times New Roman" w:hAnsi="Times New Roman" w:eastAsia="Times New Roman"/>
           <w:b w:val="0"/>
           <w:i w:val="0"/>
+          <w:sz w:val="28"/>
         </w:rPr>
-        <w:t>GIẢNG VIÊN HƯỚNG DẪN: THẦY HUỲNH MINH CHÂU</w:t>
+        <w:t>Giảng Viên Hướng Dẫn: Huỳnh Minh Châu</w:t>
       </w:r>
     </w:p>
     <w:p>
       <w:pPr>
-        <w:spacing w:line="360" w:lineRule="auto" w:after="120"/>
+        <w:spacing w:line="360" w:lineRule="auto" w:before="400" w:after="0"/>
         <w:jc w:val="right"/>
       </w:pPr>
       <w:r>
         <w:rPr>
+          <w:rFonts w:ascii="Times New Roman" w:hAnsi="Times New Roman" w:eastAsia="Times New Roman"/>
           <w:b w:val="0"/>
           <w:i/>
+          <w:sz w:val="26"/>
         </w:rPr>
-        <w:t>Đồng Tháp, tháng 4 năm 2026</w:t>
+        <w:t>Đồng Tháp, tháng  4  năm 2026</w:t>
       </w:r>
     </w:p>
     <w:p>
@@ -231,7 +276,7 @@
     <w:p>
       <w:pPr>
         <w:pStyle w:val="Heading1"/>
-        <w:spacing w:line="360" w:lineRule="auto" w:after="120"/>
+        <w:spacing w:line="360" w:lineRule="auto" w:after="60"/>
       </w:pPr>
       <w:r>
         <w:t>MỤC LỤC</w:t>
@@ -245,181 +290,61 @@
         <w:fldChar w:fldCharType="begin"/>
         <w:instrText xml:space="preserve">TOC \o "1-3" \h \z \u</w:instrText>
         <w:fldChar w:fldCharType="separate"/>
-        <w:t>Nhấp chuột phải vào mục lục và chọn Update Field để cập nhật số trang.</w:t>
+        <w:t>(Cập nhật mục lục: Right click -&gt; Update Field)</w:t>
         <w:fldChar w:fldCharType="end"/>
       </w:r>
     </w:p>
     <w:p>
       <w:pPr>
-        <w:spacing w:line="360" w:lineRule="auto" w:after="120"/>
+        <w:spacing w:line="360" w:lineRule="auto" w:before="0" w:after="0"/>
+        <w:jc w:val="left"/>
       </w:pPr>
       <w:r>
         <w:rPr>
+          <w:rFonts w:ascii="Times New Roman" w:hAnsi="Times New Roman" w:eastAsia="Times New Roman"/>
           <w:b w:val="0"/>
-          <w:i/>
+          <w:i w:val="0"/>
+          <w:sz w:val="28"/>
         </w:rPr>
-        <w:t>Dàn ý được mở rộng chi tiết bên dưới, có chừa các vị trí để bạn chèn thêm hình, sơ đồ và bảng.</w:t>
       </w:r>
     </w:p>
     <w:p>
       <w:pPr>
-        <w:spacing w:line="360" w:lineRule="auto"/>
+        <w:pStyle w:val="Heading1"/>
+        <w:spacing w:line="360" w:lineRule="auto" w:after="60"/>
       </w:pPr>
       <w:r>
-        <w:br w:type="page"/>
+        <w:t>DÀN Ý CHI TIẾT</w:t>
       </w:r>
     </w:p>
     <w:p>
       <w:pPr>
-        <w:pStyle w:val="Heading1"/>
-        <w:spacing w:line="360" w:lineRule="auto" w:after="120"/>
+        <w:spacing w:line="360" w:lineRule="auto" w:before="0" w:after="0"/>
+        <w:jc w:val="left"/>
       </w:pPr>
       <w:r>
-        <w:t>LỜI CẢM ƠN</w:t>
+        <w:rPr>
+          <w:rFonts w:ascii="Times New Roman" w:hAnsi="Times New Roman" w:eastAsia="Times New Roman"/>
+          <w:b w:val="0"/>
+          <w:i/>
+          <w:sz w:val="26"/>
+        </w:rPr>
+        <w:t>Mỗi mục bên dưới đã chừa vị trí để bạn chèn thêm hình/bảng/sơ đồ.</w:t>
       </w:r>
     </w:p>
     <w:p>
       <w:pPr>
-        <w:spacing w:line="360" w:lineRule="auto" w:after="120"/>
+        <w:pStyle w:val="Heading1"/>
+        <w:spacing w:line="360" w:lineRule="auto" w:after="60"/>
       </w:pPr>
       <w:r>
-        <w:rPr>
-          <w:b w:val="0"/>
-          <w:i w:val="0"/>
-        </w:rPr>
-        <w:t>Nhóm xin cảm ơn Thầy Huỳnh Minh Châu đã hướng dẫn học phần Blockchain và ứng dụng, hỗ trợ chuyên môn và định hướng triển khai đề tài.</w:t>
+        <w:t>CHƯƠNG 1: TỔNG QUAN ĐỀ TÀI</w:t>
       </w:r>
     </w:p>
     <w:p>
       <w:pPr>
-        <w:pStyle w:val="Heading1"/>
-        <w:spacing w:line="360" w:lineRule="auto" w:after="120"/>
-      </w:pPr>
-      <w:r>
-        <w:t>DANH MỤC KÝ HIỆU VÀ THUẬT NGỮ</w:t>
-      </w:r>
-    </w:p>
-    <w:p>
-      <w:pPr>
-        <w:spacing w:line="360" w:lineRule="auto" w:after="120"/>
-      </w:pPr>
-      <w:r>
-        <w:rPr>
-          <w:b w:val="0"/>
-          <w:i w:val="0"/>
-        </w:rPr>
-        <w:t>DApp: Ứng dụng phi tập trung vận hành dựa trên blockchain.</w:t>
-      </w:r>
-    </w:p>
-    <w:p>
-      <w:pPr>
-        <w:spacing w:line="360" w:lineRule="auto" w:after="120"/>
-      </w:pPr>
-      <w:r>
-        <w:rPr>
-          <w:b w:val="0"/>
-          <w:i w:val="0"/>
-        </w:rPr>
-        <w:t>Smart Contract: Hợp đồng thông minh viết bằng Solidity, thực thi trên EVM.</w:t>
-      </w:r>
-    </w:p>
-    <w:p>
-      <w:pPr>
-        <w:spacing w:line="360" w:lineRule="auto" w:after="120"/>
-      </w:pPr>
-      <w:r>
-        <w:rPr>
-          <w:b w:val="0"/>
-          <w:i w:val="0"/>
-        </w:rPr>
-        <w:t>EVM: Ethereum Virtual Machine dùng để chạy bytecode của hợp đồng.</w:t>
-      </w:r>
-    </w:p>
-    <w:p>
-      <w:pPr>
-        <w:spacing w:line="360" w:lineRule="auto" w:after="120"/>
-      </w:pPr>
-      <w:r>
-        <w:rPr>
-          <w:b w:val="0"/>
-          <w:i w:val="0"/>
-        </w:rPr>
-        <w:t>JSON-RPC: Giao thức trung gian để client gọi hàm đến node blockchain.</w:t>
-      </w:r>
-    </w:p>
-    <w:p>
-      <w:pPr>
-        <w:spacing w:line="360" w:lineRule="auto" w:after="120"/>
-      </w:pPr>
-      <w:r>
-        <w:rPr>
-          <w:b w:val="0"/>
-          <w:i w:val="0"/>
-        </w:rPr>
-        <w:t>Transaction Signing: Cơ chế ký giao dịch bằng private key trong MetaMask.</w:t>
-      </w:r>
-    </w:p>
-    <w:p>
-      <w:pPr>
-        <w:spacing w:line="360" w:lineRule="auto" w:after="120"/>
-      </w:pPr>
-      <w:r>
-        <w:rPr>
-          <w:b w:val="0"/>
-          <w:i w:val="0"/>
-        </w:rPr>
-        <w:t>Gas Fee: Chi phí xử lý giao dịch trên mạng Ethereum.</w:t>
-      </w:r>
-    </w:p>
-    <w:p>
-      <w:pPr>
-        <w:spacing w:line="360" w:lineRule="auto" w:after="120"/>
-      </w:pPr>
-      <w:r>
-        <w:rPr>
-          <w:b w:val="0"/>
-          <w:i w:val="0"/>
-        </w:rPr>
-        <w:t>REST API: Chuẩn giao tiếp HTTP giữa frontend và backend.</w:t>
-      </w:r>
-    </w:p>
-    <w:p>
-      <w:pPr>
-        <w:spacing w:line="360" w:lineRule="auto" w:after="120"/>
-      </w:pPr>
-      <w:r>
-        <w:rPr>
-          <w:b w:val="0"/>
-          <w:i w:val="0"/>
-        </w:rPr>
-        <w:t>Middleware: Thành phần xử lý trung gian request/response.</w:t>
-      </w:r>
-    </w:p>
-    <w:p>
-      <w:pPr>
-        <w:spacing w:line="360" w:lineRule="auto" w:after="120"/>
-      </w:pPr>
-      <w:r>
-        <w:rPr>
-          <w:b w:val="0"/>
-          <w:i w:val="0"/>
-        </w:rPr>
-        <w:t>Authorization: Kiểm soát quyền truy cập dựa trên vai trò hoặc địa chỉ ví.</w:t>
-      </w:r>
-    </w:p>
-    <w:p>
-      <w:pPr>
-        <w:pStyle w:val="Heading1"/>
-        <w:spacing w:line="360" w:lineRule="auto" w:after="120"/>
-      </w:pPr>
-      <w:r>
-        <w:t>CHƯƠNG 1. TỔNG QUAN ĐỀ TÀI</w:t>
-      </w:r>
-    </w:p>
-    <w:p>
-      <w:pPr>
         <w:pStyle w:val="Heading2"/>
-        <w:spacing w:line="360" w:lineRule="auto" w:after="120"/>
+        <w:spacing w:line="360" w:lineRule="auto" w:after="60"/>
       </w:pPr>
       <w:r>
         <w:t>1.1 Bối cảnh và lý do chọn đề tài</w:t>
@@ -427,68 +352,68 @@
     </w:p>
     <w:p>
       <w:pPr>
-        <w:spacing w:line="360" w:lineRule="auto" w:after="120"/>
+        <w:spacing w:line="360" w:lineRule="auto" w:before="0" w:after="0"/>
+        <w:jc w:val="left"/>
       </w:pPr>
       <w:r>
         <w:rPr>
+          <w:rFonts w:ascii="Times New Roman" w:hAnsi="Times New Roman" w:eastAsia="Times New Roman"/>
           <w:b w:val="0"/>
           <w:i w:val="0"/>
+          <w:sz w:val="26"/>
         </w:rPr>
-        <w:t>Nêu thực trạng đặt sân truyền thống, vấn đề minh bạch lịch đặt và đối soát thanh toán.</w:t>
+        <w:t>Nội dung chi tiết: ............................................................................................</w:t>
       </w:r>
     </w:p>
     <w:p>
       <w:pPr>
-        <w:spacing w:line="360" w:lineRule="auto" w:after="120"/>
+        <w:spacing w:line="360" w:lineRule="auto" w:before="0" w:after="0"/>
+        <w:jc w:val="left"/>
       </w:pPr>
       <w:r>
         <w:rPr>
+          <w:rFonts w:ascii="Times New Roman" w:hAnsi="Times New Roman" w:eastAsia="Times New Roman"/>
           <w:b w:val="0"/>
           <w:i/>
+          <w:sz w:val="26"/>
         </w:rPr>
-        <w:t>[Chèn hình: Hình 1: 1.1 Bối cảnh và lý do chọn đề tài]</w:t>
+        <w:t>[Chèn hình 1: 1.1 Bối cảnh và lý do chọn đề tài]</w:t>
       </w:r>
     </w:p>
     <w:p>
       <w:pPr>
-        <w:spacing w:line="360" w:lineRule="auto" w:after="120"/>
+        <w:spacing w:line="360" w:lineRule="auto" w:before="0" w:after="0"/>
+        <w:jc w:val="left"/>
       </w:pPr>
       <w:r>
         <w:rPr>
+          <w:rFonts w:ascii="Times New Roman" w:hAnsi="Times New Roman" w:eastAsia="Times New Roman"/>
           <w:b w:val="0"/>
           <w:i/>
+          <w:sz w:val="26"/>
         </w:rPr>
-        <w:t>[Mô tả hình: ............................................................]</w:t>
+        <w:t>[Chèn bảng 1: 1.1 Bối cảnh và lý do chọn đề tài]</w:t>
       </w:r>
     </w:p>
     <w:p>
       <w:pPr>
-        <w:spacing w:line="360" w:lineRule="auto" w:after="120"/>
+        <w:spacing w:line="360" w:lineRule="auto" w:before="0" w:after="0"/>
+        <w:jc w:val="left"/>
       </w:pPr>
       <w:r>
         <w:rPr>
+          <w:rFonts w:ascii="Times New Roman" w:hAnsi="Times New Roman" w:eastAsia="Times New Roman"/>
           <w:b w:val="0"/>
           <w:i/>
+          <w:sz w:val="26"/>
         </w:rPr>
-        <w:t>[Chèn bảng: Bảng 1: 1.1 Bối cảnh và lý do chọn đề tài]</w:t>
+        <w:t>[Chèn sơ đồ 1: 1.1 Bối cảnh và lý do chọn đề tài]</w:t>
       </w:r>
     </w:p>
     <w:p>
       <w:pPr>
-        <w:spacing w:line="360" w:lineRule="auto" w:after="120"/>
-      </w:pPr>
-      <w:r>
-        <w:rPr>
-          <w:b w:val="0"/>
-          <w:i/>
-        </w:rPr>
-        <w:t>[Chèn sơ đồ: Sơ đồ 1: 1.1 Bối cảnh và lý do chọn đề tài]</w:t>
-      </w:r>
-    </w:p>
-    <w:p>
-      <w:pPr>
         <w:pStyle w:val="Heading2"/>
-        <w:spacing w:line="360" w:lineRule="auto" w:after="120"/>
+        <w:spacing w:line="360" w:lineRule="auto" w:after="60"/>
       </w:pPr>
       <w:r>
         <w:t>1.2 Mục tiêu nghiên cứu</w:t>
@@ -496,68 +421,68 @@
     </w:p>
     <w:p>
       <w:pPr>
-        <w:spacing w:line="360" w:lineRule="auto" w:after="120"/>
+        <w:spacing w:line="360" w:lineRule="auto" w:before="0" w:after="0"/>
+        <w:jc w:val="left"/>
       </w:pPr>
       <w:r>
         <w:rPr>
+          <w:rFonts w:ascii="Times New Roman" w:hAnsi="Times New Roman" w:eastAsia="Times New Roman"/>
           <w:b w:val="0"/>
           <w:i w:val="0"/>
+          <w:sz w:val="26"/>
         </w:rPr>
-        <w:t>Mô tả mục tiêu kỹ thuật và nghiệp vụ của hệ thống DApp đặt sân.</w:t>
+        <w:t>Nội dung chi tiết: ............................................................................................</w:t>
       </w:r>
     </w:p>
     <w:p>
       <w:pPr>
-        <w:spacing w:line="360" w:lineRule="auto" w:after="120"/>
+        <w:spacing w:line="360" w:lineRule="auto" w:before="0" w:after="0"/>
+        <w:jc w:val="left"/>
       </w:pPr>
       <w:r>
         <w:rPr>
+          <w:rFonts w:ascii="Times New Roman" w:hAnsi="Times New Roman" w:eastAsia="Times New Roman"/>
           <w:b w:val="0"/>
           <w:i/>
+          <w:sz w:val="26"/>
         </w:rPr>
-        <w:t>[Chèn hình: Hình 2: 1.2 Mục tiêu nghiên cứu]</w:t>
+        <w:t>[Chèn hình 2: 1.2 Mục tiêu nghiên cứu]</w:t>
       </w:r>
     </w:p>
     <w:p>
       <w:pPr>
-        <w:spacing w:line="360" w:lineRule="auto" w:after="120"/>
+        <w:spacing w:line="360" w:lineRule="auto" w:before="0" w:after="0"/>
+        <w:jc w:val="left"/>
       </w:pPr>
       <w:r>
         <w:rPr>
+          <w:rFonts w:ascii="Times New Roman" w:hAnsi="Times New Roman" w:eastAsia="Times New Roman"/>
           <w:b w:val="0"/>
           <w:i/>
+          <w:sz w:val="26"/>
         </w:rPr>
-        <w:t>[Mô tả hình: ............................................................]</w:t>
+        <w:t>[Chèn bảng 2: 1.2 Mục tiêu nghiên cứu]</w:t>
       </w:r>
     </w:p>
     <w:p>
       <w:pPr>
-        <w:spacing w:line="360" w:lineRule="auto" w:after="120"/>
+        <w:spacing w:line="360" w:lineRule="auto" w:before="0" w:after="0"/>
+        <w:jc w:val="left"/>
       </w:pPr>
       <w:r>
         <w:rPr>
+          <w:rFonts w:ascii="Times New Roman" w:hAnsi="Times New Roman" w:eastAsia="Times New Roman"/>
           <w:b w:val="0"/>
           <w:i/>
+          <w:sz w:val="26"/>
         </w:rPr>
-        <w:t>[Chèn bảng: Bảng 2: 1.2 Mục tiêu nghiên cứu]</w:t>
+        <w:t>[Chèn sơ đồ 2: 1.2 Mục tiêu nghiên cứu]</w:t>
       </w:r>
     </w:p>
     <w:p>
       <w:pPr>
-        <w:spacing w:line="360" w:lineRule="auto" w:after="120"/>
-      </w:pPr>
-      <w:r>
-        <w:rPr>
-          <w:b w:val="0"/>
-          <w:i/>
-        </w:rPr>
-        <w:t>[Chèn sơ đồ: Sơ đồ 2: 1.2 Mục tiêu nghiên cứu]</w:t>
-      </w:r>
-    </w:p>
-    <w:p>
-      <w:pPr>
         <w:pStyle w:val="Heading2"/>
-        <w:spacing w:line="360" w:lineRule="auto" w:after="120"/>
+        <w:spacing w:line="360" w:lineRule="auto" w:after="60"/>
       </w:pPr>
       <w:r>
         <w:t>1.3 Phạm vi và giới hạn</w:t>
@@ -565,68 +490,68 @@
     </w:p>
     <w:p>
       <w:pPr>
-        <w:spacing w:line="360" w:lineRule="auto" w:after="120"/>
+        <w:spacing w:line="360" w:lineRule="auto" w:before="0" w:after="0"/>
+        <w:jc w:val="left"/>
       </w:pPr>
       <w:r>
         <w:rPr>
+          <w:rFonts w:ascii="Times New Roman" w:hAnsi="Times New Roman" w:eastAsia="Times New Roman"/>
           <w:b w:val="0"/>
           <w:i w:val="0"/>
+          <w:sz w:val="26"/>
         </w:rPr>
-        <w:t>Xác định phạm vi triển khai trên Hardhat localhost và giới hạn hiện tại.</w:t>
+        <w:t>Nội dung chi tiết: ............................................................................................</w:t>
       </w:r>
     </w:p>
     <w:p>
       <w:pPr>
-        <w:spacing w:line="360" w:lineRule="auto" w:after="120"/>
+        <w:spacing w:line="360" w:lineRule="auto" w:before="0" w:after="0"/>
+        <w:jc w:val="left"/>
       </w:pPr>
       <w:r>
         <w:rPr>
+          <w:rFonts w:ascii="Times New Roman" w:hAnsi="Times New Roman" w:eastAsia="Times New Roman"/>
           <w:b w:val="0"/>
           <w:i/>
+          <w:sz w:val="26"/>
         </w:rPr>
-        <w:t>[Chèn hình: Hình 3: 1.3 Phạm vi và giới hạn]</w:t>
+        <w:t>[Chèn hình 3: 1.3 Phạm vi và giới hạn]</w:t>
       </w:r>
     </w:p>
     <w:p>
       <w:pPr>
-        <w:spacing w:line="360" w:lineRule="auto" w:after="120"/>
+        <w:spacing w:line="360" w:lineRule="auto" w:before="0" w:after="0"/>
+        <w:jc w:val="left"/>
       </w:pPr>
       <w:r>
         <w:rPr>
+          <w:rFonts w:ascii="Times New Roman" w:hAnsi="Times New Roman" w:eastAsia="Times New Roman"/>
           <w:b w:val="0"/>
           <w:i/>
+          <w:sz w:val="26"/>
         </w:rPr>
-        <w:t>[Mô tả hình: ............................................................]</w:t>
+        <w:t>[Chèn bảng 3: 1.3 Phạm vi và giới hạn]</w:t>
       </w:r>
     </w:p>
     <w:p>
       <w:pPr>
-        <w:spacing w:line="360" w:lineRule="auto" w:after="120"/>
+        <w:spacing w:line="360" w:lineRule="auto" w:before="0" w:after="0"/>
+        <w:jc w:val="left"/>
       </w:pPr>
       <w:r>
         <w:rPr>
+          <w:rFonts w:ascii="Times New Roman" w:hAnsi="Times New Roman" w:eastAsia="Times New Roman"/>
           <w:b w:val="0"/>
           <w:i/>
+          <w:sz w:val="26"/>
         </w:rPr>
-        <w:t>[Chèn bảng: Bảng 3: 1.3 Phạm vi và giới hạn]</w:t>
+        <w:t>[Chèn sơ đồ 3: 1.3 Phạm vi và giới hạn]</w:t>
       </w:r>
     </w:p>
     <w:p>
       <w:pPr>
-        <w:spacing w:line="360" w:lineRule="auto" w:after="120"/>
-      </w:pPr>
-      <w:r>
-        <w:rPr>
-          <w:b w:val="0"/>
-          <w:i/>
-        </w:rPr>
-        <w:t>[Chèn sơ đồ: Sơ đồ 3: 1.3 Phạm vi và giới hạn]</w:t>
-      </w:r>
-    </w:p>
-    <w:p>
-      <w:pPr>
         <w:pStyle w:val="Heading2"/>
-        <w:spacing w:line="360" w:lineRule="auto" w:after="120"/>
+        <w:spacing w:line="360" w:lineRule="auto" w:after="60"/>
       </w:pPr>
       <w:r>
         <w:t>1.4 Phương pháp thực hiện</w:t>
@@ -634,215 +559,215 @@
     </w:p>
     <w:p>
       <w:pPr>
-        <w:spacing w:line="360" w:lineRule="auto" w:after="120"/>
+        <w:spacing w:line="360" w:lineRule="auto" w:before="0" w:after="0"/>
+        <w:jc w:val="left"/>
       </w:pPr>
       <w:r>
         <w:rPr>
+          <w:rFonts w:ascii="Times New Roman" w:hAnsi="Times New Roman" w:eastAsia="Times New Roman"/>
           <w:b w:val="0"/>
           <w:i w:val="0"/>
+          <w:sz w:val="26"/>
         </w:rPr>
-        <w:t>Trình bày quy trình phân tích, thiết kế, triển khai và kiểm thử.</w:t>
+        <w:t>Nội dung chi tiết: ............................................................................................</w:t>
       </w:r>
     </w:p>
     <w:p>
       <w:pPr>
-        <w:spacing w:line="360" w:lineRule="auto" w:after="120"/>
+        <w:spacing w:line="360" w:lineRule="auto" w:before="0" w:after="0"/>
+        <w:jc w:val="left"/>
       </w:pPr>
       <w:r>
         <w:rPr>
+          <w:rFonts w:ascii="Times New Roman" w:hAnsi="Times New Roman" w:eastAsia="Times New Roman"/>
           <w:b w:val="0"/>
           <w:i/>
+          <w:sz w:val="26"/>
         </w:rPr>
-        <w:t>[Chèn hình: Hình 4: 1.4 Phương pháp thực hiện]</w:t>
+        <w:t>[Chèn hình 4: 1.4 Phương pháp thực hiện]</w:t>
       </w:r>
     </w:p>
     <w:p>
       <w:pPr>
-        <w:spacing w:line="360" w:lineRule="auto" w:after="120"/>
+        <w:spacing w:line="360" w:lineRule="auto" w:before="0" w:after="0"/>
+        <w:jc w:val="left"/>
       </w:pPr>
       <w:r>
         <w:rPr>
+          <w:rFonts w:ascii="Times New Roman" w:hAnsi="Times New Roman" w:eastAsia="Times New Roman"/>
           <w:b w:val="0"/>
           <w:i/>
+          <w:sz w:val="26"/>
         </w:rPr>
-        <w:t>[Mô tả hình: ............................................................]</w:t>
+        <w:t>[Chèn bảng 4: 1.4 Phương pháp thực hiện]</w:t>
       </w:r>
     </w:p>
     <w:p>
       <w:pPr>
-        <w:spacing w:line="360" w:lineRule="auto" w:after="120"/>
+        <w:spacing w:line="360" w:lineRule="auto" w:before="0" w:after="0"/>
+        <w:jc w:val="left"/>
       </w:pPr>
       <w:r>
         <w:rPr>
+          <w:rFonts w:ascii="Times New Roman" w:hAnsi="Times New Roman" w:eastAsia="Times New Roman"/>
           <w:b w:val="0"/>
           <w:i/>
+          <w:sz w:val="26"/>
         </w:rPr>
-        <w:t>[Chèn bảng: Bảng 4: 1.4 Phương pháp thực hiện]</w:t>
+        <w:t>[Chèn sơ đồ 4: 1.4 Phương pháp thực hiện]</w:t>
       </w:r>
     </w:p>
     <w:p>
       <w:pPr>
-        <w:spacing w:line="360" w:lineRule="auto" w:after="120"/>
+        <w:pStyle w:val="Heading1"/>
+        <w:spacing w:line="360" w:lineRule="auto" w:after="60"/>
       </w:pPr>
       <w:r>
-        <w:rPr>
-          <w:b w:val="0"/>
-          <w:i/>
-        </w:rPr>
-        <w:t>[Chèn sơ đồ: Sơ đồ 4: 1.4 Phương pháp thực hiện]</w:t>
+        <w:t>CHƯƠNG 2: PHÂN TÍCH VÀ THIẾT KẾ HỆ THỐNG</w:t>
       </w:r>
     </w:p>
     <w:p>
       <w:pPr>
-        <w:pStyle w:val="Heading1"/>
-        <w:spacing w:line="360" w:lineRule="auto" w:after="120"/>
+        <w:pStyle w:val="Heading2"/>
+        <w:spacing w:line="360" w:lineRule="auto" w:after="60"/>
       </w:pPr>
       <w:r>
-        <w:t>CHƯƠNG 2. PHÂN TÍCH VÀ THIẾT KẾ HỆ THỐNG</w:t>
+        <w:t>2.1 Kiến trúc tổng thể Frontend-Backend-Blockchain</w:t>
       </w:r>
     </w:p>
     <w:p>
       <w:pPr>
-        <w:pStyle w:val="Heading2"/>
-        <w:spacing w:line="360" w:lineRule="auto" w:after="120"/>
+        <w:spacing w:line="360" w:lineRule="auto" w:before="0" w:after="0"/>
+        <w:jc w:val="left"/>
       </w:pPr>
       <w:r>
-        <w:t>2.1 Kiến trúc tổng thể Frontend–Backend–Blockchain</w:t>
+        <w:rPr>
+          <w:rFonts w:ascii="Times New Roman" w:hAnsi="Times New Roman" w:eastAsia="Times New Roman"/>
+          <w:b w:val="0"/>
+          <w:i w:val="0"/>
+          <w:sz w:val="26"/>
+        </w:rPr>
+        <w:t>Nội dung chi tiết: ............................................................................................</w:t>
       </w:r>
     </w:p>
     <w:p>
       <w:pPr>
-        <w:spacing w:line="360" w:lineRule="auto" w:after="120"/>
+        <w:spacing w:line="360" w:lineRule="auto" w:before="0" w:after="0"/>
+        <w:jc w:val="left"/>
       </w:pPr>
       <w:r>
         <w:rPr>
+          <w:rFonts w:ascii="Times New Roman" w:hAnsi="Times New Roman" w:eastAsia="Times New Roman"/>
           <w:b w:val="0"/>
-          <w:i w:val="0"/>
+          <w:i/>
+          <w:sz w:val="26"/>
         </w:rPr>
-        <w:t>Mô tả vai trò từng lớp và cơ chế tương tác liên lớp.</w:t>
+        <w:t>[Chèn hình 5: 2.1 Kiến trúc tổng thể Frontend-Backend-Blockchain]</w:t>
       </w:r>
     </w:p>
     <w:p>
       <w:pPr>
-        <w:spacing w:line="360" w:lineRule="auto" w:after="120"/>
+        <w:spacing w:line="360" w:lineRule="auto" w:before="0" w:after="0"/>
+        <w:jc w:val="left"/>
       </w:pPr>
       <w:r>
         <w:rPr>
+          <w:rFonts w:ascii="Times New Roman" w:hAnsi="Times New Roman" w:eastAsia="Times New Roman"/>
           <w:b w:val="0"/>
           <w:i/>
+          <w:sz w:val="26"/>
         </w:rPr>
-        <w:t>[Chèn hình: Hình 5: 2.1 Kiến trúc tổng thể Frontend–Backend–Blockchain]</w:t>
+        <w:t>[Chèn bảng 5: 2.1 Kiến trúc tổng thể Frontend-Backend-Blockchain]</w:t>
       </w:r>
     </w:p>
     <w:p>
       <w:pPr>
-        <w:spacing w:line="360" w:lineRule="auto" w:after="120"/>
+        <w:spacing w:line="360" w:lineRule="auto" w:before="0" w:after="0"/>
+        <w:jc w:val="left"/>
       </w:pPr>
       <w:r>
         <w:rPr>
+          <w:rFonts w:ascii="Times New Roman" w:hAnsi="Times New Roman" w:eastAsia="Times New Roman"/>
           <w:b w:val="0"/>
           <w:i/>
+          <w:sz w:val="26"/>
         </w:rPr>
-        <w:t>[Mô tả hình: ............................................................]</w:t>
+        <w:t>[Chèn sơ đồ 5: 2.1 Kiến trúc tổng thể Frontend-Backend-Blockchain]</w:t>
       </w:r>
     </w:p>
     <w:p>
       <w:pPr>
-        <w:spacing w:line="360" w:lineRule="auto" w:after="120"/>
+        <w:pStyle w:val="Heading2"/>
+        <w:spacing w:line="360" w:lineRule="auto" w:after="60"/>
       </w:pPr>
       <w:r>
-        <w:rPr>
-          <w:b w:val="0"/>
-          <w:i/>
-        </w:rPr>
-        <w:t>[Chèn bảng: Bảng 5: 2.1 Kiến trúc tổng thể Frontend–Backend–Blockchain]</w:t>
+        <w:t>2.2 Luồng kết nối ví MetaMask</w:t>
       </w:r>
     </w:p>
     <w:p>
       <w:pPr>
-        <w:spacing w:line="360" w:lineRule="auto" w:after="120"/>
+        <w:spacing w:line="360" w:lineRule="auto" w:before="0" w:after="0"/>
+        <w:jc w:val="left"/>
       </w:pPr>
       <w:r>
         <w:rPr>
+          <w:rFonts w:ascii="Times New Roman" w:hAnsi="Times New Roman" w:eastAsia="Times New Roman"/>
           <w:b w:val="0"/>
-          <w:i/>
+          <w:i w:val="0"/>
+          <w:sz w:val="26"/>
         </w:rPr>
-        <w:t>[Chèn sơ đồ: Sơ đồ 5: 2.1 Kiến trúc tổng thể Frontend–Backend–Blockchain]</w:t>
+        <w:t>Nội dung chi tiết: ............................................................................................</w:t>
       </w:r>
     </w:p>
     <w:p>
       <w:pPr>
-        <w:pStyle w:val="Heading2"/>
-        <w:spacing w:line="360" w:lineRule="auto" w:after="120"/>
+        <w:spacing w:line="360" w:lineRule="auto" w:before="0" w:after="0"/>
+        <w:jc w:val="left"/>
       </w:pPr>
       <w:r>
-        <w:t>2.2 Luồng kết nối MetaMask</w:t>
+        <w:rPr>
+          <w:rFonts w:ascii="Times New Roman" w:hAnsi="Times New Roman" w:eastAsia="Times New Roman"/>
+          <w:b w:val="0"/>
+          <w:i/>
+          <w:sz w:val="26"/>
+        </w:rPr>
+        <w:t>[Chèn hình 6: 2.2 Luồng kết nối ví MetaMask]</w:t>
       </w:r>
     </w:p>
     <w:p>
       <w:pPr>
-        <w:spacing w:line="360" w:lineRule="auto" w:after="120"/>
+        <w:spacing w:line="360" w:lineRule="auto" w:before="0" w:after="0"/>
+        <w:jc w:val="left"/>
       </w:pPr>
       <w:r>
         <w:rPr>
+          <w:rFonts w:ascii="Times New Roman" w:hAnsi="Times New Roman" w:eastAsia="Times New Roman"/>
           <w:b w:val="0"/>
-          <w:i w:val="0"/>
+          <w:i/>
+          <w:sz w:val="26"/>
         </w:rPr>
-        <w:t>Mô tả quy trình định danh người dùng bằng ví.</w:t>
+        <w:t>[Chèn bảng 6: 2.2 Luồng kết nối ví MetaMask]</w:t>
       </w:r>
     </w:p>
     <w:p>
       <w:pPr>
-        <w:spacing w:line="360" w:lineRule="auto" w:after="120"/>
+        <w:spacing w:line="360" w:lineRule="auto" w:before="0" w:after="0"/>
+        <w:jc w:val="left"/>
       </w:pPr>
       <w:r>
         <w:rPr>
+          <w:rFonts w:ascii="Times New Roman" w:hAnsi="Times New Roman" w:eastAsia="Times New Roman"/>
           <w:b w:val="0"/>
           <w:i/>
+          <w:sz w:val="26"/>
         </w:rPr>
-        <w:t>[Chèn hình: Hình 6: 2.2 Luồng kết nối MetaMask]</w:t>
+        <w:t>[Chèn sơ đồ 6: 2.2 Luồng kết nối ví MetaMask]</w:t>
       </w:r>
     </w:p>
     <w:p>
       <w:pPr>
-        <w:spacing w:line="360" w:lineRule="auto" w:after="120"/>
-      </w:pPr>
-      <w:r>
-        <w:rPr>
-          <w:b w:val="0"/>
-          <w:i/>
-        </w:rPr>
-        <w:t>[Mô tả hình: ............................................................]</w:t>
-      </w:r>
-    </w:p>
-    <w:p>
-      <w:pPr>
-        <w:spacing w:line="360" w:lineRule="auto" w:after="120"/>
-      </w:pPr>
-      <w:r>
-        <w:rPr>
-          <w:b w:val="0"/>
-          <w:i/>
-        </w:rPr>
-        <w:t>[Chèn bảng: Bảng 6: 2.2 Luồng kết nối MetaMask]</w:t>
-      </w:r>
-    </w:p>
-    <w:p>
-      <w:pPr>
-        <w:spacing w:line="360" w:lineRule="auto" w:after="120"/>
-      </w:pPr>
-      <w:r>
-        <w:rPr>
-          <w:b w:val="0"/>
-          <w:i/>
-        </w:rPr>
-        <w:t>[Chèn sơ đồ: Sơ đồ 6: 2.2 Luồng kết nối MetaMask]</w:t>
-      </w:r>
-    </w:p>
-    <w:p>
-      <w:pPr>
         <w:pStyle w:val="Heading2"/>
-        <w:spacing w:line="360" w:lineRule="auto" w:after="120"/>
+        <w:spacing w:line="360" w:lineRule="auto" w:after="60"/>
       </w:pPr>
       <w:r>
         <w:t>2.3 Luồng đặt sân và thanh toán ETH</w:t>
@@ -850,68 +775,68 @@
     </w:p>
     <w:p>
       <w:pPr>
-        <w:spacing w:line="360" w:lineRule="auto" w:after="120"/>
+        <w:spacing w:line="360" w:lineRule="auto" w:before="0" w:after="0"/>
+        <w:jc w:val="left"/>
       </w:pPr>
       <w:r>
         <w:rPr>
+          <w:rFonts w:ascii="Times New Roman" w:hAnsi="Times New Roman" w:eastAsia="Times New Roman"/>
           <w:b w:val="0"/>
           <w:i w:val="0"/>
+          <w:sz w:val="26"/>
         </w:rPr>
-        <w:t>Mô tả sequence từ chọn sân đến xác nhận giao dịch.</w:t>
+        <w:t>Nội dung chi tiết: ............................................................................................</w:t>
       </w:r>
     </w:p>
     <w:p>
       <w:pPr>
-        <w:spacing w:line="360" w:lineRule="auto" w:after="120"/>
+        <w:spacing w:line="360" w:lineRule="auto" w:before="0" w:after="0"/>
+        <w:jc w:val="left"/>
       </w:pPr>
       <w:r>
         <w:rPr>
+          <w:rFonts w:ascii="Times New Roman" w:hAnsi="Times New Roman" w:eastAsia="Times New Roman"/>
           <w:b w:val="0"/>
           <w:i/>
+          <w:sz w:val="26"/>
         </w:rPr>
-        <w:t>[Chèn hình: Hình 7: 2.3 Luồng đặt sân và thanh toán ETH]</w:t>
+        <w:t>[Chèn hình 7: 2.3 Luồng đặt sân và thanh toán ETH]</w:t>
       </w:r>
     </w:p>
     <w:p>
       <w:pPr>
-        <w:spacing w:line="360" w:lineRule="auto" w:after="120"/>
+        <w:spacing w:line="360" w:lineRule="auto" w:before="0" w:after="0"/>
+        <w:jc w:val="left"/>
       </w:pPr>
       <w:r>
         <w:rPr>
+          <w:rFonts w:ascii="Times New Roman" w:hAnsi="Times New Roman" w:eastAsia="Times New Roman"/>
           <w:b w:val="0"/>
           <w:i/>
+          <w:sz w:val="26"/>
         </w:rPr>
-        <w:t>[Mô tả hình: ............................................................]</w:t>
+        <w:t>[Chèn bảng 7: 2.3 Luồng đặt sân và thanh toán ETH]</w:t>
       </w:r>
     </w:p>
     <w:p>
       <w:pPr>
-        <w:spacing w:line="360" w:lineRule="auto" w:after="120"/>
+        <w:spacing w:line="360" w:lineRule="auto" w:before="0" w:after="0"/>
+        <w:jc w:val="left"/>
       </w:pPr>
       <w:r>
         <w:rPr>
+          <w:rFonts w:ascii="Times New Roman" w:hAnsi="Times New Roman" w:eastAsia="Times New Roman"/>
           <w:b w:val="0"/>
           <w:i/>
+          <w:sz w:val="26"/>
         </w:rPr>
-        <w:t>[Chèn bảng: Bảng 7: 2.3 Luồng đặt sân và thanh toán ETH]</w:t>
+        <w:t>[Chèn sơ đồ 7: 2.3 Luồng đặt sân và thanh toán ETH]</w:t>
       </w:r>
     </w:p>
     <w:p>
       <w:pPr>
-        <w:spacing w:line="360" w:lineRule="auto" w:after="120"/>
-      </w:pPr>
-      <w:r>
-        <w:rPr>
-          <w:b w:val="0"/>
-          <w:i/>
-        </w:rPr>
-        <w:t>[Chèn sơ đồ: Sơ đồ 7: 2.3 Luồng đặt sân và thanh toán ETH]</w:t>
-      </w:r>
-    </w:p>
-    <w:p>
-      <w:pPr>
         <w:pStyle w:val="Heading2"/>
-        <w:spacing w:line="360" w:lineRule="auto" w:after="120"/>
+        <w:spacing w:line="360" w:lineRule="auto" w:after="60"/>
       </w:pPr>
       <w:r>
         <w:t>2.4 Thiết kế dữ liệu on-chain/off-chain</w:t>
@@ -919,68 +844,68 @@
     </w:p>
     <w:p>
       <w:pPr>
-        <w:spacing w:line="360" w:lineRule="auto" w:after="120"/>
+        <w:spacing w:line="360" w:lineRule="auto" w:before="0" w:after="0"/>
+        <w:jc w:val="left"/>
       </w:pPr>
       <w:r>
         <w:rPr>
+          <w:rFonts w:ascii="Times New Roman" w:hAnsi="Times New Roman" w:eastAsia="Times New Roman"/>
           <w:b w:val="0"/>
           <w:i w:val="0"/>
+          <w:sz w:val="26"/>
         </w:rPr>
-        <w:t>Nêu cấu trúc dữ liệu, khóa định danh và chiến lược lưu trữ.</w:t>
+        <w:t>Nội dung chi tiết: ............................................................................................</w:t>
       </w:r>
     </w:p>
     <w:p>
       <w:pPr>
-        <w:spacing w:line="360" w:lineRule="auto" w:after="120"/>
+        <w:spacing w:line="360" w:lineRule="auto" w:before="0" w:after="0"/>
+        <w:jc w:val="left"/>
       </w:pPr>
       <w:r>
         <w:rPr>
+          <w:rFonts w:ascii="Times New Roman" w:hAnsi="Times New Roman" w:eastAsia="Times New Roman"/>
           <w:b w:val="0"/>
           <w:i/>
+          <w:sz w:val="26"/>
         </w:rPr>
-        <w:t>[Chèn hình: Hình 8: 2.4 Thiết kế dữ liệu on-chain/off-chain]</w:t>
+        <w:t>[Chèn hình 8: 2.4 Thiết kế dữ liệu on-chain/off-chain]</w:t>
       </w:r>
     </w:p>
     <w:p>
       <w:pPr>
-        <w:spacing w:line="360" w:lineRule="auto" w:after="120"/>
+        <w:spacing w:line="360" w:lineRule="auto" w:before="0" w:after="0"/>
+        <w:jc w:val="left"/>
       </w:pPr>
       <w:r>
         <w:rPr>
+          <w:rFonts w:ascii="Times New Roman" w:hAnsi="Times New Roman" w:eastAsia="Times New Roman"/>
           <w:b w:val="0"/>
           <w:i/>
+          <w:sz w:val="26"/>
         </w:rPr>
-        <w:t>[Mô tả hình: ............................................................]</w:t>
+        <w:t>[Chèn bảng 8: 2.4 Thiết kế dữ liệu on-chain/off-chain]</w:t>
       </w:r>
     </w:p>
     <w:p>
       <w:pPr>
-        <w:spacing w:line="360" w:lineRule="auto" w:after="120"/>
+        <w:spacing w:line="360" w:lineRule="auto" w:before="0" w:after="0"/>
+        <w:jc w:val="left"/>
       </w:pPr>
       <w:r>
         <w:rPr>
+          <w:rFonts w:ascii="Times New Roman" w:hAnsi="Times New Roman" w:eastAsia="Times New Roman"/>
           <w:b w:val="0"/>
           <w:i/>
+          <w:sz w:val="26"/>
         </w:rPr>
-        <w:t>[Chèn bảng: Bảng 8: 2.4 Thiết kế dữ liệu on-chain/off-chain]</w:t>
+        <w:t>[Chèn sơ đồ 8: 2.4 Thiết kế dữ liệu on-chain/off-chain]</w:t>
       </w:r>
     </w:p>
     <w:p>
       <w:pPr>
-        <w:spacing w:line="360" w:lineRule="auto" w:after="120"/>
-      </w:pPr>
-      <w:r>
-        <w:rPr>
-          <w:b w:val="0"/>
-          <w:i/>
-        </w:rPr>
-        <w:t>[Chèn sơ đồ: Sơ đồ 8: 2.4 Thiết kế dữ liệu on-chain/off-chain]</w:t>
-      </w:r>
-    </w:p>
-    <w:p>
-      <w:pPr>
         <w:pStyle w:val="Heading2"/>
-        <w:spacing w:line="360" w:lineRule="auto" w:after="120"/>
+        <w:spacing w:line="360" w:lineRule="auto" w:after="60"/>
       </w:pPr>
       <w:r>
         <w:t>2.5 Yêu cầu bảo mật và phân quyền</w:t>
@@ -988,431 +913,431 @@
     </w:p>
     <w:p>
       <w:pPr>
-        <w:spacing w:line="360" w:lineRule="auto" w:after="120"/>
+        <w:spacing w:line="360" w:lineRule="auto" w:before="0" w:after="0"/>
+        <w:jc w:val="left"/>
       </w:pPr>
       <w:r>
         <w:rPr>
+          <w:rFonts w:ascii="Times New Roman" w:hAnsi="Times New Roman" w:eastAsia="Times New Roman"/>
           <w:b w:val="0"/>
           <w:i w:val="0"/>
+          <w:sz w:val="26"/>
         </w:rPr>
-        <w:t>Mô tả quy tắc authorization và kiểm soát input.</w:t>
+        <w:t>Nội dung chi tiết: ............................................................................................</w:t>
       </w:r>
     </w:p>
     <w:p>
       <w:pPr>
-        <w:spacing w:line="360" w:lineRule="auto" w:after="120"/>
+        <w:spacing w:line="360" w:lineRule="auto" w:before="0" w:after="0"/>
+        <w:jc w:val="left"/>
       </w:pPr>
       <w:r>
         <w:rPr>
+          <w:rFonts w:ascii="Times New Roman" w:hAnsi="Times New Roman" w:eastAsia="Times New Roman"/>
           <w:b w:val="0"/>
           <w:i/>
+          <w:sz w:val="26"/>
         </w:rPr>
-        <w:t>[Chèn hình: Hình 9: 2.5 Yêu cầu bảo mật và phân quyền]</w:t>
+        <w:t>[Chèn hình 9: 2.5 Yêu cầu bảo mật và phân quyền]</w:t>
       </w:r>
     </w:p>
     <w:p>
       <w:pPr>
-        <w:spacing w:line="360" w:lineRule="auto" w:after="120"/>
+        <w:spacing w:line="360" w:lineRule="auto" w:before="0" w:after="0"/>
+        <w:jc w:val="left"/>
       </w:pPr>
       <w:r>
         <w:rPr>
+          <w:rFonts w:ascii="Times New Roman" w:hAnsi="Times New Roman" w:eastAsia="Times New Roman"/>
           <w:b w:val="0"/>
           <w:i/>
+          <w:sz w:val="26"/>
         </w:rPr>
-        <w:t>[Mô tả hình: ............................................................]</w:t>
+        <w:t>[Chèn bảng 9: 2.5 Yêu cầu bảo mật và phân quyền]</w:t>
       </w:r>
     </w:p>
     <w:p>
       <w:pPr>
-        <w:spacing w:line="360" w:lineRule="auto" w:after="120"/>
+        <w:spacing w:line="360" w:lineRule="auto" w:before="0" w:after="0"/>
+        <w:jc w:val="left"/>
       </w:pPr>
       <w:r>
         <w:rPr>
+          <w:rFonts w:ascii="Times New Roman" w:hAnsi="Times New Roman" w:eastAsia="Times New Roman"/>
           <w:b w:val="0"/>
           <w:i/>
+          <w:sz w:val="26"/>
         </w:rPr>
-        <w:t>[Chèn bảng: Bảng 9: 2.5 Yêu cầu bảo mật và phân quyền]</w:t>
+        <w:t>[Chèn sơ đồ 9: 2.5 Yêu cầu bảo mật và phân quyền]</w:t>
       </w:r>
     </w:p>
     <w:p>
       <w:pPr>
-        <w:spacing w:line="360" w:lineRule="auto" w:after="120"/>
+        <w:pStyle w:val="Heading1"/>
+        <w:spacing w:line="360" w:lineRule="auto" w:after="60"/>
       </w:pPr>
       <w:r>
-        <w:rPr>
-          <w:b w:val="0"/>
-          <w:i/>
-        </w:rPr>
-        <w:t>[Chèn sơ đồ: Sơ đồ 9: 2.5 Yêu cầu bảo mật và phân quyền]</w:t>
+        <w:t>CHƯƠNG 3: TRIỂN KHAI HỆ THỐNG</w:t>
       </w:r>
     </w:p>
     <w:p>
       <w:pPr>
-        <w:pStyle w:val="Heading1"/>
-        <w:spacing w:line="360" w:lineRule="auto" w:after="120"/>
+        <w:pStyle w:val="Heading2"/>
+        <w:spacing w:line="360" w:lineRule="auto" w:after="60"/>
       </w:pPr>
       <w:r>
-        <w:t>CHƯƠNG 3. TRIỂN KHAI HỆ THỐNG</w:t>
+        <w:t>3.1 Triển khai Smart Contract</w:t>
       </w:r>
     </w:p>
     <w:p>
       <w:pPr>
-        <w:pStyle w:val="Heading2"/>
-        <w:spacing w:line="360" w:lineRule="auto" w:after="120"/>
+        <w:spacing w:line="360" w:lineRule="auto" w:before="0" w:after="0"/>
+        <w:jc w:val="left"/>
       </w:pPr>
       <w:r>
-        <w:t>3.1 Triển khai Smart Contract bằng Solidity</w:t>
+        <w:rPr>
+          <w:rFonts w:ascii="Times New Roman" w:hAnsi="Times New Roman" w:eastAsia="Times New Roman"/>
+          <w:b w:val="0"/>
+          <w:i w:val="0"/>
+          <w:sz w:val="26"/>
+        </w:rPr>
+        <w:t>Nội dung chi tiết: ............................................................................................</w:t>
       </w:r>
     </w:p>
     <w:p>
       <w:pPr>
-        <w:spacing w:line="360" w:lineRule="auto" w:after="120"/>
+        <w:spacing w:line="360" w:lineRule="auto" w:before="0" w:after="0"/>
+        <w:jc w:val="left"/>
       </w:pPr>
       <w:r>
         <w:rPr>
+          <w:rFonts w:ascii="Times New Roman" w:hAnsi="Times New Roman" w:eastAsia="Times New Roman"/>
           <w:b w:val="0"/>
-          <w:i w:val="0"/>
+          <w:i/>
+          <w:sz w:val="26"/>
         </w:rPr>
-        <w:t>Đặc tả các hàm chính, điều kiện kiểm tra và event.</w:t>
+        <w:t>[Chèn hình 10: 3.1 Triển khai Smart Contract]</w:t>
       </w:r>
     </w:p>
     <w:p>
       <w:pPr>
-        <w:spacing w:line="360" w:lineRule="auto" w:after="120"/>
+        <w:spacing w:line="360" w:lineRule="auto" w:before="0" w:after="0"/>
+        <w:jc w:val="left"/>
       </w:pPr>
       <w:r>
         <w:rPr>
+          <w:rFonts w:ascii="Times New Roman" w:hAnsi="Times New Roman" w:eastAsia="Times New Roman"/>
           <w:b w:val="0"/>
           <w:i/>
+          <w:sz w:val="26"/>
         </w:rPr>
-        <w:t>[Chèn hình: Hình 10: 3.1 Triển khai Smart Contract bằng Solidity]</w:t>
+        <w:t>[Chèn bảng 10: 3.1 Triển khai Smart Contract]</w:t>
       </w:r>
     </w:p>
     <w:p>
       <w:pPr>
-        <w:spacing w:line="360" w:lineRule="auto" w:after="120"/>
+        <w:spacing w:line="360" w:lineRule="auto" w:before="0" w:after="0"/>
+        <w:jc w:val="left"/>
       </w:pPr>
       <w:r>
         <w:rPr>
+          <w:rFonts w:ascii="Times New Roman" w:hAnsi="Times New Roman" w:eastAsia="Times New Roman"/>
           <w:b w:val="0"/>
           <w:i/>
+          <w:sz w:val="26"/>
         </w:rPr>
-        <w:t>[Mô tả hình: ............................................................]</w:t>
+        <w:t>[Chèn sơ đồ 10: 3.1 Triển khai Smart Contract]</w:t>
       </w:r>
     </w:p>
     <w:p>
       <w:pPr>
-        <w:spacing w:line="360" w:lineRule="auto" w:after="120"/>
+        <w:pStyle w:val="Heading2"/>
+        <w:spacing w:line="360" w:lineRule="auto" w:after="60"/>
       </w:pPr>
       <w:r>
-        <w:rPr>
-          <w:b w:val="0"/>
-          <w:i/>
-        </w:rPr>
-        <w:t>[Chèn bảng: Bảng 10: 3.1 Triển khai Smart Contract bằng Solidity]</w:t>
+        <w:t>3.2 Tích hợp JSON-RPC</w:t>
       </w:r>
     </w:p>
     <w:p>
       <w:pPr>
-        <w:spacing w:line="360" w:lineRule="auto" w:after="120"/>
+        <w:spacing w:line="360" w:lineRule="auto" w:before="0" w:after="0"/>
+        <w:jc w:val="left"/>
       </w:pPr>
       <w:r>
         <w:rPr>
+          <w:rFonts w:ascii="Times New Roman" w:hAnsi="Times New Roman" w:eastAsia="Times New Roman"/>
           <w:b w:val="0"/>
-          <w:i/>
+          <w:i w:val="0"/>
+          <w:sz w:val="26"/>
         </w:rPr>
-        <w:t>[Chèn sơ đồ: Sơ đồ 10: 3.1 Triển khai Smart Contract bằng Solidity]</w:t>
+        <w:t>Nội dung chi tiết: ............................................................................................</w:t>
       </w:r>
     </w:p>
     <w:p>
       <w:pPr>
-        <w:pStyle w:val="Heading2"/>
-        <w:spacing w:line="360" w:lineRule="auto" w:after="120"/>
+        <w:spacing w:line="360" w:lineRule="auto" w:before="0" w:after="0"/>
+        <w:jc w:val="left"/>
       </w:pPr>
       <w:r>
-        <w:t>3.2 Tích hợp blockchain qua JSON-RPC</w:t>
+        <w:rPr>
+          <w:rFonts w:ascii="Times New Roman" w:hAnsi="Times New Roman" w:eastAsia="Times New Roman"/>
+          <w:b w:val="0"/>
+          <w:i/>
+          <w:sz w:val="26"/>
+        </w:rPr>
+        <w:t>[Chèn hình 11: 3.2 Tích hợp JSON-RPC]</w:t>
       </w:r>
     </w:p>
     <w:p>
       <w:pPr>
-        <w:spacing w:line="360" w:lineRule="auto" w:after="120"/>
+        <w:spacing w:line="360" w:lineRule="auto" w:before="0" w:after="0"/>
+        <w:jc w:val="left"/>
       </w:pPr>
       <w:r>
         <w:rPr>
+          <w:rFonts w:ascii="Times New Roman" w:hAnsi="Times New Roman" w:eastAsia="Times New Roman"/>
           <w:b w:val="0"/>
-          <w:i w:val="0"/>
+          <w:i/>
+          <w:sz w:val="26"/>
         </w:rPr>
-        <w:t>Mô tả giao tiếp từ frontend đến node blockchain.</w:t>
+        <w:t>[Chèn bảng 11: 3.2 Tích hợp JSON-RPC]</w:t>
       </w:r>
     </w:p>
     <w:p>
       <w:pPr>
-        <w:spacing w:line="360" w:lineRule="auto" w:after="120"/>
+        <w:spacing w:line="360" w:lineRule="auto" w:before="0" w:after="0"/>
+        <w:jc w:val="left"/>
       </w:pPr>
       <w:r>
         <w:rPr>
+          <w:rFonts w:ascii="Times New Roman" w:hAnsi="Times New Roman" w:eastAsia="Times New Roman"/>
           <w:b w:val="0"/>
           <w:i/>
+          <w:sz w:val="26"/>
         </w:rPr>
-        <w:t>[Chèn hình: Hình 11: 3.2 Tích hợp blockchain qua JSON-RPC]</w:t>
+        <w:t>[Chèn sơ đồ 11: 3.2 Tích hợp JSON-RPC]</w:t>
       </w:r>
     </w:p>
     <w:p>
       <w:pPr>
-        <w:spacing w:line="360" w:lineRule="auto" w:after="120"/>
+        <w:pStyle w:val="Heading2"/>
+        <w:spacing w:line="360" w:lineRule="auto" w:after="60"/>
       </w:pPr>
       <w:r>
-        <w:rPr>
-          <w:b w:val="0"/>
-          <w:i/>
-        </w:rPr>
-        <w:t>[Mô tả hình: ............................................................]</w:t>
+        <w:t>3.3 Backend REST API</w:t>
       </w:r>
     </w:p>
     <w:p>
       <w:pPr>
-        <w:spacing w:line="360" w:lineRule="auto" w:after="120"/>
+        <w:spacing w:line="360" w:lineRule="auto" w:before="0" w:after="0"/>
+        <w:jc w:val="left"/>
       </w:pPr>
       <w:r>
         <w:rPr>
+          <w:rFonts w:ascii="Times New Roman" w:hAnsi="Times New Roman" w:eastAsia="Times New Roman"/>
           <w:b w:val="0"/>
-          <w:i/>
+          <w:i w:val="0"/>
+          <w:sz w:val="26"/>
         </w:rPr>
-        <w:t>[Chèn bảng: Bảng 11: 3.2 Tích hợp blockchain qua JSON-RPC]</w:t>
+        <w:t>Nội dung chi tiết: ............................................................................................</w:t>
       </w:r>
     </w:p>
     <w:p>
       <w:pPr>
-        <w:spacing w:line="360" w:lineRule="auto" w:after="120"/>
+        <w:spacing w:line="360" w:lineRule="auto" w:before="0" w:after="0"/>
+        <w:jc w:val="left"/>
       </w:pPr>
       <w:r>
         <w:rPr>
+          <w:rFonts w:ascii="Times New Roman" w:hAnsi="Times New Roman" w:eastAsia="Times New Roman"/>
           <w:b w:val="0"/>
           <w:i/>
+          <w:sz w:val="26"/>
         </w:rPr>
-        <w:t>[Chèn sơ đồ: Sơ đồ 11: 3.2 Tích hợp blockchain qua JSON-RPC]</w:t>
+        <w:t>[Chèn hình 12: 3.3 Backend REST API]</w:t>
       </w:r>
     </w:p>
     <w:p>
       <w:pPr>
-        <w:pStyle w:val="Heading2"/>
-        <w:spacing w:line="360" w:lineRule="auto" w:after="120"/>
+        <w:spacing w:line="360" w:lineRule="auto" w:before="0" w:after="0"/>
+        <w:jc w:val="left"/>
       </w:pPr>
       <w:r>
-        <w:t>3.3 Xây dựng backend REST API</w:t>
+        <w:rPr>
+          <w:rFonts w:ascii="Times New Roman" w:hAnsi="Times New Roman" w:eastAsia="Times New Roman"/>
+          <w:b w:val="0"/>
+          <w:i/>
+          <w:sz w:val="26"/>
+        </w:rPr>
+        <w:t>[Chèn bảng 12: 3.3 Backend REST API]</w:t>
       </w:r>
     </w:p>
     <w:p>
       <w:pPr>
-        <w:spacing w:line="360" w:lineRule="auto" w:after="120"/>
+        <w:spacing w:line="360" w:lineRule="auto" w:before="0" w:after="0"/>
+        <w:jc w:val="left"/>
       </w:pPr>
       <w:r>
         <w:rPr>
+          <w:rFonts w:ascii="Times New Roman" w:hAnsi="Times New Roman" w:eastAsia="Times New Roman"/>
           <w:b w:val="0"/>
-          <w:i w:val="0"/>
+          <w:i/>
+          <w:sz w:val="26"/>
         </w:rPr>
-        <w:t>Mô tả endpoint nghiệp vụ, middleware và chuẩn response.</w:t>
+        <w:t>[Chèn sơ đồ 12: 3.3 Backend REST API]</w:t>
       </w:r>
     </w:p>
     <w:p>
       <w:pPr>
-        <w:spacing w:line="360" w:lineRule="auto" w:after="120"/>
+        <w:pStyle w:val="Heading2"/>
+        <w:spacing w:line="360" w:lineRule="auto" w:after="60"/>
       </w:pPr>
       <w:r>
-        <w:rPr>
-          <w:b w:val="0"/>
-          <w:i/>
-        </w:rPr>
-        <w:t>[Chèn hình: Hình 12: 3.3 Xây dựng backend REST API]</w:t>
+        <w:t>3.4 Cấu hình Hardhat localhost</w:t>
       </w:r>
     </w:p>
     <w:p>
       <w:pPr>
-        <w:spacing w:line="360" w:lineRule="auto" w:after="120"/>
+        <w:spacing w:line="360" w:lineRule="auto" w:before="0" w:after="0"/>
+        <w:jc w:val="left"/>
       </w:pPr>
       <w:r>
         <w:rPr>
+          <w:rFonts w:ascii="Times New Roman" w:hAnsi="Times New Roman" w:eastAsia="Times New Roman"/>
           <w:b w:val="0"/>
-          <w:i/>
+          <w:i w:val="0"/>
+          <w:sz w:val="26"/>
         </w:rPr>
-        <w:t>[Mô tả hình: ............................................................]</w:t>
+        <w:t>Nội dung chi tiết: ............................................................................................</w:t>
       </w:r>
     </w:p>
     <w:p>
       <w:pPr>
-        <w:spacing w:line="360" w:lineRule="auto" w:after="120"/>
+        <w:spacing w:line="360" w:lineRule="auto" w:before="0" w:after="0"/>
+        <w:jc w:val="left"/>
       </w:pPr>
       <w:r>
         <w:rPr>
+          <w:rFonts w:ascii="Times New Roman" w:hAnsi="Times New Roman" w:eastAsia="Times New Roman"/>
           <w:b w:val="0"/>
           <w:i/>
+          <w:sz w:val="26"/>
         </w:rPr>
-        <w:t>[Chèn bảng: Bảng 12: 3.3 Xây dựng backend REST API]</w:t>
+        <w:t>[Chèn hình 13: 3.4 Cấu hình Hardhat localhost]</w:t>
       </w:r>
     </w:p>
     <w:p>
       <w:pPr>
-        <w:spacing w:line="360" w:lineRule="auto" w:after="120"/>
+        <w:spacing w:line="360" w:lineRule="auto" w:before="0" w:after="0"/>
+        <w:jc w:val="left"/>
       </w:pPr>
       <w:r>
         <w:rPr>
+          <w:rFonts w:ascii="Times New Roman" w:hAnsi="Times New Roman" w:eastAsia="Times New Roman"/>
           <w:b w:val="0"/>
           <w:i/>
+          <w:sz w:val="26"/>
         </w:rPr>
-        <w:t>[Chèn sơ đồ: Sơ đồ 12: 3.3 Xây dựng backend REST API]</w:t>
+        <w:t>[Chèn bảng 13: 3.4 Cấu hình Hardhat localhost]</w:t>
       </w:r>
     </w:p>
     <w:p>
       <w:pPr>
-        <w:pStyle w:val="Heading2"/>
-        <w:spacing w:line="360" w:lineRule="auto" w:after="120"/>
+        <w:spacing w:line="360" w:lineRule="auto" w:before="0" w:after="0"/>
+        <w:jc w:val="left"/>
       </w:pPr>
       <w:r>
-        <w:t>3.4 Cấu hình Hardhat localhost và MetaMask</w:t>
+        <w:rPr>
+          <w:rFonts w:ascii="Times New Roman" w:hAnsi="Times New Roman" w:eastAsia="Times New Roman"/>
+          <w:b w:val="0"/>
+          <w:i/>
+          <w:sz w:val="26"/>
+        </w:rPr>
+        <w:t>[Chèn sơ đồ 13: 3.4 Cấu hình Hardhat localhost]</w:t>
       </w:r>
     </w:p>
     <w:p>
       <w:pPr>
-        <w:spacing w:line="360" w:lineRule="auto" w:after="120"/>
+        <w:pStyle w:val="Heading2"/>
+        <w:spacing w:line="360" w:lineRule="auto" w:after="60"/>
       </w:pPr>
       <w:r>
-        <w:rPr>
-          <w:b w:val="0"/>
-          <w:i w:val="0"/>
-        </w:rPr>
-        <w:t>Trình bày cách cấu hình môi trường dev.</w:t>
+        <w:t>3.5 Phương án deploy</w:t>
       </w:r>
     </w:p>
     <w:p>
       <w:pPr>
-        <w:spacing w:line="360" w:lineRule="auto" w:after="120"/>
+        <w:spacing w:line="360" w:lineRule="auto" w:before="0" w:after="0"/>
+        <w:jc w:val="left"/>
       </w:pPr>
       <w:r>
         <w:rPr>
+          <w:rFonts w:ascii="Times New Roman" w:hAnsi="Times New Roman" w:eastAsia="Times New Roman"/>
           <w:b w:val="0"/>
-          <w:i/>
+          <w:i w:val="0"/>
+          <w:sz w:val="26"/>
         </w:rPr>
-        <w:t>[Chèn hình: Hình 13: 3.4 Cấu hình Hardhat localhost và MetaMask]</w:t>
+        <w:t>Nội dung chi tiết: ............................................................................................</w:t>
       </w:r>
     </w:p>
     <w:p>
       <w:pPr>
-        <w:spacing w:line="360" w:lineRule="auto" w:after="120"/>
+        <w:spacing w:line="360" w:lineRule="auto" w:before="0" w:after="0"/>
+        <w:jc w:val="left"/>
       </w:pPr>
       <w:r>
         <w:rPr>
+          <w:rFonts w:ascii="Times New Roman" w:hAnsi="Times New Roman" w:eastAsia="Times New Roman"/>
           <w:b w:val="0"/>
           <w:i/>
+          <w:sz w:val="26"/>
         </w:rPr>
-        <w:t>[Mô tả hình: ............................................................]</w:t>
+        <w:t>[Chèn hình 14: 3.5 Phương án deploy]</w:t>
       </w:r>
     </w:p>
     <w:p>
       <w:pPr>
-        <w:spacing w:line="360" w:lineRule="auto" w:after="120"/>
+        <w:spacing w:line="360" w:lineRule="auto" w:before="0" w:after="0"/>
+        <w:jc w:val="left"/>
       </w:pPr>
       <w:r>
         <w:rPr>
+          <w:rFonts w:ascii="Times New Roman" w:hAnsi="Times New Roman" w:eastAsia="Times New Roman"/>
           <w:b w:val="0"/>
           <w:i/>
+          <w:sz w:val="26"/>
         </w:rPr>
-        <w:t>[Chèn bảng: Bảng 13: 3.4 Cấu hình Hardhat localhost và MetaMask]</w:t>
+        <w:t>[Chèn bảng 14: 3.5 Phương án deploy]</w:t>
       </w:r>
     </w:p>
     <w:p>
       <w:pPr>
-        <w:spacing w:line="360" w:lineRule="auto" w:after="120"/>
+        <w:spacing w:line="360" w:lineRule="auto" w:before="0" w:after="0"/>
+        <w:jc w:val="left"/>
       </w:pPr>
       <w:r>
         <w:rPr>
+          <w:rFonts w:ascii="Times New Roman" w:hAnsi="Times New Roman" w:eastAsia="Times New Roman"/>
           <w:b w:val="0"/>
           <w:i/>
+          <w:sz w:val="26"/>
         </w:rPr>
-        <w:t>[Chèn sơ đồ: Sơ đồ 13: 3.4 Cấu hình Hardhat localhost và MetaMask]</w:t>
+        <w:t>[Chèn sơ đồ 14: 3.5 Phương án deploy]</w:t>
       </w:r>
     </w:p>
     <w:p>
       <w:pPr>
-        <w:pStyle w:val="Heading2"/>
-        <w:spacing w:line="360" w:lineRule="auto" w:after="120"/>
+        <w:pStyle w:val="Heading1"/>
+        <w:spacing w:line="360" w:lineRule="auto" w:after="60"/>
       </w:pPr>
       <w:r>
-        <w:t>3.5 Phương án deploy frontend/backend</w:t>
+        <w:t>CHƯƠNG 4: MÔ TẢ CHỨC NĂNG</w:t>
       </w:r>
     </w:p>
     <w:p>
       <w:pPr>
-        <w:spacing w:line="360" w:lineRule="auto" w:after="120"/>
-      </w:pPr>
-      <w:r>
-        <w:rPr>
-          <w:b w:val="0"/>
-          <w:i w:val="0"/>
-        </w:rPr>
-        <w:t>Mô tả phương án triển khai Azure và chuẩn bị production.</w:t>
-      </w:r>
-    </w:p>
-    <w:p>
-      <w:pPr>
-        <w:spacing w:line="360" w:lineRule="auto" w:after="120"/>
-      </w:pPr>
-      <w:r>
-        <w:rPr>
-          <w:b w:val="0"/>
-          <w:i/>
-        </w:rPr>
-        <w:t>[Chèn hình: Hình 14: 3.5 Phương án deploy frontend/backend]</w:t>
-      </w:r>
-    </w:p>
-    <w:p>
-      <w:pPr>
-        <w:spacing w:line="360" w:lineRule="auto" w:after="120"/>
-      </w:pPr>
-      <w:r>
-        <w:rPr>
-          <w:b w:val="0"/>
-          <w:i/>
-        </w:rPr>
-        <w:t>[Mô tả hình: ............................................................]</w:t>
-      </w:r>
-    </w:p>
-    <w:p>
-      <w:pPr>
-        <w:spacing w:line="360" w:lineRule="auto" w:after="120"/>
-      </w:pPr>
-      <w:r>
-        <w:rPr>
-          <w:b w:val="0"/>
-          <w:i/>
-        </w:rPr>
-        <w:t>[Chèn bảng: Bảng 14: 3.5 Phương án deploy frontend/backend]</w:t>
-      </w:r>
-    </w:p>
-    <w:p>
-      <w:pPr>
-        <w:spacing w:line="360" w:lineRule="auto" w:after="120"/>
-      </w:pPr>
-      <w:r>
-        <w:rPr>
-          <w:b w:val="0"/>
-          <w:i/>
-        </w:rPr>
-        <w:t>[Chèn sơ đồ: Sơ đồ 14: 3.5 Phương án deploy frontend/backend]</w:t>
-      </w:r>
-    </w:p>
-    <w:p>
-      <w:pPr>
-        <w:pStyle w:val="Heading1"/>
-        <w:spacing w:line="360" w:lineRule="auto" w:after="120"/>
-      </w:pPr>
-      <w:r>
-        <w:t>CHƯƠNG 4. MÔ TẢ CHỨC NĂNG NGHIỆP VỤ</w:t>
-      </w:r>
-    </w:p>
-    <w:p>
-      <w:pPr>
         <w:pStyle w:val="Heading2"/>
-        <w:spacing w:line="360" w:lineRule="auto" w:after="120"/>
+        <w:spacing w:line="360" w:lineRule="auto" w:after="60"/>
       </w:pPr>
       <w:r>
         <w:t>4.1 Chức năng người dùng</w:t>
@@ -1420,137 +1345,137 @@
     </w:p>
     <w:p>
       <w:pPr>
-        <w:spacing w:line="360" w:lineRule="auto" w:after="120"/>
+        <w:spacing w:line="360" w:lineRule="auto" w:before="0" w:after="0"/>
+        <w:jc w:val="left"/>
       </w:pPr>
       <w:r>
         <w:rPr>
+          <w:rFonts w:ascii="Times New Roman" w:hAnsi="Times New Roman" w:eastAsia="Times New Roman"/>
           <w:b w:val="0"/>
           <w:i w:val="0"/>
+          <w:sz w:val="26"/>
         </w:rPr>
-        <w:t>Kết nối ví, xem sân, đặt sân, xem lịch sử giao dịch.</w:t>
+        <w:t>Nội dung chi tiết: ............................................................................................</w:t>
       </w:r>
     </w:p>
     <w:p>
       <w:pPr>
-        <w:spacing w:line="360" w:lineRule="auto" w:after="120"/>
+        <w:spacing w:line="360" w:lineRule="auto" w:before="0" w:after="0"/>
+        <w:jc w:val="left"/>
       </w:pPr>
       <w:r>
         <w:rPr>
+          <w:rFonts w:ascii="Times New Roman" w:hAnsi="Times New Roman" w:eastAsia="Times New Roman"/>
           <w:b w:val="0"/>
           <w:i/>
+          <w:sz w:val="26"/>
         </w:rPr>
-        <w:t>[Chèn hình: Hình 15: 4.1 Chức năng người dùng]</w:t>
+        <w:t>[Chèn hình 15: 4.1 Chức năng người dùng]</w:t>
       </w:r>
     </w:p>
     <w:p>
       <w:pPr>
-        <w:spacing w:line="360" w:lineRule="auto" w:after="120"/>
+        <w:spacing w:line="360" w:lineRule="auto" w:before="0" w:after="0"/>
+        <w:jc w:val="left"/>
       </w:pPr>
       <w:r>
         <w:rPr>
+          <w:rFonts w:ascii="Times New Roman" w:hAnsi="Times New Roman" w:eastAsia="Times New Roman"/>
           <w:b w:val="0"/>
           <w:i/>
+          <w:sz w:val="26"/>
         </w:rPr>
-        <w:t>[Mô tả hình: ............................................................]</w:t>
+        <w:t>[Chèn bảng 15: 4.1 Chức năng người dùng]</w:t>
       </w:r>
     </w:p>
     <w:p>
       <w:pPr>
-        <w:spacing w:line="360" w:lineRule="auto" w:after="120"/>
+        <w:spacing w:line="360" w:lineRule="auto" w:before="0" w:after="0"/>
+        <w:jc w:val="left"/>
       </w:pPr>
       <w:r>
         <w:rPr>
+          <w:rFonts w:ascii="Times New Roman" w:hAnsi="Times New Roman" w:eastAsia="Times New Roman"/>
           <w:b w:val="0"/>
           <w:i/>
+          <w:sz w:val="26"/>
         </w:rPr>
-        <w:t>[Chèn bảng: Bảng 15: 4.1 Chức năng người dùng]</w:t>
+        <w:t>[Chèn sơ đồ 15: 4.1 Chức năng người dùng]</w:t>
       </w:r>
     </w:p>
     <w:p>
       <w:pPr>
-        <w:spacing w:line="360" w:lineRule="auto" w:after="120"/>
+        <w:pStyle w:val="Heading2"/>
+        <w:spacing w:line="360" w:lineRule="auto" w:after="60"/>
       </w:pPr>
       <w:r>
-        <w:rPr>
-          <w:b w:val="0"/>
-          <w:i/>
-        </w:rPr>
-        <w:t>[Chèn sơ đồ: Sơ đồ 15: 4.1 Chức năng người dùng]</w:t>
+        <w:t>4.2 Chức năng quản trị</w:t>
       </w:r>
     </w:p>
     <w:p>
       <w:pPr>
-        <w:pStyle w:val="Heading2"/>
-        <w:spacing w:line="360" w:lineRule="auto" w:after="120"/>
+        <w:spacing w:line="360" w:lineRule="auto" w:before="0" w:after="0"/>
+        <w:jc w:val="left"/>
       </w:pPr>
       <w:r>
-        <w:t>4.2 Chức năng quản trị viên</w:t>
+        <w:rPr>
+          <w:rFonts w:ascii="Times New Roman" w:hAnsi="Times New Roman" w:eastAsia="Times New Roman"/>
+          <w:b w:val="0"/>
+          <w:i w:val="0"/>
+          <w:sz w:val="26"/>
+        </w:rPr>
+        <w:t>Nội dung chi tiết: ............................................................................................</w:t>
       </w:r>
     </w:p>
     <w:p>
       <w:pPr>
-        <w:spacing w:line="360" w:lineRule="auto" w:after="120"/>
+        <w:spacing w:line="360" w:lineRule="auto" w:before="0" w:after="0"/>
+        <w:jc w:val="left"/>
       </w:pPr>
       <w:r>
         <w:rPr>
+          <w:rFonts w:ascii="Times New Roman" w:hAnsi="Times New Roman" w:eastAsia="Times New Roman"/>
           <w:b w:val="0"/>
-          <w:i w:val="0"/>
+          <w:i/>
+          <w:sz w:val="26"/>
         </w:rPr>
-        <w:t>CRUD sân, thống kê doanh thu, giám sát trạng thái sân.</w:t>
+        <w:t>[Chèn hình 16: 4.2 Chức năng quản trị]</w:t>
       </w:r>
     </w:p>
     <w:p>
       <w:pPr>
-        <w:spacing w:line="360" w:lineRule="auto" w:after="120"/>
+        <w:spacing w:line="360" w:lineRule="auto" w:before="0" w:after="0"/>
+        <w:jc w:val="left"/>
       </w:pPr>
       <w:r>
         <w:rPr>
+          <w:rFonts w:ascii="Times New Roman" w:hAnsi="Times New Roman" w:eastAsia="Times New Roman"/>
           <w:b w:val="0"/>
           <w:i/>
+          <w:sz w:val="26"/>
         </w:rPr>
-        <w:t>[Chèn hình: Hình 16: 4.2 Chức năng quản trị viên]</w:t>
+        <w:t>[Chèn bảng 16: 4.2 Chức năng quản trị]</w:t>
       </w:r>
     </w:p>
     <w:p>
       <w:pPr>
-        <w:spacing w:line="360" w:lineRule="auto" w:after="120"/>
+        <w:spacing w:line="360" w:lineRule="auto" w:before="0" w:after="0"/>
+        <w:jc w:val="left"/>
       </w:pPr>
       <w:r>
         <w:rPr>
+          <w:rFonts w:ascii="Times New Roman" w:hAnsi="Times New Roman" w:eastAsia="Times New Roman"/>
           <w:b w:val="0"/>
           <w:i/>
+          <w:sz w:val="26"/>
         </w:rPr>
-        <w:t>[Mô tả hình: ............................................................]</w:t>
+        <w:t>[Chèn sơ đồ 16: 4.2 Chức năng quản trị]</w:t>
       </w:r>
     </w:p>
     <w:p>
       <w:pPr>
-        <w:spacing w:line="360" w:lineRule="auto" w:after="120"/>
-      </w:pPr>
-      <w:r>
-        <w:rPr>
-          <w:b w:val="0"/>
-          <w:i/>
-        </w:rPr>
-        <w:t>[Chèn bảng: Bảng 16: 4.2 Chức năng quản trị viên]</w:t>
-      </w:r>
-    </w:p>
-    <w:p>
-      <w:pPr>
-        <w:spacing w:line="360" w:lineRule="auto" w:after="120"/>
-      </w:pPr>
-      <w:r>
-        <w:rPr>
-          <w:b w:val="0"/>
-          <w:i/>
-        </w:rPr>
-        <w:t>[Chèn sơ đồ: Sơ đồ 16: 4.2 Chức năng quản trị viên]</w:t>
-      </w:r>
-    </w:p>
-    <w:p>
-      <w:pPr>
         <w:pStyle w:val="Heading2"/>
-        <w:spacing w:line="360" w:lineRule="auto" w:after="120"/>
+        <w:spacing w:line="360" w:lineRule="auto" w:after="60"/>
       </w:pPr>
       <w:r>
         <w:t>4.3 Ma trận phân quyền</w:t>
@@ -1558,68 +1483,68 @@
     </w:p>
     <w:p>
       <w:pPr>
-        <w:spacing w:line="360" w:lineRule="auto" w:after="120"/>
+        <w:spacing w:line="360" w:lineRule="auto" w:before="0" w:after="0"/>
+        <w:jc w:val="left"/>
       </w:pPr>
       <w:r>
         <w:rPr>
+          <w:rFonts w:ascii="Times New Roman" w:hAnsi="Times New Roman" w:eastAsia="Times New Roman"/>
           <w:b w:val="0"/>
           <w:i w:val="0"/>
+          <w:sz w:val="26"/>
         </w:rPr>
-        <w:t>Bảng quyền thao tác theo từng vai trò.</w:t>
+        <w:t>Nội dung chi tiết: ............................................................................................</w:t>
       </w:r>
     </w:p>
     <w:p>
       <w:pPr>
-        <w:spacing w:line="360" w:lineRule="auto" w:after="120"/>
+        <w:spacing w:line="360" w:lineRule="auto" w:before="0" w:after="0"/>
+        <w:jc w:val="left"/>
       </w:pPr>
       <w:r>
         <w:rPr>
+          <w:rFonts w:ascii="Times New Roman" w:hAnsi="Times New Roman" w:eastAsia="Times New Roman"/>
           <w:b w:val="0"/>
           <w:i/>
+          <w:sz w:val="26"/>
         </w:rPr>
-        <w:t>[Chèn hình: Hình 17: 4.3 Ma trận phân quyền]</w:t>
+        <w:t>[Chèn hình 17: 4.3 Ma trận phân quyền]</w:t>
       </w:r>
     </w:p>
     <w:p>
       <w:pPr>
-        <w:spacing w:line="360" w:lineRule="auto" w:after="120"/>
+        <w:spacing w:line="360" w:lineRule="auto" w:before="0" w:after="0"/>
+        <w:jc w:val="left"/>
       </w:pPr>
       <w:r>
         <w:rPr>
+          <w:rFonts w:ascii="Times New Roman" w:hAnsi="Times New Roman" w:eastAsia="Times New Roman"/>
           <w:b w:val="0"/>
           <w:i/>
+          <w:sz w:val="26"/>
         </w:rPr>
-        <w:t>[Mô tả hình: ............................................................]</w:t>
+        <w:t>[Chèn bảng 17: 4.3 Ma trận phân quyền]</w:t>
       </w:r>
     </w:p>
     <w:p>
       <w:pPr>
-        <w:spacing w:line="360" w:lineRule="auto" w:after="120"/>
+        <w:spacing w:line="360" w:lineRule="auto" w:before="0" w:after="0"/>
+        <w:jc w:val="left"/>
       </w:pPr>
       <w:r>
         <w:rPr>
+          <w:rFonts w:ascii="Times New Roman" w:hAnsi="Times New Roman" w:eastAsia="Times New Roman"/>
           <w:b w:val="0"/>
           <w:i/>
+          <w:sz w:val="26"/>
         </w:rPr>
-        <w:t>[Chèn bảng: Bảng 17: 4.3 Ma trận phân quyền]</w:t>
+        <w:t>[Chèn sơ đồ 17: 4.3 Ma trận phân quyền]</w:t>
       </w:r>
     </w:p>
     <w:p>
       <w:pPr>
-        <w:spacing w:line="360" w:lineRule="auto" w:after="120"/>
-      </w:pPr>
-      <w:r>
-        <w:rPr>
-          <w:b w:val="0"/>
-          <w:i/>
-        </w:rPr>
-        <w:t>[Chèn sơ đồ: Sơ đồ 17: 4.3 Ma trận phân quyền]</w:t>
-      </w:r>
-    </w:p>
-    <w:p>
-      <w:pPr>
         <w:pStyle w:val="Heading2"/>
-        <w:spacing w:line="360" w:lineRule="auto" w:after="120"/>
+        <w:spacing w:line="360" w:lineRule="auto" w:after="60"/>
       </w:pPr>
       <w:r>
         <w:t>4.4 Xử lý ngoại lệ nghiệp vụ</w:t>
@@ -1627,77 +1552,77 @@
     </w:p>
     <w:p>
       <w:pPr>
-        <w:spacing w:line="360" w:lineRule="auto" w:after="120"/>
+        <w:spacing w:line="360" w:lineRule="auto" w:before="0" w:after="0"/>
+        <w:jc w:val="left"/>
       </w:pPr>
       <w:r>
         <w:rPr>
+          <w:rFonts w:ascii="Times New Roman" w:hAnsi="Times New Roman" w:eastAsia="Times New Roman"/>
           <w:b w:val="0"/>
           <w:i w:val="0"/>
+          <w:sz w:val="26"/>
         </w:rPr>
-        <w:t>Mô tả các lỗi và chiến lược xử lý an toàn.</w:t>
+        <w:t>Nội dung chi tiết: ............................................................................................</w:t>
       </w:r>
     </w:p>
     <w:p>
       <w:pPr>
-        <w:spacing w:line="360" w:lineRule="auto" w:after="120"/>
+        <w:spacing w:line="360" w:lineRule="auto" w:before="0" w:after="0"/>
+        <w:jc w:val="left"/>
       </w:pPr>
       <w:r>
         <w:rPr>
+          <w:rFonts w:ascii="Times New Roman" w:hAnsi="Times New Roman" w:eastAsia="Times New Roman"/>
           <w:b w:val="0"/>
           <w:i/>
+          <w:sz w:val="26"/>
         </w:rPr>
-        <w:t>[Chèn hình: Hình 18: 4.4 Xử lý ngoại lệ nghiệp vụ]</w:t>
+        <w:t>[Chèn hình 18: 4.4 Xử lý ngoại lệ nghiệp vụ]</w:t>
       </w:r>
     </w:p>
     <w:p>
       <w:pPr>
-        <w:spacing w:line="360" w:lineRule="auto" w:after="120"/>
+        <w:spacing w:line="360" w:lineRule="auto" w:before="0" w:after="0"/>
+        <w:jc w:val="left"/>
       </w:pPr>
       <w:r>
         <w:rPr>
+          <w:rFonts w:ascii="Times New Roman" w:hAnsi="Times New Roman" w:eastAsia="Times New Roman"/>
           <w:b w:val="0"/>
           <w:i/>
+          <w:sz w:val="26"/>
         </w:rPr>
-        <w:t>[Mô tả hình: ............................................................]</w:t>
+        <w:t>[Chèn bảng 18: 4.4 Xử lý ngoại lệ nghiệp vụ]</w:t>
       </w:r>
     </w:p>
     <w:p>
       <w:pPr>
-        <w:spacing w:line="360" w:lineRule="auto" w:after="120"/>
+        <w:spacing w:line="360" w:lineRule="auto" w:before="0" w:after="0"/>
+        <w:jc w:val="left"/>
       </w:pPr>
       <w:r>
         <w:rPr>
+          <w:rFonts w:ascii="Times New Roman" w:hAnsi="Times New Roman" w:eastAsia="Times New Roman"/>
           <w:b w:val="0"/>
           <w:i/>
+          <w:sz w:val="26"/>
         </w:rPr>
-        <w:t>[Chèn bảng: Bảng 18: 4.4 Xử lý ngoại lệ nghiệp vụ]</w:t>
+        <w:t>[Chèn sơ đồ 18: 4.4 Xử lý ngoại lệ nghiệp vụ]</w:t>
       </w:r>
     </w:p>
     <w:p>
       <w:pPr>
-        <w:spacing w:line="360" w:lineRule="auto" w:after="120"/>
+        <w:pStyle w:val="Heading1"/>
+        <w:spacing w:line="360" w:lineRule="auto" w:after="60"/>
       </w:pPr>
       <w:r>
-        <w:rPr>
-          <w:b w:val="0"/>
-          <w:i/>
-        </w:rPr>
-        <w:t>[Chèn sơ đồ: Sơ đồ 18: 4.4 Xử lý ngoại lệ nghiệp vụ]</w:t>
+        <w:t>CHƯƠNG 5: KIỂM THỬ VÀ ĐÁNH GIÁ</w:t>
       </w:r>
     </w:p>
     <w:p>
       <w:pPr>
-        <w:pStyle w:val="Heading1"/>
-        <w:spacing w:line="360" w:lineRule="auto" w:after="120"/>
-      </w:pPr>
-      <w:r>
-        <w:t>CHƯƠNG 5. KIỂM THỬ VÀ ĐÁNH GIÁ KẾT QUẢ</w:t>
-      </w:r>
-    </w:p>
-    <w:p>
-      <w:pPr>
         <w:pStyle w:val="Heading2"/>
-        <w:spacing w:line="360" w:lineRule="auto" w:after="120"/>
+        <w:spacing w:line="360" w:lineRule="auto" w:after="60"/>
       </w:pPr>
       <w:r>
         <w:t>5.1 Kế hoạch kiểm thử</w:t>
@@ -1705,68 +1630,68 @@
     </w:p>
     <w:p>
       <w:pPr>
-        <w:spacing w:line="360" w:lineRule="auto" w:after="120"/>
+        <w:spacing w:line="360" w:lineRule="auto" w:before="0" w:after="0"/>
+        <w:jc w:val="left"/>
       </w:pPr>
       <w:r>
         <w:rPr>
+          <w:rFonts w:ascii="Times New Roman" w:hAnsi="Times New Roman" w:eastAsia="Times New Roman"/>
           <w:b w:val="0"/>
           <w:i w:val="0"/>
+          <w:sz w:val="26"/>
         </w:rPr>
-        <w:t>Nêu phạm vi, kịch bản và tiêu chí pass/fail.</w:t>
+        <w:t>Nội dung chi tiết: ............................................................................................</w:t>
       </w:r>
     </w:p>
     <w:p>
       <w:pPr>
-        <w:spacing w:line="360" w:lineRule="auto" w:after="120"/>
+        <w:spacing w:line="360" w:lineRule="auto" w:before="0" w:after="0"/>
+        <w:jc w:val="left"/>
       </w:pPr>
       <w:r>
         <w:rPr>
+          <w:rFonts w:ascii="Times New Roman" w:hAnsi="Times New Roman" w:eastAsia="Times New Roman"/>
           <w:b w:val="0"/>
           <w:i/>
+          <w:sz w:val="26"/>
         </w:rPr>
-        <w:t>[Chèn hình: Hình 19: 5.1 Kế hoạch kiểm thử]</w:t>
+        <w:t>[Chèn hình 19: 5.1 Kế hoạch kiểm thử]</w:t>
       </w:r>
     </w:p>
     <w:p>
       <w:pPr>
-        <w:spacing w:line="360" w:lineRule="auto" w:after="120"/>
+        <w:spacing w:line="360" w:lineRule="auto" w:before="0" w:after="0"/>
+        <w:jc w:val="left"/>
       </w:pPr>
       <w:r>
         <w:rPr>
+          <w:rFonts w:ascii="Times New Roman" w:hAnsi="Times New Roman" w:eastAsia="Times New Roman"/>
           <w:b w:val="0"/>
           <w:i/>
+          <w:sz w:val="26"/>
         </w:rPr>
-        <w:t>[Mô tả hình: ............................................................]</w:t>
+        <w:t>[Chèn bảng 19: 5.1 Kế hoạch kiểm thử]</w:t>
       </w:r>
     </w:p>
     <w:p>
       <w:pPr>
-        <w:spacing w:line="360" w:lineRule="auto" w:after="120"/>
+        <w:spacing w:line="360" w:lineRule="auto" w:before="0" w:after="0"/>
+        <w:jc w:val="left"/>
       </w:pPr>
       <w:r>
         <w:rPr>
+          <w:rFonts w:ascii="Times New Roman" w:hAnsi="Times New Roman" w:eastAsia="Times New Roman"/>
           <w:b w:val="0"/>
           <w:i/>
+          <w:sz w:val="26"/>
         </w:rPr>
-        <w:t>[Chèn bảng: Bảng 19: 5.1 Kế hoạch kiểm thử]</w:t>
+        <w:t>[Chèn sơ đồ 19: 5.1 Kế hoạch kiểm thử]</w:t>
       </w:r>
     </w:p>
     <w:p>
       <w:pPr>
-        <w:spacing w:line="360" w:lineRule="auto" w:after="120"/>
-      </w:pPr>
-      <w:r>
-        <w:rPr>
-          <w:b w:val="0"/>
-          <w:i/>
-        </w:rPr>
-        <w:t>[Chèn sơ đồ: Sơ đồ 19: 5.1 Kế hoạch kiểm thử]</w:t>
-      </w:r>
-    </w:p>
-    <w:p>
-      <w:pPr>
         <w:pStyle w:val="Heading2"/>
-        <w:spacing w:line="360" w:lineRule="auto" w:after="120"/>
+        <w:spacing w:line="360" w:lineRule="auto" w:after="60"/>
       </w:pPr>
       <w:r>
         <w:t>5.2 Bộ test case chi tiết</w:t>
@@ -1774,68 +1699,68 @@
     </w:p>
     <w:p>
       <w:pPr>
-        <w:spacing w:line="360" w:lineRule="auto" w:after="120"/>
+        <w:spacing w:line="360" w:lineRule="auto" w:before="0" w:after="0"/>
+        <w:jc w:val="left"/>
       </w:pPr>
       <w:r>
         <w:rPr>
+          <w:rFonts w:ascii="Times New Roman" w:hAnsi="Times New Roman" w:eastAsia="Times New Roman"/>
           <w:b w:val="0"/>
           <w:i w:val="0"/>
+          <w:sz w:val="26"/>
         </w:rPr>
-        <w:t>Liệt kê các test case cốt lõi và expected output.</w:t>
+        <w:t>Nội dung chi tiết: ............................................................................................</w:t>
       </w:r>
     </w:p>
     <w:p>
       <w:pPr>
-        <w:spacing w:line="360" w:lineRule="auto" w:after="120"/>
+        <w:spacing w:line="360" w:lineRule="auto" w:before="0" w:after="0"/>
+        <w:jc w:val="left"/>
       </w:pPr>
       <w:r>
         <w:rPr>
+          <w:rFonts w:ascii="Times New Roman" w:hAnsi="Times New Roman" w:eastAsia="Times New Roman"/>
           <w:b w:val="0"/>
           <w:i/>
+          <w:sz w:val="26"/>
         </w:rPr>
-        <w:t>[Chèn hình: Hình 20: 5.2 Bộ test case chi tiết]</w:t>
+        <w:t>[Chèn hình 20: 5.2 Bộ test case chi tiết]</w:t>
       </w:r>
     </w:p>
     <w:p>
       <w:pPr>
-        <w:spacing w:line="360" w:lineRule="auto" w:after="120"/>
+        <w:spacing w:line="360" w:lineRule="auto" w:before="0" w:after="0"/>
+        <w:jc w:val="left"/>
       </w:pPr>
       <w:r>
         <w:rPr>
+          <w:rFonts w:ascii="Times New Roman" w:hAnsi="Times New Roman" w:eastAsia="Times New Roman"/>
           <w:b w:val="0"/>
           <w:i/>
+          <w:sz w:val="26"/>
         </w:rPr>
-        <w:t>[Mô tả hình: ............................................................]</w:t>
+        <w:t>[Chèn bảng 20: 5.2 Bộ test case chi tiết]</w:t>
       </w:r>
     </w:p>
     <w:p>
       <w:pPr>
-        <w:spacing w:line="360" w:lineRule="auto" w:after="120"/>
+        <w:spacing w:line="360" w:lineRule="auto" w:before="0" w:after="0"/>
+        <w:jc w:val="left"/>
       </w:pPr>
       <w:r>
         <w:rPr>
+          <w:rFonts w:ascii="Times New Roman" w:hAnsi="Times New Roman" w:eastAsia="Times New Roman"/>
           <w:b w:val="0"/>
           <w:i/>
+          <w:sz w:val="26"/>
         </w:rPr>
-        <w:t>[Chèn bảng: Bảng 20: 5.2 Bộ test case chi tiết]</w:t>
+        <w:t>[Chèn sơ đồ 20: 5.2 Bộ test case chi tiết]</w:t>
       </w:r>
     </w:p>
     <w:p>
       <w:pPr>
-        <w:spacing w:line="360" w:lineRule="auto" w:after="120"/>
-      </w:pPr>
-      <w:r>
-        <w:rPr>
-          <w:b w:val="0"/>
-          <w:i/>
-        </w:rPr>
-        <w:t>[Chèn sơ đồ: Sơ đồ 20: 5.2 Bộ test case chi tiết]</w:t>
-      </w:r>
-    </w:p>
-    <w:p>
-      <w:pPr>
         <w:pStyle w:val="Heading2"/>
-        <w:spacing w:line="360" w:lineRule="auto" w:after="120"/>
+        <w:spacing w:line="360" w:lineRule="auto" w:after="60"/>
       </w:pPr>
       <w:r>
         <w:t>5.3 Kết quả thực nghiệm</w:t>
@@ -1843,68 +1768,68 @@
     </w:p>
     <w:p>
       <w:pPr>
-        <w:spacing w:line="360" w:lineRule="auto" w:after="120"/>
+        <w:spacing w:line="360" w:lineRule="auto" w:before="0" w:after="0"/>
+        <w:jc w:val="left"/>
       </w:pPr>
       <w:r>
         <w:rPr>
+          <w:rFonts w:ascii="Times New Roman" w:hAnsi="Times New Roman" w:eastAsia="Times New Roman"/>
           <w:b w:val="0"/>
           <w:i w:val="0"/>
+          <w:sz w:val="26"/>
         </w:rPr>
-        <w:t>Trình bày số liệu và mức độ đáp ứng yêu cầu.</w:t>
+        <w:t>Nội dung chi tiết: ............................................................................................</w:t>
       </w:r>
     </w:p>
     <w:p>
       <w:pPr>
-        <w:spacing w:line="360" w:lineRule="auto" w:after="120"/>
+        <w:spacing w:line="360" w:lineRule="auto" w:before="0" w:after="0"/>
+        <w:jc w:val="left"/>
       </w:pPr>
       <w:r>
         <w:rPr>
+          <w:rFonts w:ascii="Times New Roman" w:hAnsi="Times New Roman" w:eastAsia="Times New Roman"/>
           <w:b w:val="0"/>
           <w:i/>
+          <w:sz w:val="26"/>
         </w:rPr>
-        <w:t>[Chèn hình: Hình 21: 5.3 Kết quả thực nghiệm]</w:t>
+        <w:t>[Chèn hình 21: 5.3 Kết quả thực nghiệm]</w:t>
       </w:r>
     </w:p>
     <w:p>
       <w:pPr>
-        <w:spacing w:line="360" w:lineRule="auto" w:after="120"/>
+        <w:spacing w:line="360" w:lineRule="auto" w:before="0" w:after="0"/>
+        <w:jc w:val="left"/>
       </w:pPr>
       <w:r>
         <w:rPr>
+          <w:rFonts w:ascii="Times New Roman" w:hAnsi="Times New Roman" w:eastAsia="Times New Roman"/>
           <w:b w:val="0"/>
           <w:i/>
+          <w:sz w:val="26"/>
         </w:rPr>
-        <w:t>[Mô tả hình: ............................................................]</w:t>
+        <w:t>[Chèn bảng 21: 5.3 Kết quả thực nghiệm]</w:t>
       </w:r>
     </w:p>
     <w:p>
       <w:pPr>
-        <w:spacing w:line="360" w:lineRule="auto" w:after="120"/>
+        <w:spacing w:line="360" w:lineRule="auto" w:before="0" w:after="0"/>
+        <w:jc w:val="left"/>
       </w:pPr>
       <w:r>
         <w:rPr>
+          <w:rFonts w:ascii="Times New Roman" w:hAnsi="Times New Roman" w:eastAsia="Times New Roman"/>
           <w:b w:val="0"/>
           <w:i/>
+          <w:sz w:val="26"/>
         </w:rPr>
-        <w:t>[Chèn bảng: Bảng 21: 5.3 Kết quả thực nghiệm]</w:t>
+        <w:t>[Chèn sơ đồ 21: 5.3 Kết quả thực nghiệm]</w:t>
       </w:r>
     </w:p>
     <w:p>
       <w:pPr>
-        <w:spacing w:line="360" w:lineRule="auto" w:after="120"/>
-      </w:pPr>
-      <w:r>
-        <w:rPr>
-          <w:b w:val="0"/>
-          <w:i/>
-        </w:rPr>
-        <w:t>[Chèn sơ đồ: Sơ đồ 21: 5.3 Kết quả thực nghiệm]</w:t>
-      </w:r>
-    </w:p>
-    <w:p>
-      <w:pPr>
         <w:pStyle w:val="Heading2"/>
-        <w:spacing w:line="360" w:lineRule="auto" w:after="120"/>
+        <w:spacing w:line="360" w:lineRule="auto" w:after="60"/>
       </w:pPr>
       <w:r>
         <w:t>5.4 Nhận xét</w:t>
@@ -1912,77 +1837,77 @@
     </w:p>
     <w:p>
       <w:pPr>
-        <w:spacing w:line="360" w:lineRule="auto" w:after="120"/>
+        <w:spacing w:line="360" w:lineRule="auto" w:before="0" w:after="0"/>
+        <w:jc w:val="left"/>
       </w:pPr>
       <w:r>
         <w:rPr>
+          <w:rFonts w:ascii="Times New Roman" w:hAnsi="Times New Roman" w:eastAsia="Times New Roman"/>
           <w:b w:val="0"/>
           <w:i w:val="0"/>
+          <w:sz w:val="26"/>
         </w:rPr>
-        <w:t>Đánh giá các điểm đạt được và tồn tại.</w:t>
+        <w:t>Nội dung chi tiết: ............................................................................................</w:t>
       </w:r>
     </w:p>
     <w:p>
       <w:pPr>
-        <w:spacing w:line="360" w:lineRule="auto" w:after="120"/>
+        <w:spacing w:line="360" w:lineRule="auto" w:before="0" w:after="0"/>
+        <w:jc w:val="left"/>
       </w:pPr>
       <w:r>
         <w:rPr>
+          <w:rFonts w:ascii="Times New Roman" w:hAnsi="Times New Roman" w:eastAsia="Times New Roman"/>
           <w:b w:val="0"/>
           <w:i/>
+          <w:sz w:val="26"/>
         </w:rPr>
-        <w:t>[Chèn hình: Hình 22: 5.4 Nhận xét]</w:t>
+        <w:t>[Chèn hình 22: 5.4 Nhận xét]</w:t>
       </w:r>
     </w:p>
     <w:p>
       <w:pPr>
-        <w:spacing w:line="360" w:lineRule="auto" w:after="120"/>
+        <w:spacing w:line="360" w:lineRule="auto" w:before="0" w:after="0"/>
+        <w:jc w:val="left"/>
       </w:pPr>
       <w:r>
         <w:rPr>
+          <w:rFonts w:ascii="Times New Roman" w:hAnsi="Times New Roman" w:eastAsia="Times New Roman"/>
           <w:b w:val="0"/>
           <w:i/>
+          <w:sz w:val="26"/>
         </w:rPr>
-        <w:t>[Mô tả hình: ............................................................]</w:t>
+        <w:t>[Chèn bảng 22: 5.4 Nhận xét]</w:t>
       </w:r>
     </w:p>
     <w:p>
       <w:pPr>
-        <w:spacing w:line="360" w:lineRule="auto" w:after="120"/>
+        <w:spacing w:line="360" w:lineRule="auto" w:before="0" w:after="0"/>
+        <w:jc w:val="left"/>
       </w:pPr>
       <w:r>
         <w:rPr>
+          <w:rFonts w:ascii="Times New Roman" w:hAnsi="Times New Roman" w:eastAsia="Times New Roman"/>
           <w:b w:val="0"/>
           <w:i/>
+          <w:sz w:val="26"/>
         </w:rPr>
-        <w:t>[Chèn bảng: Bảng 22: 5.4 Nhận xét]</w:t>
+        <w:t>[Chèn sơ đồ 22: 5.4 Nhận xét]</w:t>
       </w:r>
     </w:p>
     <w:p>
       <w:pPr>
-        <w:spacing w:line="360" w:lineRule="auto" w:after="120"/>
+        <w:pStyle w:val="Heading1"/>
+        <w:spacing w:line="360" w:lineRule="auto" w:after="60"/>
       </w:pPr>
       <w:r>
-        <w:rPr>
-          <w:b w:val="0"/>
-          <w:i/>
-        </w:rPr>
-        <w:t>[Chèn sơ đồ: Sơ đồ 22: 5.4 Nhận xét]</w:t>
+        <w:t>CHƯƠNG 6: ĐÁNH GIÁ HỆ THỐNG &amp; HƯỚNG PHÁT TRIỂN</w:t>
       </w:r>
     </w:p>
     <w:p>
       <w:pPr>
-        <w:pStyle w:val="Heading1"/>
-        <w:spacing w:line="360" w:lineRule="auto" w:after="120"/>
-      </w:pPr>
-      <w:r>
-        <w:t>CHƯƠNG 6. ĐÁNH GIÁ HỆ THỐNG VÀ HƯỚNG PHÁT TRIỂN</w:t>
-      </w:r>
-    </w:p>
-    <w:p>
-      <w:pPr>
         <w:pStyle w:val="Heading2"/>
-        <w:spacing w:line="360" w:lineRule="auto" w:after="120"/>
+        <w:spacing w:line="360" w:lineRule="auto" w:after="60"/>
       </w:pPr>
       <w:r>
         <w:t>6.1 Ưu điểm</w:t>
@@ -1990,215 +1915,215 @@
     </w:p>
     <w:p>
       <w:pPr>
-        <w:spacing w:line="360" w:lineRule="auto" w:after="120"/>
+        <w:spacing w:line="360" w:lineRule="auto" w:before="0" w:after="0"/>
+        <w:jc w:val="left"/>
       </w:pPr>
       <w:r>
         <w:rPr>
+          <w:rFonts w:ascii="Times New Roman" w:hAnsi="Times New Roman" w:eastAsia="Times New Roman"/>
           <w:b w:val="0"/>
           <w:i w:val="0"/>
+          <w:sz w:val="26"/>
         </w:rPr>
-        <w:t>Phân tích các điểm mạnh về tính minh bạch và khả năng mở rộng.</w:t>
+        <w:t>Nội dung chi tiết: ............................................................................................</w:t>
       </w:r>
     </w:p>
     <w:p>
       <w:pPr>
-        <w:spacing w:line="360" w:lineRule="auto" w:after="120"/>
+        <w:spacing w:line="360" w:lineRule="auto" w:before="0" w:after="0"/>
+        <w:jc w:val="left"/>
       </w:pPr>
       <w:r>
         <w:rPr>
+          <w:rFonts w:ascii="Times New Roman" w:hAnsi="Times New Roman" w:eastAsia="Times New Roman"/>
           <w:b w:val="0"/>
           <w:i/>
+          <w:sz w:val="26"/>
         </w:rPr>
-        <w:t>[Chèn hình: Hình 23: 6.1 Ưu điểm]</w:t>
+        <w:t>[Chèn hình 23: 6.1 Ưu điểm]</w:t>
       </w:r>
     </w:p>
     <w:p>
       <w:pPr>
-        <w:spacing w:line="360" w:lineRule="auto" w:after="120"/>
+        <w:spacing w:line="360" w:lineRule="auto" w:before="0" w:after="0"/>
+        <w:jc w:val="left"/>
       </w:pPr>
       <w:r>
         <w:rPr>
+          <w:rFonts w:ascii="Times New Roman" w:hAnsi="Times New Roman" w:eastAsia="Times New Roman"/>
           <w:b w:val="0"/>
           <w:i/>
+          <w:sz w:val="26"/>
         </w:rPr>
-        <w:t>[Mô tả hình: ............................................................]</w:t>
+        <w:t>[Chèn bảng 23: 6.1 Ưu điểm]</w:t>
       </w:r>
     </w:p>
     <w:p>
       <w:pPr>
-        <w:spacing w:line="360" w:lineRule="auto" w:after="120"/>
+        <w:spacing w:line="360" w:lineRule="auto" w:before="0" w:after="0"/>
+        <w:jc w:val="left"/>
       </w:pPr>
       <w:r>
         <w:rPr>
+          <w:rFonts w:ascii="Times New Roman" w:hAnsi="Times New Roman" w:eastAsia="Times New Roman"/>
           <w:b w:val="0"/>
           <w:i/>
+          <w:sz w:val="26"/>
         </w:rPr>
-        <w:t>[Chèn bảng: Bảng 23: 6.1 Ưu điểm]</w:t>
+        <w:t>[Chèn sơ đồ 23: 6.1 Ưu điểm]</w:t>
       </w:r>
     </w:p>
     <w:p>
       <w:pPr>
-        <w:spacing w:line="360" w:lineRule="auto" w:after="120"/>
+        <w:pStyle w:val="Heading2"/>
+        <w:spacing w:line="360" w:lineRule="auto" w:after="60"/>
       </w:pPr>
       <w:r>
-        <w:rPr>
-          <w:b w:val="0"/>
-          <w:i/>
-        </w:rPr>
-        <w:t>[Chèn sơ đồ: Sơ đồ 23: 6.1 Ưu điểm]</w:t>
+        <w:t>6.2 Hạn chế</w:t>
       </w:r>
     </w:p>
     <w:p>
       <w:pPr>
-        <w:pStyle w:val="Heading2"/>
-        <w:spacing w:line="360" w:lineRule="auto" w:after="120"/>
+        <w:spacing w:line="360" w:lineRule="auto" w:before="0" w:after="0"/>
+        <w:jc w:val="left"/>
       </w:pPr>
       <w:r>
-        <w:t>6.2 Hạn chế của Hardhat localhost</w:t>
+        <w:rPr>
+          <w:rFonts w:ascii="Times New Roman" w:hAnsi="Times New Roman" w:eastAsia="Times New Roman"/>
+          <w:b w:val="0"/>
+          <w:i w:val="0"/>
+          <w:sz w:val="26"/>
+        </w:rPr>
+        <w:t>Nội dung chi tiết: ............................................................................................</w:t>
       </w:r>
     </w:p>
     <w:p>
       <w:pPr>
-        <w:spacing w:line="360" w:lineRule="auto" w:after="120"/>
+        <w:spacing w:line="360" w:lineRule="auto" w:before="0" w:after="0"/>
+        <w:jc w:val="left"/>
       </w:pPr>
       <w:r>
         <w:rPr>
+          <w:rFonts w:ascii="Times New Roman" w:hAnsi="Times New Roman" w:eastAsia="Times New Roman"/>
           <w:b w:val="0"/>
-          <w:i w:val="0"/>
+          <w:i/>
+          <w:sz w:val="26"/>
         </w:rPr>
-        <w:t>Nêu giới hạn so với mạng công khai.</w:t>
+        <w:t>[Chèn hình 24: 6.2 Hạn chế]</w:t>
       </w:r>
     </w:p>
     <w:p>
       <w:pPr>
-        <w:spacing w:line="360" w:lineRule="auto" w:after="120"/>
+        <w:spacing w:line="360" w:lineRule="auto" w:before="0" w:after="0"/>
+        <w:jc w:val="left"/>
       </w:pPr>
       <w:r>
         <w:rPr>
+          <w:rFonts w:ascii="Times New Roman" w:hAnsi="Times New Roman" w:eastAsia="Times New Roman"/>
           <w:b w:val="0"/>
           <w:i/>
+          <w:sz w:val="26"/>
         </w:rPr>
-        <w:t>[Chèn hình: Hình 24: 6.2 Hạn chế của Hardhat localhost]</w:t>
+        <w:t>[Chèn bảng 24: 6.2 Hạn chế]</w:t>
       </w:r>
     </w:p>
     <w:p>
       <w:pPr>
-        <w:spacing w:line="360" w:lineRule="auto" w:after="120"/>
+        <w:spacing w:line="360" w:lineRule="auto" w:before="0" w:after="0"/>
+        <w:jc w:val="left"/>
       </w:pPr>
       <w:r>
         <w:rPr>
+          <w:rFonts w:ascii="Times New Roman" w:hAnsi="Times New Roman" w:eastAsia="Times New Roman"/>
           <w:b w:val="0"/>
           <w:i/>
+          <w:sz w:val="26"/>
         </w:rPr>
-        <w:t>[Mô tả hình: ............................................................]</w:t>
+        <w:t>[Chèn sơ đồ 24: 6.2 Hạn chế]</w:t>
       </w:r>
     </w:p>
     <w:p>
       <w:pPr>
-        <w:spacing w:line="360" w:lineRule="auto" w:after="120"/>
+        <w:pStyle w:val="Heading2"/>
+        <w:spacing w:line="360" w:lineRule="auto" w:after="60"/>
       </w:pPr>
       <w:r>
-        <w:rPr>
-          <w:b w:val="0"/>
-          <w:i/>
-        </w:rPr>
-        <w:t>[Chèn bảng: Bảng 24: 6.2 Hạn chế của Hardhat localhost]</w:t>
+        <w:t>6.3 Hướng phát triển lên testnet</w:t>
       </w:r>
     </w:p>
     <w:p>
       <w:pPr>
-        <w:spacing w:line="360" w:lineRule="auto" w:after="120"/>
+        <w:spacing w:line="360" w:lineRule="auto" w:before="0" w:after="0"/>
+        <w:jc w:val="left"/>
       </w:pPr>
       <w:r>
         <w:rPr>
+          <w:rFonts w:ascii="Times New Roman" w:hAnsi="Times New Roman" w:eastAsia="Times New Roman"/>
           <w:b w:val="0"/>
-          <w:i/>
+          <w:i w:val="0"/>
+          <w:sz w:val="26"/>
         </w:rPr>
-        <w:t>[Chèn sơ đồ: Sơ đồ 24: 6.2 Hạn chế của Hardhat localhost]</w:t>
+        <w:t>Nội dung chi tiết: ............................................................................................</w:t>
       </w:r>
     </w:p>
     <w:p>
       <w:pPr>
-        <w:pStyle w:val="Heading2"/>
-        <w:spacing w:line="360" w:lineRule="auto" w:after="120"/>
+        <w:spacing w:line="360" w:lineRule="auto" w:before="0" w:after="0"/>
+        <w:jc w:val="left"/>
       </w:pPr>
       <w:r>
-        <w:t>6.3 Hướng phát triển lên Sepolia</w:t>
+        <w:rPr>
+          <w:rFonts w:ascii="Times New Roman" w:hAnsi="Times New Roman" w:eastAsia="Times New Roman"/>
+          <w:b w:val="0"/>
+          <w:i/>
+          <w:sz w:val="26"/>
+        </w:rPr>
+        <w:t>[Chèn hình 25: 6.3 Hướng phát triển lên testnet]</w:t>
       </w:r>
     </w:p>
     <w:p>
       <w:pPr>
-        <w:spacing w:line="360" w:lineRule="auto" w:after="120"/>
+        <w:spacing w:line="360" w:lineRule="auto" w:before="0" w:after="0"/>
+        <w:jc w:val="left"/>
       </w:pPr>
       <w:r>
         <w:rPr>
+          <w:rFonts w:ascii="Times New Roman" w:hAnsi="Times New Roman" w:eastAsia="Times New Roman"/>
           <w:b w:val="0"/>
-          <w:i w:val="0"/>
+          <w:i/>
+          <w:sz w:val="26"/>
         </w:rPr>
-        <w:t>Lộ trình triển khai testnet và cải tiến tiếp theo.</w:t>
+        <w:t>[Chèn bảng 25: 6.3 Hướng phát triển lên testnet]</w:t>
       </w:r>
     </w:p>
     <w:p>
       <w:pPr>
-        <w:spacing w:line="360" w:lineRule="auto" w:after="120"/>
+        <w:spacing w:line="360" w:lineRule="auto" w:before="0" w:after="0"/>
+        <w:jc w:val="left"/>
       </w:pPr>
       <w:r>
         <w:rPr>
+          <w:rFonts w:ascii="Times New Roman" w:hAnsi="Times New Roman" w:eastAsia="Times New Roman"/>
           <w:b w:val="0"/>
           <w:i/>
+          <w:sz w:val="26"/>
         </w:rPr>
-        <w:t>[Chèn hình: Hình 25: 6.3 Hướng phát triển lên Sepolia]</w:t>
+        <w:t>[Chèn sơ đồ 25: 6.3 Hướng phát triển lên testnet]</w:t>
       </w:r>
     </w:p>
     <w:p>
       <w:pPr>
-        <w:spacing w:line="360" w:lineRule="auto" w:after="120"/>
+        <w:pStyle w:val="Heading1"/>
+        <w:spacing w:line="360" w:lineRule="auto" w:after="60"/>
       </w:pPr>
       <w:r>
-        <w:rPr>
-          <w:b w:val="0"/>
-          <w:i/>
-        </w:rPr>
-        <w:t>[Mô tả hình: ............................................................]</w:t>
+        <w:t>CHƯƠNG 7: KẾT LUẬN</w:t>
       </w:r>
     </w:p>
     <w:p>
       <w:pPr>
-        <w:spacing w:line="360" w:lineRule="auto" w:after="120"/>
-      </w:pPr>
-      <w:r>
-        <w:rPr>
-          <w:b w:val="0"/>
-          <w:i/>
-        </w:rPr>
-        <w:t>[Chèn bảng: Bảng 25: 6.3 Hướng phát triển lên Sepolia]</w:t>
-      </w:r>
-    </w:p>
-    <w:p>
-      <w:pPr>
-        <w:spacing w:line="360" w:lineRule="auto" w:after="120"/>
-      </w:pPr>
-      <w:r>
-        <w:rPr>
-          <w:b w:val="0"/>
-          <w:i/>
-        </w:rPr>
-        <w:t>[Chèn sơ đồ: Sơ đồ 25: 6.3 Hướng phát triển lên Sepolia]</w:t>
-      </w:r>
-    </w:p>
-    <w:p>
-      <w:pPr>
-        <w:pStyle w:val="Heading1"/>
-        <w:spacing w:line="360" w:lineRule="auto" w:after="120"/>
-      </w:pPr>
-      <w:r>
-        <w:t>CHƯƠNG 7. KẾT LUẬN</w:t>
-      </w:r>
-    </w:p>
-    <w:p>
-      <w:pPr>
         <w:pStyle w:val="Heading2"/>
-        <w:spacing w:line="360" w:lineRule="auto" w:after="120"/>
+        <w:spacing w:line="360" w:lineRule="auto" w:after="60"/>
       </w:pPr>
       <w:r>
         <w:t>7.1 Kết quả đạt được</w:t>
@@ -2206,68 +2131,68 @@
     </w:p>
     <w:p>
       <w:pPr>
-        <w:spacing w:line="360" w:lineRule="auto" w:after="120"/>
+        <w:spacing w:line="360" w:lineRule="auto" w:before="0" w:after="0"/>
+        <w:jc w:val="left"/>
       </w:pPr>
       <w:r>
         <w:rPr>
+          <w:rFonts w:ascii="Times New Roman" w:hAnsi="Times New Roman" w:eastAsia="Times New Roman"/>
           <w:b w:val="0"/>
           <w:i w:val="0"/>
+          <w:sz w:val="26"/>
         </w:rPr>
-        <w:t>Tổng kết mục tiêu đã hoàn thành.</w:t>
+        <w:t>Nội dung chi tiết: ............................................................................................</w:t>
       </w:r>
     </w:p>
     <w:p>
       <w:pPr>
-        <w:spacing w:line="360" w:lineRule="auto" w:after="120"/>
+        <w:spacing w:line="360" w:lineRule="auto" w:before="0" w:after="0"/>
+        <w:jc w:val="left"/>
       </w:pPr>
       <w:r>
         <w:rPr>
+          <w:rFonts w:ascii="Times New Roman" w:hAnsi="Times New Roman" w:eastAsia="Times New Roman"/>
           <w:b w:val="0"/>
           <w:i/>
+          <w:sz w:val="26"/>
         </w:rPr>
-        <w:t>[Chèn hình: Hình 26: 7.1 Kết quả đạt được]</w:t>
+        <w:t>[Chèn hình 26: 7.1 Kết quả đạt được]</w:t>
       </w:r>
     </w:p>
     <w:p>
       <w:pPr>
-        <w:spacing w:line="360" w:lineRule="auto" w:after="120"/>
+        <w:spacing w:line="360" w:lineRule="auto" w:before="0" w:after="0"/>
+        <w:jc w:val="left"/>
       </w:pPr>
       <w:r>
         <w:rPr>
+          <w:rFonts w:ascii="Times New Roman" w:hAnsi="Times New Roman" w:eastAsia="Times New Roman"/>
           <w:b w:val="0"/>
           <w:i/>
+          <w:sz w:val="26"/>
         </w:rPr>
-        <w:t>[Mô tả hình: ............................................................]</w:t>
+        <w:t>[Chèn bảng 26: 7.1 Kết quả đạt được]</w:t>
       </w:r>
     </w:p>
     <w:p>
       <w:pPr>
-        <w:spacing w:line="360" w:lineRule="auto" w:after="120"/>
+        <w:spacing w:line="360" w:lineRule="auto" w:before="0" w:after="0"/>
+        <w:jc w:val="left"/>
       </w:pPr>
       <w:r>
         <w:rPr>
+          <w:rFonts w:ascii="Times New Roman" w:hAnsi="Times New Roman" w:eastAsia="Times New Roman"/>
           <w:b w:val="0"/>
           <w:i/>
+          <w:sz w:val="26"/>
         </w:rPr>
-        <w:t>[Chèn bảng: Bảng 26: 7.1 Kết quả đạt được]</w:t>
+        <w:t>[Chèn sơ đồ 26: 7.1 Kết quả đạt được]</w:t>
       </w:r>
     </w:p>
     <w:p>
       <w:pPr>
-        <w:spacing w:line="360" w:lineRule="auto" w:after="120"/>
-      </w:pPr>
-      <w:r>
-        <w:rPr>
-          <w:b w:val="0"/>
-          <w:i/>
-        </w:rPr>
-        <w:t>[Chèn sơ đồ: Sơ đồ 26: 7.1 Kết quả đạt được]</w:t>
-      </w:r>
-    </w:p>
-    <w:p>
-      <w:pPr>
         <w:pStyle w:val="Heading2"/>
-        <w:spacing w:line="360" w:lineRule="auto" w:after="120"/>
+        <w:spacing w:line="360" w:lineRule="auto" w:after="60"/>
       </w:pPr>
       <w:r>
         <w:t>7.2 Đóng góp</w:t>
@@ -2275,68 +2200,68 @@
     </w:p>
     <w:p>
       <w:pPr>
-        <w:spacing w:line="360" w:lineRule="auto" w:after="120"/>
+        <w:spacing w:line="360" w:lineRule="auto" w:before="0" w:after="0"/>
+        <w:jc w:val="left"/>
       </w:pPr>
       <w:r>
         <w:rPr>
+          <w:rFonts w:ascii="Times New Roman" w:hAnsi="Times New Roman" w:eastAsia="Times New Roman"/>
           <w:b w:val="0"/>
           <w:i w:val="0"/>
+          <w:sz w:val="26"/>
         </w:rPr>
-        <w:t>Nêu giá trị học thuật và thực tiễn.</w:t>
+        <w:t>Nội dung chi tiết: ............................................................................................</w:t>
       </w:r>
     </w:p>
     <w:p>
       <w:pPr>
-        <w:spacing w:line="360" w:lineRule="auto" w:after="120"/>
+        <w:spacing w:line="360" w:lineRule="auto" w:before="0" w:after="0"/>
+        <w:jc w:val="left"/>
       </w:pPr>
       <w:r>
         <w:rPr>
+          <w:rFonts w:ascii="Times New Roman" w:hAnsi="Times New Roman" w:eastAsia="Times New Roman"/>
           <w:b w:val="0"/>
           <w:i/>
+          <w:sz w:val="26"/>
         </w:rPr>
-        <w:t>[Chèn hình: Hình 27: 7.2 Đóng góp]</w:t>
+        <w:t>[Chèn hình 27: 7.2 Đóng góp]</w:t>
       </w:r>
     </w:p>
     <w:p>
       <w:pPr>
-        <w:spacing w:line="360" w:lineRule="auto" w:after="120"/>
+        <w:spacing w:line="360" w:lineRule="auto" w:before="0" w:after="0"/>
+        <w:jc w:val="left"/>
       </w:pPr>
       <w:r>
         <w:rPr>
+          <w:rFonts w:ascii="Times New Roman" w:hAnsi="Times New Roman" w:eastAsia="Times New Roman"/>
           <w:b w:val="0"/>
           <w:i/>
+          <w:sz w:val="26"/>
         </w:rPr>
-        <w:t>[Mô tả hình: ............................................................]</w:t>
+        <w:t>[Chèn bảng 27: 7.2 Đóng góp]</w:t>
       </w:r>
     </w:p>
     <w:p>
       <w:pPr>
-        <w:spacing w:line="360" w:lineRule="auto" w:after="120"/>
+        <w:spacing w:line="360" w:lineRule="auto" w:before="0" w:after="0"/>
+        <w:jc w:val="left"/>
       </w:pPr>
       <w:r>
         <w:rPr>
+          <w:rFonts w:ascii="Times New Roman" w:hAnsi="Times New Roman" w:eastAsia="Times New Roman"/>
           <w:b w:val="0"/>
           <w:i/>
+          <w:sz w:val="26"/>
         </w:rPr>
-        <w:t>[Chèn bảng: Bảng 27: 7.2 Đóng góp]</w:t>
+        <w:t>[Chèn sơ đồ 27: 7.2 Đóng góp]</w:t>
       </w:r>
     </w:p>
     <w:p>
       <w:pPr>
-        <w:spacing w:line="360" w:lineRule="auto" w:after="120"/>
-      </w:pPr>
-      <w:r>
-        <w:rPr>
-          <w:b w:val="0"/>
-          <w:i/>
-        </w:rPr>
-        <w:t>[Chèn sơ đồ: Sơ đồ 27: 7.2 Đóng góp]</w:t>
-      </w:r>
-    </w:p>
-    <w:p>
-      <w:pPr>
         <w:pStyle w:val="Heading2"/>
-        <w:spacing w:line="360" w:lineRule="auto" w:after="120"/>
+        <w:spacing w:line="360" w:lineRule="auto" w:after="60"/>
       </w:pPr>
       <w:r>
         <w:t>7.3 Đề xuất mở rộng</w:t>
@@ -2344,68 +2269,68 @@
     </w:p>
     <w:p>
       <w:pPr>
-        <w:spacing w:line="360" w:lineRule="auto" w:after="120"/>
+        <w:spacing w:line="360" w:lineRule="auto" w:before="0" w:after="0"/>
+        <w:jc w:val="left"/>
       </w:pPr>
       <w:r>
         <w:rPr>
+          <w:rFonts w:ascii="Times New Roman" w:hAnsi="Times New Roman" w:eastAsia="Times New Roman"/>
           <w:b w:val="0"/>
           <w:i w:val="0"/>
+          <w:sz w:val="26"/>
         </w:rPr>
-        <w:t>Đề xuất nâng cấp kỹ thuật trong tương lai.</w:t>
+        <w:t>Nội dung chi tiết: ............................................................................................</w:t>
       </w:r>
     </w:p>
     <w:p>
       <w:pPr>
-        <w:spacing w:line="360" w:lineRule="auto" w:after="120"/>
+        <w:spacing w:line="360" w:lineRule="auto" w:before="0" w:after="0"/>
+        <w:jc w:val="left"/>
       </w:pPr>
       <w:r>
         <w:rPr>
+          <w:rFonts w:ascii="Times New Roman" w:hAnsi="Times New Roman" w:eastAsia="Times New Roman"/>
           <w:b w:val="0"/>
           <w:i/>
+          <w:sz w:val="26"/>
         </w:rPr>
-        <w:t>[Chèn hình: Hình 28: 7.3 Đề xuất mở rộng]</w:t>
+        <w:t>[Chèn hình 28: 7.3 Đề xuất mở rộng]</w:t>
       </w:r>
     </w:p>
     <w:p>
       <w:pPr>
-        <w:spacing w:line="360" w:lineRule="auto" w:after="120"/>
+        <w:spacing w:line="360" w:lineRule="auto" w:before="0" w:after="0"/>
+        <w:jc w:val="left"/>
       </w:pPr>
       <w:r>
         <w:rPr>
+          <w:rFonts w:ascii="Times New Roman" w:hAnsi="Times New Roman" w:eastAsia="Times New Roman"/>
           <w:b w:val="0"/>
           <w:i/>
+          <w:sz w:val="26"/>
         </w:rPr>
-        <w:t>[Mô tả hình: ............................................................]</w:t>
+        <w:t>[Chèn bảng 28: 7.3 Đề xuất mở rộng]</w:t>
       </w:r>
     </w:p>
     <w:p>
       <w:pPr>
-        <w:spacing w:line="360" w:lineRule="auto" w:after="120"/>
+        <w:spacing w:line="360" w:lineRule="auto" w:before="0" w:after="0"/>
+        <w:jc w:val="left"/>
       </w:pPr>
       <w:r>
         <w:rPr>
+          <w:rFonts w:ascii="Times New Roman" w:hAnsi="Times New Roman" w:eastAsia="Times New Roman"/>
           <w:b w:val="0"/>
           <w:i/>
+          <w:sz w:val="26"/>
         </w:rPr>
-        <w:t>[Chèn bảng: Bảng 28: 7.3 Đề xuất mở rộng]</w:t>
+        <w:t>[Chèn sơ đồ 28: 7.3 Đề xuất mở rộng]</w:t>
       </w:r>
     </w:p>
     <w:p>
       <w:pPr>
-        <w:spacing w:line="360" w:lineRule="auto" w:after="120"/>
-      </w:pPr>
-      <w:r>
-        <w:rPr>
-          <w:b w:val="0"/>
-          <w:i/>
-        </w:rPr>
-        <w:t>[Chèn sơ đồ: Sơ đồ 28: 7.3 Đề xuất mở rộng]</w:t>
-      </w:r>
-    </w:p>
-    <w:p>
-      <w:pPr>
         <w:pStyle w:val="Heading1"/>
-        <w:spacing w:line="360" w:lineRule="auto" w:after="120"/>
+        <w:spacing w:line="360" w:lineRule="auto" w:after="60"/>
       </w:pPr>
       <w:r>
         <w:t>PHỤ LỤC</w:t>
@@ -2413,44 +2338,53 @@
     </w:p>
     <w:p>
       <w:pPr>
-        <w:spacing w:line="360" w:lineRule="auto" w:after="120"/>
+        <w:spacing w:line="360" w:lineRule="auto" w:before="0" w:after="0"/>
+        <w:jc w:val="left"/>
       </w:pPr>
       <w:r>
         <w:rPr>
+          <w:rFonts w:ascii="Times New Roman" w:hAnsi="Times New Roman" w:eastAsia="Times New Roman"/>
           <w:b w:val="0"/>
           <w:i w:val="0"/>
+          <w:sz w:val="28"/>
         </w:rPr>
-        <w:t>Phụ lục A: Danh sách API và mẫu request/response.</w:t>
+        <w:t>Phụ lục A: Mẫu API, request/response.</w:t>
       </w:r>
     </w:p>
     <w:p>
       <w:pPr>
-        <w:spacing w:line="360" w:lineRule="auto" w:after="120"/>
+        <w:spacing w:line="360" w:lineRule="auto" w:before="0" w:after="0"/>
+        <w:jc w:val="left"/>
       </w:pPr>
       <w:r>
         <w:rPr>
+          <w:rFonts w:ascii="Times New Roman" w:hAnsi="Times New Roman" w:eastAsia="Times New Roman"/>
           <w:b w:val="0"/>
           <w:i w:val="0"/>
+          <w:sz w:val="28"/>
         </w:rPr>
-        <w:t>Phụ lục B: Danh sách hàm Smart Contract và điều kiện kiểm tra.</w:t>
+        <w:t>Phụ lục B: Danh sách hàm Smart Contract.</w:t>
       </w:r>
     </w:p>
     <w:p>
       <w:pPr>
-        <w:spacing w:line="360" w:lineRule="auto" w:after="120"/>
+        <w:spacing w:line="360" w:lineRule="auto" w:before="0" w:after="0"/>
+        <w:jc w:val="left"/>
       </w:pPr>
       <w:r>
         <w:rPr>
+          <w:rFonts w:ascii="Times New Roman" w:hAnsi="Times New Roman" w:eastAsia="Times New Roman"/>
           <w:b w:val="0"/>
           <w:i w:val="0"/>
+          <w:sz w:val="28"/>
         </w:rPr>
-        <w:t>Phụ lục C: Ảnh chụp màn hình giao diện và giao dịch thực tế.</w:t>
+        <w:t>Phụ lục C: Ảnh chụp màn hình giao diện và giao dịch.</w:t>
       </w:r>
     </w:p>
     <w:p>
       <w:pPr>
         <w:pStyle w:val="Heading1"/>
-        <w:spacing w:line="360" w:lineRule="auto" w:after="120"/>
+        <w:spacing w:line="360" w:lineRule="auto" w:after="60"/>
       </w:pPr>
       <w:r>
         <w:t>TÀI LIỆU THAM KHẢO</w:t>
@@ -2458,62 +2392,62 @@
     </w:p>
     <w:p>
       <w:pPr>
-        <w:spacing w:line="360" w:lineRule="auto" w:after="120"/>
+        <w:spacing w:line="360" w:lineRule="auto" w:before="0" w:after="0"/>
+        <w:jc w:val="left"/>
       </w:pPr>
       <w:r>
         <w:rPr>
+          <w:rFonts w:ascii="Times New Roman" w:hAnsi="Times New Roman" w:eastAsia="Times New Roman"/>
           <w:b w:val="0"/>
           <w:i w:val="0"/>
+          <w:sz w:val="28"/>
         </w:rPr>
         <w:t>Ethereum Documentation</w:t>
       </w:r>
     </w:p>
     <w:p>
       <w:pPr>
-        <w:spacing w:line="360" w:lineRule="auto" w:after="120"/>
+        <w:spacing w:line="360" w:lineRule="auto" w:before="0" w:after="0"/>
+        <w:jc w:val="left"/>
       </w:pPr>
       <w:r>
         <w:rPr>
+          <w:rFonts w:ascii="Times New Roman" w:hAnsi="Times New Roman" w:eastAsia="Times New Roman"/>
           <w:b w:val="0"/>
           <w:i w:val="0"/>
+          <w:sz w:val="28"/>
         </w:rPr>
         <w:t>Hardhat Documentation</w:t>
       </w:r>
     </w:p>
     <w:p>
       <w:pPr>
-        <w:spacing w:line="360" w:lineRule="auto" w:after="120"/>
+        <w:spacing w:line="360" w:lineRule="auto" w:before="0" w:after="0"/>
+        <w:jc w:val="left"/>
       </w:pPr>
       <w:r>
         <w:rPr>
+          <w:rFonts w:ascii="Times New Roman" w:hAnsi="Times New Roman" w:eastAsia="Times New Roman"/>
           <w:b w:val="0"/>
           <w:i w:val="0"/>
+          <w:sz w:val="28"/>
         </w:rPr>
-        <w:t>MetaMask Developer Docs</w:t>
+        <w:t>MetaMask Developer Documentation</w:t>
       </w:r>
     </w:p>
     <w:p>
       <w:pPr>
-        <w:spacing w:line="360" w:lineRule="auto" w:after="120"/>
+        <w:spacing w:line="360" w:lineRule="auto" w:before="0" w:after="0"/>
+        <w:jc w:val="left"/>
       </w:pPr>
       <w:r>
         <w:rPr>
+          <w:rFonts w:ascii="Times New Roman" w:hAnsi="Times New Roman" w:eastAsia="Times New Roman"/>
           <w:b w:val="0"/>
           <w:i w:val="0"/>
+          <w:sz w:val="28"/>
         </w:rPr>
         <w:t>Solidity Documentation</w:t>
-      </w:r>
-    </w:p>
-    <w:p>
-      <w:pPr>
-        <w:spacing w:line="360" w:lineRule="auto" w:after="120"/>
-      </w:pPr>
-      <w:r>
-        <w:rPr>
-          <w:b w:val="0"/>
-          <w:i w:val="0"/>
-        </w:rPr>
-        <w:t>Microsoft Azure Documentation</w:t>
       </w:r>
     </w:p>
     <w:sectPr>
@@ -2522,10 +2456,10 @@
       <w:cols w:space="720"/>
       <w:docGrid w:linePitch="360"/>
       <w:pgBorders w:offsetFrom="page">
-        <w:top w:val="single" w:sz="18" w:space="24" w:color="000000"/>
-        <w:left w:val="single" w:sz="18" w:space="24" w:color="000000"/>
-        <w:bottom w:val="single" w:sz="18" w:space="24" w:color="000000"/>
-        <w:right w:val="single" w:sz="18" w:space="24" w:color="000000"/>
+        <w:top w:val="single" w:sz="12" w:space="24" w:color="000000"/>
+        <w:left w:val="single" w:sz="12" w:space="24" w:color="000000"/>
+        <w:bottom w:val="single" w:sz="12" w:space="24" w:color="000000"/>
+        <w:right w:val="single" w:sz="12" w:space="24" w:color="000000"/>
       </w:pgBorders>
     </w:sectPr>
   </w:body>
@@ -2897,7 +2831,7 @@
     <w:rsid w:val="00FC693F"/>
     <w:rPr>
       <w:rFonts w:ascii="Times New Roman" w:hAnsi="Times New Roman" w:eastAsia="Times New Roman"/>
-      <w:sz w:val="26"/>
+      <w:sz w:val="28"/>
     </w:rPr>
   </w:style>
   <w:style w:type="paragraph" w:styleId="Header">
@@ -2963,7 +2897,7 @@
       <w:b/>
       <w:bCs/>
       <w:color w:val="365F91" w:themeColor="accent1" w:themeShade="BF"/>
-      <w:sz w:val="26"/>
+      <w:sz w:val="28"/>
       <w:szCs w:val="28"/>
     </w:rPr>
   </w:style>

</xml_diff>

<commit_message>
Rebuild report from outline and keep border only on cover
Agent-Logs-Url: https://github.com/TanQui-Ovnatiuq/BlockChain/sessions/f29dae9d-6771-405e-a81d-876db4d0d3c8

Co-authored-by: TanQui-Ovnatiuq <253677590+TanQui-Ovnatiuq@users.noreply.github.com>
</commit_message>
<xml_diff>
--- a/BAOCAO_DAPP_DAT_SAN_20042026.docx
+++ b/BAOCAO_DAPP_DAT_SAN_20042026.docx
@@ -4,7 +4,7 @@
   <w:body>
     <w:p>
       <w:pPr>
-        <w:spacing w:line="360" w:lineRule="auto" w:before="240" w:after="0"/>
+        <w:spacing w:before="0" w:after="60" w:line="360" w:lineRule="auto"/>
         <w:jc w:val="center"/>
       </w:pPr>
       <w:r>
@@ -19,7 +19,7 @@
     </w:p>
     <w:p>
       <w:pPr>
-        <w:spacing w:line="360" w:lineRule="auto" w:before="0" w:after="0"/>
+        <w:spacing w:before="0" w:after="60" w:line="360" w:lineRule="auto"/>
         <w:jc w:val="center"/>
       </w:pPr>
       <w:r>
@@ -34,7 +34,7 @@
     </w:p>
     <w:p>
       <w:pPr>
-        <w:spacing w:line="360" w:lineRule="auto" w:before="80" w:after="120"/>
+        <w:spacing w:before="0" w:after="60" w:line="360" w:lineRule="auto"/>
         <w:jc w:val="center"/>
       </w:pPr>
       <w:r>
@@ -74,7 +74,7 @@
     </w:p>
     <w:p>
       <w:pPr>
-        <w:spacing w:line="360" w:lineRule="auto" w:before="0" w:after="0"/>
+        <w:spacing w:before="0" w:after="60" w:line="360" w:lineRule="auto"/>
         <w:jc w:val="center"/>
       </w:pPr>
       <w:r>
@@ -89,7 +89,7 @@
     </w:p>
     <w:p>
       <w:pPr>
-        <w:spacing w:line="360" w:lineRule="auto" w:before="0" w:after="0"/>
+        <w:spacing w:before="0" w:after="60" w:line="360" w:lineRule="auto"/>
         <w:jc w:val="center"/>
       </w:pPr>
       <w:r>
@@ -104,7 +104,7 @@
     </w:p>
     <w:p>
       <w:pPr>
-        <w:spacing w:line="360" w:lineRule="auto" w:before="0" w:after="0"/>
+        <w:spacing w:before="0" w:after="60" w:line="360" w:lineRule="auto"/>
         <w:jc w:val="center"/>
       </w:pPr>
       <w:r>
@@ -119,7 +119,7 @@
     </w:p>
     <w:p>
       <w:pPr>
-        <w:spacing w:line="360" w:lineRule="auto" w:before="0" w:after="0"/>
+        <w:spacing w:before="0" w:after="60" w:line="360" w:lineRule="auto"/>
         <w:jc w:val="center"/>
       </w:pPr>
       <w:r>
@@ -134,7 +134,7 @@
     </w:p>
     <w:p>
       <w:pPr>
-        <w:spacing w:line="360" w:lineRule="auto" w:before="0" w:after="0"/>
+        <w:spacing w:before="0" w:after="60" w:line="360" w:lineRule="auto"/>
         <w:jc w:val="center"/>
       </w:pPr>
       <w:r>
@@ -149,7 +149,7 @@
     </w:p>
     <w:p>
       <w:pPr>
-        <w:spacing w:line="360" w:lineRule="auto" w:before="0" w:after="520"/>
+        <w:spacing w:before="0" w:after="60" w:line="360" w:lineRule="auto"/>
         <w:jc w:val="left"/>
       </w:pPr>
       <w:r>
@@ -163,7 +163,7 @@
     </w:p>
     <w:p>
       <w:pPr>
-        <w:spacing w:line="360" w:lineRule="auto" w:before="0" w:after="0"/>
+        <w:spacing w:before="0" w:after="60" w:line="360" w:lineRule="auto"/>
         <w:jc w:val="center"/>
       </w:pPr>
       <w:r>
@@ -178,7 +178,7 @@
     </w:p>
     <w:p>
       <w:pPr>
-        <w:spacing w:line="360" w:lineRule="auto" w:before="0" w:after="0"/>
+        <w:spacing w:before="0" w:after="60" w:line="360" w:lineRule="auto"/>
         <w:jc w:val="center"/>
       </w:pPr>
       <w:r>
@@ -193,7 +193,7 @@
     </w:p>
     <w:p>
       <w:pPr>
-        <w:spacing w:line="360" w:lineRule="auto" w:before="0" w:after="1160"/>
+        <w:spacing w:before="0" w:after="60" w:line="360" w:lineRule="auto"/>
         <w:jc w:val="left"/>
       </w:pPr>
       <w:r>
@@ -207,7 +207,7 @@
     </w:p>
     <w:p>
       <w:pPr>
-        <w:spacing w:line="360" w:lineRule="auto" w:before="0" w:after="0"/>
+        <w:spacing w:before="0" w:after="60" w:line="360" w:lineRule="auto"/>
         <w:jc w:val="center"/>
       </w:pPr>
       <w:r>
@@ -222,7 +222,7 @@
     </w:p>
     <w:p>
       <w:pPr>
-        <w:spacing w:line="360" w:lineRule="auto" w:before="0" w:after="0"/>
+        <w:spacing w:before="0" w:after="60" w:line="360" w:lineRule="auto"/>
         <w:jc w:val="center"/>
       </w:pPr>
       <w:r>
@@ -237,7 +237,7 @@
     </w:p>
     <w:p>
       <w:pPr>
-        <w:spacing w:line="360" w:lineRule="auto" w:before="0" w:after="0"/>
+        <w:spacing w:before="0" w:after="60" w:line="360" w:lineRule="auto"/>
         <w:jc w:val="center"/>
       </w:pPr>
       <w:r>
@@ -252,7 +252,7 @@
     </w:p>
     <w:p>
       <w:pPr>
-        <w:spacing w:line="360" w:lineRule="auto" w:before="400" w:after="0"/>
+        <w:spacing w:before="0" w:after="60" w:line="360" w:lineRule="auto"/>
         <w:jc w:val="right"/>
       </w:pPr>
       <w:r>
@@ -267,16 +267,26 @@
     </w:p>
     <w:p>
       <w:pPr>
-        <w:spacing w:line="360" w:lineRule="auto"/>
-      </w:pPr>
-      <w:r>
-        <w:br w:type="page"/>
-      </w:r>
+        <w:spacing w:before="0" w:after="60"/>
+        <w:sectPr>
+          <w:pgSz w:w="12240" w:h="15840"/>
+          <w:pgMar w:top="1134" w:right="1417" w:bottom="1134" w:left="1417" w:header="720" w:footer="720" w:gutter="0"/>
+          <w:cols w:space="720"/>
+          <w:docGrid w:linePitch="360"/>
+          <w:pgBorders w:offsetFrom="page">
+            <w:top w:val="single" w:sz="12" w:space="24" w:color="000000"/>
+            <w:left w:val="single" w:sz="12" w:space="24" w:color="000000"/>
+            <w:bottom w:val="single" w:sz="12" w:space="24" w:color="000000"/>
+            <w:right w:val="single" w:sz="12" w:space="24" w:color="000000"/>
+          </w:pgBorders>
+        </w:sectPr>
+      </w:pPr>
     </w:p>
     <w:p>
       <w:pPr>
         <w:pStyle w:val="Heading1"/>
-        <w:spacing w:line="360" w:lineRule="auto" w:after="60"/>
+        <w:spacing w:line="360" w:lineRule="auto" w:before="0" w:after="60"/>
+        <w:jc w:val="left"/>
       </w:pPr>
       <w:r>
         <w:t>MỤC LỤC</w:t>
@@ -284,2170 +294,1523 @@
     </w:p>
     <w:p>
       <w:pPr>
-        <w:spacing w:line="360" w:lineRule="auto"/>
+        <w:spacing w:before="0" w:after="60"/>
       </w:pPr>
       <w:r>
         <w:fldChar w:fldCharType="begin"/>
         <w:instrText xml:space="preserve">TOC \o "1-3" \h \z \u</w:instrText>
         <w:fldChar w:fldCharType="separate"/>
-        <w:t>(Cập nhật mục lục: Right click -&gt; Update Field)</w:t>
+        <w:t>(Right click mục lục -&gt; Update Field)</w:t>
         <w:fldChar w:fldCharType="end"/>
       </w:r>
     </w:p>
     <w:p>
       <w:pPr>
-        <w:spacing w:line="360" w:lineRule="auto" w:before="0" w:after="0"/>
-        <w:jc w:val="left"/>
+        <w:pStyle w:val="Heading1"/>
+        <w:spacing w:before="0" w:after="60"/>
       </w:pPr>
       <w:r>
-        <w:rPr>
-          <w:rFonts w:ascii="Times New Roman" w:hAnsi="Times New Roman" w:eastAsia="Times New Roman"/>
-          <w:b w:val="0"/>
-          <w:i w:val="0"/>
-          <w:sz w:val="28"/>
-        </w:rPr>
+        <w:t>NỘI DUNG</w:t>
       </w:r>
     </w:p>
     <w:p>
       <w:pPr>
         <w:pStyle w:val="Heading1"/>
-        <w:spacing w:line="360" w:lineRule="auto" w:after="60"/>
+        <w:spacing w:line="360" w:lineRule="auto" w:before="0" w:after="60"/>
       </w:pPr>
       <w:r>
-        <w:t>DÀN Ý CHI TIẾT</w:t>
+        <w:t>1. TỔNG QUAN HOẠT ĐỘNG HỆ THỐNG</w:t>
       </w:r>
     </w:p>
     <w:p>
       <w:pPr>
-        <w:spacing w:line="360" w:lineRule="auto" w:before="0" w:after="0"/>
-        <w:jc w:val="left"/>
+        <w:spacing w:line="360" w:lineRule="auto" w:before="0" w:after="60"/>
       </w:pPr>
       <w:r>
-        <w:rPr>
-          <w:rFonts w:ascii="Times New Roman" w:hAnsi="Times New Roman" w:eastAsia="Times New Roman"/>
-          <w:b w:val="0"/>
-          <w:i/>
-          <w:sz w:val="26"/>
-        </w:rPr>
-        <w:t>Mỗi mục bên dưới đã chừa vị trí để bạn chèn thêm hình/bảng/sơ đồ.</w:t>
+        <w:t>Hệ thống DApp đặt sân gồm 3 lớp:</w:t>
       </w:r>
     </w:p>
     <w:p>
       <w:pPr>
-        <w:pStyle w:val="Heading1"/>
-        <w:spacing w:line="360" w:lineRule="auto" w:after="60"/>
+        <w:spacing w:line="360" w:lineRule="auto" w:before="0" w:after="60"/>
       </w:pPr>
       <w:r>
-        <w:t>CHƯƠNG 1: TỔNG QUAN ĐỀ TÀI</w:t>
+        <w:t>Frontend: giao diện người dùng (web bạn gửi)</w:t>
       </w:r>
     </w:p>
     <w:p>
       <w:pPr>
-        <w:pStyle w:val="Heading2"/>
-        <w:spacing w:line="360" w:lineRule="auto" w:after="60"/>
+        <w:spacing w:line="360" w:lineRule="auto" w:before="0" w:after="60"/>
       </w:pPr>
       <w:r>
-        <w:t>1.1 Bối cảnh và lý do chọn đề tài</w:t>
+        <w:t>Backend: xử lý logic, API</w:t>
       </w:r>
     </w:p>
     <w:p>
       <w:pPr>
-        <w:spacing w:line="360" w:lineRule="auto" w:before="0" w:after="0"/>
-        <w:jc w:val="left"/>
+        <w:spacing w:line="360" w:lineRule="auto" w:before="0" w:after="60"/>
       </w:pPr>
       <w:r>
-        <w:rPr>
-          <w:rFonts w:ascii="Times New Roman" w:hAnsi="Times New Roman" w:eastAsia="Times New Roman"/>
-          <w:b w:val="0"/>
-          <w:i w:val="0"/>
-          <w:sz w:val="26"/>
-        </w:rPr>
-        <w:t>Nội dung chi tiết: ............................................................................................</w:t>
+        <w:t>Blockchain (Hardhat): xử lý giao dịch ETH và trạng thái sân</w:t>
       </w:r>
     </w:p>
     <w:p>
       <w:pPr>
-        <w:spacing w:line="360" w:lineRule="auto" w:before="0" w:after="0"/>
-        <w:jc w:val="left"/>
+        <w:spacing w:line="360" w:lineRule="auto" w:before="0" w:after="60"/>
       </w:pPr>
       <w:r>
-        <w:rPr>
-          <w:rFonts w:ascii="Times New Roman" w:hAnsi="Times New Roman" w:eastAsia="Times New Roman"/>
-          <w:b w:val="0"/>
-          <w:i/>
-          <w:sz w:val="26"/>
-        </w:rPr>
-        <w:t>[Chèn hình 1: 1.1 Bối cảnh và lý do chọn đề tài]</w:t>
+        <w:t>Toàn bộ hệ thống xoay quanh:</w:t>
       </w:r>
     </w:p>
     <w:p>
       <w:pPr>
-        <w:spacing w:line="360" w:lineRule="auto" w:before="0" w:after="0"/>
-        <w:jc w:val="left"/>
+        <w:spacing w:line="360" w:lineRule="auto" w:before="0" w:after="60"/>
       </w:pPr>
       <w:r>
-        <w:rPr>
-          <w:rFonts w:ascii="Times New Roman" w:hAnsi="Times New Roman" w:eastAsia="Times New Roman"/>
-          <w:b w:val="0"/>
-          <w:i/>
-          <w:sz w:val="26"/>
-        </w:rPr>
-        <w:t>[Chèn bảng 1: 1.1 Bối cảnh và lý do chọn đề tài]</w:t>
+        <w:t>Wallet (MetaMask)</w:t>
       </w:r>
     </w:p>
     <w:p>
       <w:pPr>
-        <w:spacing w:line="360" w:lineRule="auto" w:before="0" w:after="0"/>
-        <w:jc w:val="left"/>
+        <w:spacing w:line="360" w:lineRule="auto" w:before="0" w:after="60"/>
       </w:pPr>
       <w:r>
-        <w:rPr>
-          <w:rFonts w:ascii="Times New Roman" w:hAnsi="Times New Roman" w:eastAsia="Times New Roman"/>
-          <w:b w:val="0"/>
-          <w:i/>
-          <w:sz w:val="26"/>
-        </w:rPr>
-        <w:t>[Chèn sơ đồ 1: 1.1 Bối cảnh và lý do chọn đề tài]</w:t>
+        <w:t>Smart Contract (quản lý sân + đặt sân)</w:t>
       </w:r>
     </w:p>
     <w:p>
       <w:pPr>
-        <w:pStyle w:val="Heading2"/>
-        <w:spacing w:line="360" w:lineRule="auto" w:after="60"/>
+        <w:pStyle w:val="Heading1"/>
+        <w:spacing w:line="360" w:lineRule="auto" w:before="0" w:after="60"/>
       </w:pPr>
       <w:r>
-        <w:t>1.2 Mục tiêu nghiên cứu</w:t>
+        <w:t>2. LOGIC USER (NGƯỜI DÙNG)</w:t>
       </w:r>
     </w:p>
     <w:p>
       <w:pPr>
-        <w:spacing w:line="360" w:lineRule="auto" w:before="0" w:after="0"/>
-        <w:jc w:val="left"/>
+        <w:pStyle w:val="Heading2"/>
+        <w:spacing w:line="360" w:lineRule="auto" w:before="0" w:after="60"/>
       </w:pPr>
       <w:r>
-        <w:rPr>
-          <w:rFonts w:ascii="Times New Roman" w:hAnsi="Times New Roman" w:eastAsia="Times New Roman"/>
-          <w:b w:val="0"/>
-          <w:i w:val="0"/>
-          <w:sz w:val="26"/>
-        </w:rPr>
-        <w:t>Nội dung chi tiết: ............................................................................................</w:t>
+        <w:t>2.1 Kết nối ví MetaMask</w:t>
       </w:r>
     </w:p>
     <w:p>
       <w:pPr>
-        <w:spacing w:line="360" w:lineRule="auto" w:before="0" w:after="0"/>
-        <w:jc w:val="left"/>
+        <w:spacing w:line="360" w:lineRule="auto" w:before="0" w:after="60"/>
       </w:pPr>
       <w:r>
-        <w:rPr>
-          <w:rFonts w:ascii="Times New Roman" w:hAnsi="Times New Roman" w:eastAsia="Times New Roman"/>
-          <w:b w:val="0"/>
-          <w:i/>
-          <w:sz w:val="26"/>
-        </w:rPr>
-        <w:t>[Chèn hình 2: 1.2 Mục tiêu nghiên cứu]</w:t>
+        <w:t>Luồng:</w:t>
       </w:r>
     </w:p>
     <w:p>
       <w:pPr>
-        <w:spacing w:line="360" w:lineRule="auto" w:before="0" w:after="0"/>
-        <w:jc w:val="left"/>
+        <w:spacing w:line="360" w:lineRule="auto" w:before="0" w:after="60"/>
       </w:pPr>
       <w:r>
-        <w:rPr>
-          <w:rFonts w:ascii="Times New Roman" w:hAnsi="Times New Roman" w:eastAsia="Times New Roman"/>
-          <w:b w:val="0"/>
-          <w:i/>
-          <w:sz w:val="26"/>
-        </w:rPr>
-        <w:t>[Chèn bảng 2: 1.2 Mục tiêu nghiên cứu]</w:t>
+        <w:t>User truy cập web</w:t>
       </w:r>
     </w:p>
     <w:p>
       <w:pPr>
-        <w:spacing w:line="360" w:lineRule="auto" w:before="0" w:after="0"/>
-        <w:jc w:val="left"/>
+        <w:spacing w:line="360" w:lineRule="auto" w:before="0" w:after="60"/>
       </w:pPr>
       <w:r>
-        <w:rPr>
-          <w:rFonts w:ascii="Times New Roman" w:hAnsi="Times New Roman" w:eastAsia="Times New Roman"/>
-          <w:b w:val="0"/>
-          <w:i/>
-          <w:sz w:val="26"/>
-        </w:rPr>
-        <w:t>[Chèn sơ đồ 2: 1.2 Mục tiêu nghiên cứu]</w:t>
+        <w:t>Nhấn "Connect Wallet"</w:t>
       </w:r>
     </w:p>
     <w:p>
       <w:pPr>
-        <w:pStyle w:val="Heading2"/>
-        <w:spacing w:line="360" w:lineRule="auto" w:after="60"/>
+        <w:spacing w:line="360" w:lineRule="auto" w:before="0" w:after="60"/>
       </w:pPr>
       <w:r>
-        <w:t>1.3 Phạm vi và giới hạn</w:t>
+        <w:t>MetaMask popup → user xác nhận</w:t>
       </w:r>
     </w:p>
     <w:p>
       <w:pPr>
-        <w:spacing w:line="360" w:lineRule="auto" w:before="0" w:after="0"/>
-        <w:jc w:val="left"/>
+        <w:spacing w:line="360" w:lineRule="auto" w:before="0" w:after="60"/>
       </w:pPr>
       <w:r>
-        <w:rPr>
-          <w:rFonts w:ascii="Times New Roman" w:hAnsi="Times New Roman" w:eastAsia="Times New Roman"/>
-          <w:b w:val="0"/>
-          <w:i w:val="0"/>
-          <w:sz w:val="26"/>
-        </w:rPr>
-        <w:t>Nội dung chi tiết: ............................................................................................</w:t>
+        <w:t>Frontend nhận:</w:t>
       </w:r>
     </w:p>
     <w:p>
       <w:pPr>
-        <w:spacing w:line="360" w:lineRule="auto" w:before="0" w:after="0"/>
-        <w:jc w:val="left"/>
+        <w:spacing w:line="360" w:lineRule="auto" w:before="0" w:after="60"/>
       </w:pPr>
       <w:r>
-        <w:rPr>
-          <w:rFonts w:ascii="Times New Roman" w:hAnsi="Times New Roman" w:eastAsia="Times New Roman"/>
-          <w:b w:val="0"/>
-          <w:i/>
-          <w:sz w:val="26"/>
-        </w:rPr>
-        <w:t>[Chèn hình 3: 1.3 Phạm vi và giới hạn]</w:t>
+        <w:t>wallet address</w:t>
       </w:r>
     </w:p>
     <w:p>
       <w:pPr>
-        <w:spacing w:line="360" w:lineRule="auto" w:before="0" w:after="0"/>
-        <w:jc w:val="left"/>
+        <w:spacing w:line="360" w:lineRule="auto" w:before="0" w:after="60"/>
       </w:pPr>
       <w:r>
-        <w:rPr>
-          <w:rFonts w:ascii="Times New Roman" w:hAnsi="Times New Roman" w:eastAsia="Times New Roman"/>
-          <w:b w:val="0"/>
-          <w:i/>
-          <w:sz w:val="26"/>
-        </w:rPr>
-        <w:t>[Chèn bảng 3: 1.3 Phạm vi và giới hạn]</w:t>
+        <w:t>Lưu vào state hệ thống</w:t>
       </w:r>
     </w:p>
     <w:p>
       <w:pPr>
-        <w:spacing w:line="360" w:lineRule="auto" w:before="0" w:after="0"/>
-        <w:jc w:val="left"/>
+        <w:spacing w:line="360" w:lineRule="auto" w:before="0" w:after="60"/>
       </w:pPr>
       <w:r>
-        <w:rPr>
-          <w:rFonts w:ascii="Times New Roman" w:hAnsi="Times New Roman" w:eastAsia="Times New Roman"/>
-          <w:b w:val="0"/>
-          <w:i/>
-          <w:sz w:val="26"/>
-        </w:rPr>
-        <w:t>[Chèn sơ đồ 3: 1.3 Phạm vi và giới hạn]</w:t>
+        <w:t>Đây là:</w:t>
       </w:r>
     </w:p>
     <w:p>
       <w:pPr>
-        <w:pStyle w:val="Heading2"/>
-        <w:spacing w:line="360" w:lineRule="auto" w:after="60"/>
+        <w:spacing w:line="360" w:lineRule="auto" w:before="0" w:after="60"/>
       </w:pPr>
       <w:r>
-        <w:t>1.4 Phương pháp thực hiện</w:t>
+        <w:t>Authentication phi tập trung (không cần username/password)</w:t>
       </w:r>
     </w:p>
     <w:p>
       <w:pPr>
-        <w:spacing w:line="360" w:lineRule="auto" w:before="0" w:after="0"/>
-        <w:jc w:val="left"/>
+        <w:pStyle w:val="Heading2"/>
+        <w:spacing w:line="360" w:lineRule="auto" w:before="0" w:after="60"/>
       </w:pPr>
       <w:r>
-        <w:rPr>
-          <w:rFonts w:ascii="Times New Roman" w:hAnsi="Times New Roman" w:eastAsia="Times New Roman"/>
-          <w:b w:val="0"/>
-          <w:i w:val="0"/>
-          <w:sz w:val="26"/>
-        </w:rPr>
-        <w:t>Nội dung chi tiết: ............................................................................................</w:t>
+        <w:t>2.2 Xem danh sách sân</w:t>
       </w:r>
     </w:p>
     <w:p>
       <w:pPr>
-        <w:spacing w:line="360" w:lineRule="auto" w:before="0" w:after="0"/>
-        <w:jc w:val="left"/>
+        <w:spacing w:line="360" w:lineRule="auto" w:before="0" w:after="60"/>
       </w:pPr>
       <w:r>
-        <w:rPr>
-          <w:rFonts w:ascii="Times New Roman" w:hAnsi="Times New Roman" w:eastAsia="Times New Roman"/>
-          <w:b w:val="0"/>
-          <w:i/>
-          <w:sz w:val="26"/>
-        </w:rPr>
-        <w:t>[Chèn hình 4: 1.4 Phương pháp thực hiện]</w:t>
+        <w:t>Frontend gọi API hoặc Smart Contract</w:t>
       </w:r>
     </w:p>
     <w:p>
       <w:pPr>
-        <w:spacing w:line="360" w:lineRule="auto" w:before="0" w:after="0"/>
-        <w:jc w:val="left"/>
+        <w:spacing w:line="360" w:lineRule="auto" w:before="0" w:after="60"/>
       </w:pPr>
       <w:r>
-        <w:rPr>
-          <w:rFonts w:ascii="Times New Roman" w:hAnsi="Times New Roman" w:eastAsia="Times New Roman"/>
-          <w:b w:val="0"/>
-          <w:i/>
-          <w:sz w:val="26"/>
-        </w:rPr>
-        <w:t>[Chèn bảng 4: 1.4 Phương pháp thực hiện]</w:t>
+        <w:t>Lấy:</w:t>
       </w:r>
     </w:p>
     <w:p>
       <w:pPr>
-        <w:spacing w:line="360" w:lineRule="auto" w:before="0" w:after="0"/>
-        <w:jc w:val="left"/>
+        <w:spacing w:line="360" w:lineRule="auto" w:before="0" w:after="60"/>
       </w:pPr>
       <w:r>
-        <w:rPr>
-          <w:rFonts w:ascii="Times New Roman" w:hAnsi="Times New Roman" w:eastAsia="Times New Roman"/>
-          <w:b w:val="0"/>
-          <w:i/>
-          <w:sz w:val="26"/>
-        </w:rPr>
-        <w:t>[Chèn sơ đồ 4: 1.4 Phương pháp thực hiện]</w:t>
+        <w:t>tên sân</w:t>
       </w:r>
     </w:p>
     <w:p>
       <w:pPr>
-        <w:pStyle w:val="Heading1"/>
-        <w:spacing w:line="360" w:lineRule="auto" w:after="60"/>
+        <w:spacing w:line="360" w:lineRule="auto" w:before="0" w:after="60"/>
       </w:pPr>
       <w:r>
-        <w:t>CHƯƠNG 2: PHÂN TÍCH VÀ THIẾT KẾ HỆ THỐNG</w:t>
+        <w:t>giá</w:t>
       </w:r>
     </w:p>
     <w:p>
       <w:pPr>
-        <w:pStyle w:val="Heading2"/>
-        <w:spacing w:line="360" w:lineRule="auto" w:after="60"/>
+        <w:spacing w:line="360" w:lineRule="auto" w:before="0" w:after="60"/>
       </w:pPr>
       <w:r>
-        <w:t>2.1 Kiến trúc tổng thể Frontend-Backend-Blockchain</w:t>
+        <w:t>trạng thái (đã đặt / còn trống)</w:t>
       </w:r>
     </w:p>
     <w:p>
       <w:pPr>
-        <w:spacing w:line="360" w:lineRule="auto" w:before="0" w:after="0"/>
-        <w:jc w:val="left"/>
+        <w:spacing w:line="360" w:lineRule="auto" w:before="0" w:after="60"/>
       </w:pPr>
       <w:r>
-        <w:rPr>
-          <w:rFonts w:ascii="Times New Roman" w:hAnsi="Times New Roman" w:eastAsia="Times New Roman"/>
-          <w:b w:val="0"/>
-          <w:i w:val="0"/>
-          <w:sz w:val="26"/>
-        </w:rPr>
-        <w:t>Nội dung chi tiết: ............................................................................................</w:t>
+        <w:t>Hiển thị dạng:</w:t>
       </w:r>
     </w:p>
     <w:p>
       <w:pPr>
-        <w:spacing w:line="360" w:lineRule="auto" w:before="0" w:after="0"/>
-        <w:jc w:val="left"/>
+        <w:spacing w:line="360" w:lineRule="auto" w:before="0" w:after="60"/>
       </w:pPr>
       <w:r>
-        <w:rPr>
-          <w:rFonts w:ascii="Times New Roman" w:hAnsi="Times New Roman" w:eastAsia="Times New Roman"/>
-          <w:b w:val="0"/>
-          <w:i/>
-          <w:sz w:val="26"/>
-        </w:rPr>
-        <w:t>[Chèn hình 5: 2.1 Kiến trúc tổng thể Frontend-Backend-Blockchain]</w:t>
+        <w:t>card / table</w:t>
       </w:r>
     </w:p>
     <w:p>
       <w:pPr>
-        <w:spacing w:line="360" w:lineRule="auto" w:before="0" w:after="0"/>
-        <w:jc w:val="left"/>
+        <w:pStyle w:val="Heading2"/>
+        <w:spacing w:line="360" w:lineRule="auto" w:before="0" w:after="60"/>
       </w:pPr>
       <w:r>
-        <w:rPr>
-          <w:rFonts w:ascii="Times New Roman" w:hAnsi="Times New Roman" w:eastAsia="Times New Roman"/>
-          <w:b w:val="0"/>
-          <w:i/>
-          <w:sz w:val="26"/>
-        </w:rPr>
-        <w:t>[Chèn bảng 5: 2.1 Kiến trúc tổng thể Frontend-Backend-Blockchain]</w:t>
+        <w:t>2.3 Đặt sân (CHỨC NĂNG CHÍNH)</w:t>
       </w:r>
     </w:p>
     <w:p>
       <w:pPr>
-        <w:spacing w:line="360" w:lineRule="auto" w:before="0" w:after="0"/>
-        <w:jc w:val="left"/>
+        <w:spacing w:line="360" w:lineRule="auto" w:before="0" w:after="60"/>
       </w:pPr>
       <w:r>
-        <w:rPr>
-          <w:rFonts w:ascii="Times New Roman" w:hAnsi="Times New Roman" w:eastAsia="Times New Roman"/>
-          <w:b w:val="0"/>
-          <w:i/>
-          <w:sz w:val="26"/>
-        </w:rPr>
-        <w:t>[Chèn sơ đồ 5: 2.1 Kiến trúc tổng thể Frontend-Backend-Blockchain]</w:t>
+        <w:t>Luồng chi tiết:</w:t>
       </w:r>
     </w:p>
     <w:p>
       <w:pPr>
-        <w:pStyle w:val="Heading2"/>
-        <w:spacing w:line="360" w:lineRule="auto" w:after="60"/>
+        <w:spacing w:line="360" w:lineRule="auto" w:before="0" w:after="60"/>
       </w:pPr>
       <w:r>
-        <w:t>2.2 Luồng kết nối ví MetaMask</w:t>
+        <w:t>User chọn sân</w:t>
       </w:r>
     </w:p>
     <w:p>
       <w:pPr>
-        <w:spacing w:line="360" w:lineRule="auto" w:before="0" w:after="0"/>
-        <w:jc w:val="left"/>
+        <w:spacing w:line="360" w:lineRule="auto" w:before="0" w:after="60"/>
       </w:pPr>
       <w:r>
-        <w:rPr>
-          <w:rFonts w:ascii="Times New Roman" w:hAnsi="Times New Roman" w:eastAsia="Times New Roman"/>
-          <w:b w:val="0"/>
-          <w:i w:val="0"/>
-          <w:sz w:val="26"/>
-        </w:rPr>
-        <w:t>Nội dung chi tiết: ............................................................................................</w:t>
+        <w:t>Nhấn "Đặt sân"</w:t>
       </w:r>
     </w:p>
     <w:p>
       <w:pPr>
-        <w:spacing w:line="360" w:lineRule="auto" w:before="0" w:after="0"/>
-        <w:jc w:val="left"/>
+        <w:spacing w:line="360" w:lineRule="auto" w:before="0" w:after="60"/>
       </w:pPr>
       <w:r>
-        <w:rPr>
-          <w:rFonts w:ascii="Times New Roman" w:hAnsi="Times New Roman" w:eastAsia="Times New Roman"/>
-          <w:b w:val="0"/>
-          <w:i/>
-          <w:sz w:val="26"/>
-        </w:rPr>
-        <w:t>[Chèn hình 6: 2.2 Luồng kết nối ví MetaMask]</w:t>
+        <w:t>Frontend:</w:t>
       </w:r>
     </w:p>
     <w:p>
       <w:pPr>
-        <w:spacing w:line="360" w:lineRule="auto" w:before="0" w:after="0"/>
-        <w:jc w:val="left"/>
+        <w:spacing w:line="360" w:lineRule="auto" w:before="0" w:after="60"/>
       </w:pPr>
       <w:r>
-        <w:rPr>
-          <w:rFonts w:ascii="Times New Roman" w:hAnsi="Times New Roman" w:eastAsia="Times New Roman"/>
-          <w:b w:val="0"/>
-          <w:i/>
-          <w:sz w:val="26"/>
-        </w:rPr>
-        <w:t>[Chèn bảng 6: 2.2 Luồng kết nối ví MetaMask]</w:t>
+        <w:t>gọi MetaMask</w:t>
       </w:r>
     </w:p>
     <w:p>
       <w:pPr>
-        <w:spacing w:line="360" w:lineRule="auto" w:before="0" w:after="0"/>
-        <w:jc w:val="left"/>
+        <w:spacing w:line="360" w:lineRule="auto" w:before="0" w:after="60"/>
       </w:pPr>
       <w:r>
-        <w:rPr>
-          <w:rFonts w:ascii="Times New Roman" w:hAnsi="Times New Roman" w:eastAsia="Times New Roman"/>
-          <w:b w:val="0"/>
-          <w:i/>
-          <w:sz w:val="26"/>
-        </w:rPr>
-        <w:t>[Chèn sơ đồ 6: 2.2 Luồng kết nối ví MetaMask]</w:t>
+        <w:t>MetaMask:</w:t>
       </w:r>
     </w:p>
     <w:p>
       <w:pPr>
-        <w:pStyle w:val="Heading2"/>
-        <w:spacing w:line="360" w:lineRule="auto" w:after="60"/>
+        <w:spacing w:line="360" w:lineRule="auto" w:before="0" w:after="60"/>
       </w:pPr>
       <w:r>
-        <w:t>2.3 Luồng đặt sân và thanh toán ETH</w:t>
+        <w:t>hiển thị giao dịch</w:t>
       </w:r>
     </w:p>
     <w:p>
       <w:pPr>
-        <w:spacing w:line="360" w:lineRule="auto" w:before="0" w:after="0"/>
-        <w:jc w:val="left"/>
+        <w:spacing w:line="360" w:lineRule="auto" w:before="0" w:after="60"/>
       </w:pPr>
       <w:r>
-        <w:rPr>
-          <w:rFonts w:ascii="Times New Roman" w:hAnsi="Times New Roman" w:eastAsia="Times New Roman"/>
-          <w:b w:val="0"/>
-          <w:i w:val="0"/>
-          <w:sz w:val="26"/>
-        </w:rPr>
-        <w:t>Nội dung chi tiết: ............................................................................................</w:t>
+        <w:t>hiển thị phí (gas = 0 vì Hardhat)</w:t>
       </w:r>
     </w:p>
     <w:p>
       <w:pPr>
-        <w:spacing w:line="360" w:lineRule="auto" w:before="0" w:after="0"/>
-        <w:jc w:val="left"/>
+        <w:spacing w:line="360" w:lineRule="auto" w:before="0" w:after="60"/>
       </w:pPr>
       <w:r>
-        <w:rPr>
-          <w:rFonts w:ascii="Times New Roman" w:hAnsi="Times New Roman" w:eastAsia="Times New Roman"/>
-          <w:b w:val="0"/>
-          <w:i/>
-          <w:sz w:val="26"/>
-        </w:rPr>
-        <w:t>[Chèn hình 7: 2.3 Luồng đặt sân và thanh toán ETH]</w:t>
+        <w:t>User xác nhận</w:t>
       </w:r>
     </w:p>
     <w:p>
       <w:pPr>
-        <w:spacing w:line="360" w:lineRule="auto" w:before="0" w:after="0"/>
-        <w:jc w:val="left"/>
+        <w:spacing w:line="360" w:lineRule="auto" w:before="0" w:after="60"/>
       </w:pPr>
       <w:r>
-        <w:rPr>
-          <w:rFonts w:ascii="Times New Roman" w:hAnsi="Times New Roman" w:eastAsia="Times New Roman"/>
-          <w:b w:val="0"/>
-          <w:i/>
-          <w:sz w:val="26"/>
-        </w:rPr>
-        <w:t>[Chèn bảng 7: 2.3 Luồng đặt sân và thanh toán ETH]</w:t>
+        <w:t>Smart Contract:</w:t>
       </w:r>
     </w:p>
     <w:p>
       <w:pPr>
-        <w:spacing w:line="360" w:lineRule="auto" w:before="0" w:after="0"/>
-        <w:jc w:val="left"/>
+        <w:spacing w:line="360" w:lineRule="auto" w:before="0" w:after="60"/>
       </w:pPr>
       <w:r>
-        <w:rPr>
-          <w:rFonts w:ascii="Times New Roman" w:hAnsi="Times New Roman" w:eastAsia="Times New Roman"/>
-          <w:b w:val="0"/>
-          <w:i/>
-          <w:sz w:val="26"/>
-        </w:rPr>
-        <w:t>[Chèn sơ đồ 7: 2.3 Luồng đặt sân và thanh toán ETH]</w:t>
+        <w:t>kiểm tra sân còn trống</w:t>
       </w:r>
     </w:p>
     <w:p>
       <w:pPr>
-        <w:pStyle w:val="Heading2"/>
-        <w:spacing w:line="360" w:lineRule="auto" w:after="60"/>
+        <w:spacing w:line="360" w:lineRule="auto" w:before="0" w:after="60"/>
       </w:pPr>
       <w:r>
-        <w:t>2.4 Thiết kế dữ liệu on-chain/off-chain</w:t>
+        <w:t>cập nhật trạng thái = đã đặt</w:t>
       </w:r>
     </w:p>
     <w:p>
       <w:pPr>
-        <w:spacing w:line="360" w:lineRule="auto" w:before="0" w:after="0"/>
-        <w:jc w:val="left"/>
+        <w:spacing w:line="360" w:lineRule="auto" w:before="0" w:after="60"/>
       </w:pPr>
       <w:r>
-        <w:rPr>
-          <w:rFonts w:ascii="Times New Roman" w:hAnsi="Times New Roman" w:eastAsia="Times New Roman"/>
-          <w:b w:val="0"/>
-          <w:i w:val="0"/>
-          <w:sz w:val="26"/>
-        </w:rPr>
-        <w:t>Nội dung chi tiết: ............................................................................................</w:t>
+        <w:t>nhận ETH</w:t>
       </w:r>
     </w:p>
     <w:p>
       <w:pPr>
-        <w:spacing w:line="360" w:lineRule="auto" w:before="0" w:after="0"/>
-        <w:jc w:val="left"/>
+        <w:spacing w:line="360" w:lineRule="auto" w:before="0" w:after="60"/>
       </w:pPr>
       <w:r>
-        <w:rPr>
-          <w:rFonts w:ascii="Times New Roman" w:hAnsi="Times New Roman" w:eastAsia="Times New Roman"/>
-          <w:b w:val="0"/>
-          <w:i/>
-          <w:sz w:val="26"/>
-        </w:rPr>
-        <w:t>[Chèn hình 8: 2.4 Thiết kế dữ liệu on-chain/off-chain]</w:t>
+        <w:t>Trả về:</w:t>
       </w:r>
     </w:p>
     <w:p>
       <w:pPr>
-        <w:spacing w:line="360" w:lineRule="auto" w:before="0" w:after="0"/>
-        <w:jc w:val="left"/>
+        <w:spacing w:line="360" w:lineRule="auto" w:before="0" w:after="60"/>
       </w:pPr>
       <w:r>
-        <w:rPr>
-          <w:rFonts w:ascii="Times New Roman" w:hAnsi="Times New Roman" w:eastAsia="Times New Roman"/>
-          <w:b w:val="0"/>
-          <w:i/>
-          <w:sz w:val="26"/>
-        </w:rPr>
-        <w:t>[Chèn bảng 8: 2.4 Thiết kế dữ liệu on-chain/off-chain]</w:t>
+        <w:t>transaction hash</w:t>
       </w:r>
     </w:p>
     <w:p>
       <w:pPr>
-        <w:spacing w:line="360" w:lineRule="auto" w:before="0" w:after="0"/>
-        <w:jc w:val="left"/>
+        <w:spacing w:line="360" w:lineRule="auto" w:before="0" w:after="60"/>
       </w:pPr>
       <w:r>
-        <w:rPr>
-          <w:rFonts w:ascii="Times New Roman" w:hAnsi="Times New Roman" w:eastAsia="Times New Roman"/>
-          <w:b w:val="0"/>
-          <w:i/>
-          <w:sz w:val="26"/>
-        </w:rPr>
-        <w:t>[Chèn sơ đồ 8: 2.4 Thiết kế dữ liệu on-chain/off-chain]</w:t>
+        <w:t>trạng thái thành công</w:t>
       </w:r>
     </w:p>
     <w:p>
       <w:pPr>
         <w:pStyle w:val="Heading2"/>
-        <w:spacing w:line="360" w:lineRule="auto" w:after="60"/>
+        <w:spacing w:line="360" w:lineRule="auto" w:before="0" w:after="60"/>
       </w:pPr>
       <w:r>
-        <w:t>2.5 Yêu cầu bảo mật và phân quyền</w:t>
+        <w:t>2.4 Sau khi đặt sân</w:t>
       </w:r>
     </w:p>
     <w:p>
       <w:pPr>
-        <w:spacing w:line="360" w:lineRule="auto" w:before="0" w:after="0"/>
-        <w:jc w:val="left"/>
+        <w:spacing w:line="360" w:lineRule="auto" w:before="0" w:after="60"/>
       </w:pPr>
       <w:r>
-        <w:rPr>
-          <w:rFonts w:ascii="Times New Roman" w:hAnsi="Times New Roman" w:eastAsia="Times New Roman"/>
-          <w:b w:val="0"/>
-          <w:i w:val="0"/>
-          <w:sz w:val="26"/>
-        </w:rPr>
-        <w:t>Nội dung chi tiết: ............................................................................................</w:t>
+        <w:t>UI cập nhật:</w:t>
       </w:r>
     </w:p>
     <w:p>
       <w:pPr>
-        <w:spacing w:line="360" w:lineRule="auto" w:before="0" w:after="0"/>
-        <w:jc w:val="left"/>
+        <w:spacing w:line="360" w:lineRule="auto" w:before="0" w:after="60"/>
       </w:pPr>
       <w:r>
-        <w:rPr>
-          <w:rFonts w:ascii="Times New Roman" w:hAnsi="Times New Roman" w:eastAsia="Times New Roman"/>
-          <w:b w:val="0"/>
-          <w:i/>
-          <w:sz w:val="26"/>
-        </w:rPr>
-        <w:t>[Chèn hình 9: 2.5 Yêu cầu bảo mật và phân quyền]</w:t>
+        <w:t>sân → "đã đặt"</w:t>
       </w:r>
     </w:p>
     <w:p>
       <w:pPr>
-        <w:spacing w:line="360" w:lineRule="auto" w:before="0" w:after="0"/>
-        <w:jc w:val="left"/>
+        <w:spacing w:line="360" w:lineRule="auto" w:before="0" w:after="60"/>
       </w:pPr>
       <w:r>
-        <w:rPr>
-          <w:rFonts w:ascii="Times New Roman" w:hAnsi="Times New Roman" w:eastAsia="Times New Roman"/>
-          <w:b w:val="0"/>
-          <w:i/>
-          <w:sz w:val="26"/>
-        </w:rPr>
-        <w:t>[Chèn bảng 9: 2.5 Yêu cầu bảo mật và phân quyền]</w:t>
+        <w:t>Có thể:</w:t>
       </w:r>
     </w:p>
     <w:p>
       <w:pPr>
-        <w:spacing w:line="360" w:lineRule="auto" w:before="0" w:after="0"/>
-        <w:jc w:val="left"/>
+        <w:spacing w:line="360" w:lineRule="auto" w:before="0" w:after="60"/>
       </w:pPr>
       <w:r>
-        <w:rPr>
-          <w:rFonts w:ascii="Times New Roman" w:hAnsi="Times New Roman" w:eastAsia="Times New Roman"/>
-          <w:b w:val="0"/>
-          <w:i/>
-          <w:sz w:val="26"/>
-        </w:rPr>
-        <w:t>[Chèn sơ đồ 9: 2.5 Yêu cầu bảo mật và phân quyền]</w:t>
+        <w:t>hiện popup</w:t>
       </w:r>
     </w:p>
     <w:p>
       <w:pPr>
-        <w:pStyle w:val="Heading1"/>
-        <w:spacing w:line="360" w:lineRule="auto" w:after="60"/>
+        <w:spacing w:line="360" w:lineRule="auto" w:before="0" w:after="60"/>
       </w:pPr>
       <w:r>
-        <w:t>CHƯƠNG 3: TRIỂN KHAI HỆ THỐNG</w:t>
+        <w:t>trigger vòng quay (nếu bạn có)</w:t>
       </w:r>
     </w:p>
     <w:p>
       <w:pPr>
         <w:pStyle w:val="Heading2"/>
-        <w:spacing w:line="360" w:lineRule="auto" w:after="60"/>
+        <w:spacing w:line="360" w:lineRule="auto" w:before="0" w:after="60"/>
       </w:pPr>
       <w:r>
-        <w:t>3.1 Triển khai Smart Contract</w:t>
+        <w:t>2.5 Xem lịch sử đặt sân</w:t>
       </w:r>
     </w:p>
     <w:p>
       <w:pPr>
-        <w:spacing w:line="360" w:lineRule="auto" w:before="0" w:after="0"/>
-        <w:jc w:val="left"/>
+        <w:spacing w:line="360" w:lineRule="auto" w:before="0" w:after="60"/>
       </w:pPr>
       <w:r>
-        <w:rPr>
-          <w:rFonts w:ascii="Times New Roman" w:hAnsi="Times New Roman" w:eastAsia="Times New Roman"/>
-          <w:b w:val="0"/>
-          <w:i w:val="0"/>
-          <w:sz w:val="26"/>
-        </w:rPr>
-        <w:t>Nội dung chi tiết: ............................................................................................</w:t>
+        <w:t>Lấy từ:</w:t>
       </w:r>
     </w:p>
     <w:p>
       <w:pPr>
-        <w:spacing w:line="360" w:lineRule="auto" w:before="0" w:after="0"/>
-        <w:jc w:val="left"/>
+        <w:spacing w:line="360" w:lineRule="auto" w:before="0" w:after="60"/>
       </w:pPr>
       <w:r>
-        <w:rPr>
-          <w:rFonts w:ascii="Times New Roman" w:hAnsi="Times New Roman" w:eastAsia="Times New Roman"/>
-          <w:b w:val="0"/>
-          <w:i/>
-          <w:sz w:val="26"/>
-        </w:rPr>
-        <w:t>[Chèn hình 10: 3.1 Triển khai Smart Contract]</w:t>
+        <w:t>blockchain hoặc backend</w:t>
       </w:r>
     </w:p>
     <w:p>
       <w:pPr>
-        <w:spacing w:line="360" w:lineRule="auto" w:before="0" w:after="0"/>
-        <w:jc w:val="left"/>
+        <w:spacing w:line="360" w:lineRule="auto" w:before="0" w:after="60"/>
       </w:pPr>
       <w:r>
-        <w:rPr>
-          <w:rFonts w:ascii="Times New Roman" w:hAnsi="Times New Roman" w:eastAsia="Times New Roman"/>
-          <w:b w:val="0"/>
-          <w:i/>
-          <w:sz w:val="26"/>
-        </w:rPr>
-        <w:t>[Chèn bảng 10: 3.1 Triển khai Smart Contract]</w:t>
+        <w:t>Hiển thị:</w:t>
       </w:r>
     </w:p>
     <w:p>
       <w:pPr>
-        <w:spacing w:line="360" w:lineRule="auto" w:before="0" w:after="0"/>
-        <w:jc w:val="left"/>
+        <w:spacing w:line="360" w:lineRule="auto" w:before="0" w:after="60"/>
       </w:pPr>
       <w:r>
-        <w:rPr>
-          <w:rFonts w:ascii="Times New Roman" w:hAnsi="Times New Roman" w:eastAsia="Times New Roman"/>
-          <w:b w:val="0"/>
-          <w:i/>
-          <w:sz w:val="26"/>
-        </w:rPr>
-        <w:t>[Chèn sơ đồ 10: 3.1 Triển khai Smart Contract]</w:t>
+        <w:t>sân đã đặt</w:t>
       </w:r>
     </w:p>
     <w:p>
       <w:pPr>
-        <w:pStyle w:val="Heading2"/>
-        <w:spacing w:line="360" w:lineRule="auto" w:after="60"/>
+        <w:spacing w:line="360" w:lineRule="auto" w:before="0" w:after="60"/>
       </w:pPr>
       <w:r>
-        <w:t>3.2 Tích hợp JSON-RPC</w:t>
+        <w:t>thời gian</w:t>
       </w:r>
     </w:p>
     <w:p>
       <w:pPr>
-        <w:spacing w:line="360" w:lineRule="auto" w:before="0" w:after="0"/>
-        <w:jc w:val="left"/>
+        <w:spacing w:line="360" w:lineRule="auto" w:before="0" w:after="60"/>
       </w:pPr>
       <w:r>
-        <w:rPr>
-          <w:rFonts w:ascii="Times New Roman" w:hAnsi="Times New Roman" w:eastAsia="Times New Roman"/>
-          <w:b w:val="0"/>
-          <w:i w:val="0"/>
-          <w:sz w:val="26"/>
-        </w:rPr>
-        <w:t>Nội dung chi tiết: ............................................................................................</w:t>
+        <w:t>số tiền</w:t>
       </w:r>
     </w:p>
     <w:p>
       <w:pPr>
-        <w:spacing w:line="360" w:lineRule="auto" w:before="0" w:after="0"/>
-        <w:jc w:val="left"/>
+        <w:pStyle w:val="Heading1"/>
+        <w:spacing w:line="360" w:lineRule="auto" w:before="0" w:after="60"/>
       </w:pPr>
       <w:r>
-        <w:rPr>
-          <w:rFonts w:ascii="Times New Roman" w:hAnsi="Times New Roman" w:eastAsia="Times New Roman"/>
-          <w:b w:val="0"/>
-          <w:i/>
-          <w:sz w:val="26"/>
-        </w:rPr>
-        <w:t>[Chèn hình 11: 3.2 Tích hợp JSON-RPC]</w:t>
+        <w:t>3. LOGIC ADMIN (QUẢN TRỊ)</w:t>
       </w:r>
     </w:p>
     <w:p>
       <w:pPr>
-        <w:spacing w:line="360" w:lineRule="auto" w:before="0" w:after="0"/>
-        <w:jc w:val="left"/>
+        <w:pStyle w:val="Heading2"/>
+        <w:spacing w:line="360" w:lineRule="auto" w:before="0" w:after="60"/>
       </w:pPr>
       <w:r>
-        <w:rPr>
-          <w:rFonts w:ascii="Times New Roman" w:hAnsi="Times New Roman" w:eastAsia="Times New Roman"/>
-          <w:b w:val="0"/>
-          <w:i/>
-          <w:sz w:val="26"/>
-        </w:rPr>
-        <w:t>[Chèn bảng 11: 3.2 Tích hợp JSON-RPC]</w:t>
+        <w:t>3.1 Phân quyền admin</w:t>
       </w:r>
     </w:p>
     <w:p>
       <w:pPr>
-        <w:spacing w:line="360" w:lineRule="auto" w:before="0" w:after="0"/>
-        <w:jc w:val="left"/>
+        <w:spacing w:line="360" w:lineRule="auto" w:before="0" w:after="60"/>
       </w:pPr>
       <w:r>
-        <w:rPr>
-          <w:rFonts w:ascii="Times New Roman" w:hAnsi="Times New Roman" w:eastAsia="Times New Roman"/>
-          <w:b w:val="0"/>
-          <w:i/>
-          <w:sz w:val="26"/>
-        </w:rPr>
-        <w:t>[Chèn sơ đồ 11: 3.2 Tích hợp JSON-RPC]</w:t>
+        <w:t>Admin được xác định bằng:</w:t>
       </w:r>
     </w:p>
     <w:p>
       <w:pPr>
-        <w:pStyle w:val="Heading2"/>
-        <w:spacing w:line="360" w:lineRule="auto" w:after="60"/>
+        <w:spacing w:line="360" w:lineRule="auto" w:before="0" w:after="60"/>
       </w:pPr>
       <w:r>
-        <w:t>3.3 Backend REST API</w:t>
+        <w:t>Wallet address (hardcode hoặc mapping)</w:t>
       </w:r>
     </w:p>
     <w:p>
       <w:pPr>
-        <w:spacing w:line="360" w:lineRule="auto" w:before="0" w:after="0"/>
-        <w:jc w:val="left"/>
+        <w:spacing w:line="360" w:lineRule="auto" w:before="0" w:after="60"/>
       </w:pPr>
       <w:r>
-        <w:rPr>
-          <w:rFonts w:ascii="Times New Roman" w:hAnsi="Times New Roman" w:eastAsia="Times New Roman"/>
-          <w:b w:val="0"/>
-          <w:i w:val="0"/>
-          <w:sz w:val="26"/>
-        </w:rPr>
-        <w:t>Nội dung chi tiết: ............................................................................................</w:t>
+        <w:t>if (wallet == adminAddress) → quyền admin</w:t>
       </w:r>
     </w:p>
     <w:p>
       <w:pPr>
-        <w:spacing w:line="360" w:lineRule="auto" w:before="0" w:after="0"/>
-        <w:jc w:val="left"/>
+        <w:pStyle w:val="Heading2"/>
+        <w:spacing w:line="360" w:lineRule="auto" w:before="0" w:after="60"/>
       </w:pPr>
       <w:r>
-        <w:rPr>
-          <w:rFonts w:ascii="Times New Roman" w:hAnsi="Times New Roman" w:eastAsia="Times New Roman"/>
-          <w:b w:val="0"/>
-          <w:i/>
-          <w:sz w:val="26"/>
-        </w:rPr>
-        <w:t>[Chèn hình 12: 3.3 Backend REST API]</w:t>
+        <w:t>3.2 Tạo sân</w:t>
       </w:r>
     </w:p>
     <w:p>
       <w:pPr>
-        <w:spacing w:line="360" w:lineRule="auto" w:before="0" w:after="0"/>
-        <w:jc w:val="left"/>
+        <w:spacing w:line="360" w:lineRule="auto" w:before="0" w:after="60"/>
       </w:pPr>
       <w:r>
-        <w:rPr>
-          <w:rFonts w:ascii="Times New Roman" w:hAnsi="Times New Roman" w:eastAsia="Times New Roman"/>
-          <w:b w:val="0"/>
-          <w:i/>
-          <w:sz w:val="26"/>
-        </w:rPr>
-        <w:t>[Chèn bảng 12: 3.3 Backend REST API]</w:t>
+        <w:t>Luồng:</w:t>
       </w:r>
     </w:p>
     <w:p>
       <w:pPr>
-        <w:spacing w:line="360" w:lineRule="auto" w:before="0" w:after="0"/>
-        <w:jc w:val="left"/>
+        <w:spacing w:line="360" w:lineRule="auto" w:before="0" w:after="60"/>
       </w:pPr>
       <w:r>
-        <w:rPr>
-          <w:rFonts w:ascii="Times New Roman" w:hAnsi="Times New Roman" w:eastAsia="Times New Roman"/>
-          <w:b w:val="0"/>
-          <w:i/>
-          <w:sz w:val="26"/>
-        </w:rPr>
-        <w:t>[Chèn sơ đồ 12: 3.3 Backend REST API]</w:t>
+        <w:t>Admin nhập:</w:t>
       </w:r>
     </w:p>
     <w:p>
       <w:pPr>
-        <w:pStyle w:val="Heading2"/>
-        <w:spacing w:line="360" w:lineRule="auto" w:after="60"/>
+        <w:spacing w:line="360" w:lineRule="auto" w:before="0" w:after="60"/>
       </w:pPr>
       <w:r>
-        <w:t>3.4 Cấu hình Hardhat localhost</w:t>
+        <w:t>tên sân</w:t>
       </w:r>
     </w:p>
     <w:p>
       <w:pPr>
-        <w:spacing w:line="360" w:lineRule="auto" w:before="0" w:after="0"/>
-        <w:jc w:val="left"/>
+        <w:spacing w:line="360" w:lineRule="auto" w:before="0" w:after="60"/>
       </w:pPr>
       <w:r>
-        <w:rPr>
-          <w:rFonts w:ascii="Times New Roman" w:hAnsi="Times New Roman" w:eastAsia="Times New Roman"/>
-          <w:b w:val="0"/>
-          <w:i w:val="0"/>
-          <w:sz w:val="26"/>
-        </w:rPr>
-        <w:t>Nội dung chi tiết: ............................................................................................</w:t>
+        <w:t>giá</w:t>
       </w:r>
     </w:p>
     <w:p>
       <w:pPr>
-        <w:spacing w:line="360" w:lineRule="auto" w:before="0" w:after="0"/>
-        <w:jc w:val="left"/>
+        <w:spacing w:line="360" w:lineRule="auto" w:before="0" w:after="60"/>
       </w:pPr>
       <w:r>
-        <w:rPr>
-          <w:rFonts w:ascii="Times New Roman" w:hAnsi="Times New Roman" w:eastAsia="Times New Roman"/>
-          <w:b w:val="0"/>
-          <w:i/>
-          <w:sz w:val="26"/>
-        </w:rPr>
-        <w:t>[Chèn hình 13: 3.4 Cấu hình Hardhat localhost]</w:t>
+        <w:t>Gửi transaction</w:t>
       </w:r>
     </w:p>
     <w:p>
       <w:pPr>
-        <w:spacing w:line="360" w:lineRule="auto" w:before="0" w:after="0"/>
-        <w:jc w:val="left"/>
+        <w:spacing w:line="360" w:lineRule="auto" w:before="0" w:after="60"/>
       </w:pPr>
       <w:r>
-        <w:rPr>
-          <w:rFonts w:ascii="Times New Roman" w:hAnsi="Times New Roman" w:eastAsia="Times New Roman"/>
-          <w:b w:val="0"/>
-          <w:i/>
-          <w:sz w:val="26"/>
-        </w:rPr>
-        <w:t>[Chèn bảng 13: 3.4 Cấu hình Hardhat localhost]</w:t>
+        <w:t>Smart Contract:</w:t>
       </w:r>
     </w:p>
     <w:p>
       <w:pPr>
-        <w:spacing w:line="360" w:lineRule="auto" w:before="0" w:after="0"/>
-        <w:jc w:val="left"/>
+        <w:spacing w:line="360" w:lineRule="auto" w:before="0" w:after="60"/>
       </w:pPr>
       <w:r>
-        <w:rPr>
-          <w:rFonts w:ascii="Times New Roman" w:hAnsi="Times New Roman" w:eastAsia="Times New Roman"/>
-          <w:b w:val="0"/>
-          <w:i/>
-          <w:sz w:val="26"/>
-        </w:rPr>
-        <w:t>[Chèn sơ đồ 13: 3.4 Cấu hình Hardhat localhost]</w:t>
+        <w:t>tạo sân mới</w:t>
       </w:r>
     </w:p>
     <w:p>
       <w:pPr>
-        <w:pStyle w:val="Heading2"/>
-        <w:spacing w:line="360" w:lineRule="auto" w:after="60"/>
+        <w:spacing w:line="360" w:lineRule="auto" w:before="0" w:after="60"/>
       </w:pPr>
       <w:r>
-        <w:t>3.5 Phương án deploy</w:t>
+        <w:t>lưu vào blockchain</w:t>
       </w:r>
     </w:p>
     <w:p>
       <w:pPr>
-        <w:spacing w:line="360" w:lineRule="auto" w:before="0" w:after="0"/>
-        <w:jc w:val="left"/>
+        <w:spacing w:line="360" w:lineRule="auto" w:before="0" w:after="60"/>
       </w:pPr>
       <w:r>
-        <w:rPr>
-          <w:rFonts w:ascii="Times New Roman" w:hAnsi="Times New Roman" w:eastAsia="Times New Roman"/>
-          <w:b w:val="0"/>
-          <w:i w:val="0"/>
-          <w:sz w:val="26"/>
-        </w:rPr>
-        <w:t>Nội dung chi tiết: ............................................................................................</w:t>
+        <w:t>Kết quả:</w:t>
       </w:r>
     </w:p>
     <w:p>
       <w:pPr>
-        <w:spacing w:line="360" w:lineRule="auto" w:before="0" w:after="0"/>
-        <w:jc w:val="left"/>
+        <w:spacing w:line="360" w:lineRule="auto" w:before="0" w:after="60"/>
       </w:pPr>
       <w:r>
-        <w:rPr>
-          <w:rFonts w:ascii="Times New Roman" w:hAnsi="Times New Roman" w:eastAsia="Times New Roman"/>
-          <w:b w:val="0"/>
-          <w:i/>
-          <w:sz w:val="26"/>
-        </w:rPr>
-        <w:t>[Chèn hình 14: 3.5 Phương án deploy]</w:t>
+        <w:t>danh sách sân tăng lên</w:t>
       </w:r>
     </w:p>
     <w:p>
       <w:pPr>
-        <w:spacing w:line="360" w:lineRule="auto" w:before="0" w:after="0"/>
-        <w:jc w:val="left"/>
+        <w:pStyle w:val="Heading2"/>
+        <w:spacing w:line="360" w:lineRule="auto" w:before="0" w:after="60"/>
       </w:pPr>
       <w:r>
-        <w:rPr>
-          <w:rFonts w:ascii="Times New Roman" w:hAnsi="Times New Roman" w:eastAsia="Times New Roman"/>
-          <w:b w:val="0"/>
-          <w:i/>
-          <w:sz w:val="26"/>
-        </w:rPr>
-        <w:t>[Chèn bảng 14: 3.5 Phương án deploy]</w:t>
+        <w:t>3.3 Sửa sân</w:t>
       </w:r>
     </w:p>
     <w:p>
       <w:pPr>
-        <w:spacing w:line="360" w:lineRule="auto" w:before="0" w:after="0"/>
-        <w:jc w:val="left"/>
+        <w:spacing w:line="360" w:lineRule="auto" w:before="0" w:after="60"/>
       </w:pPr>
       <w:r>
-        <w:rPr>
-          <w:rFonts w:ascii="Times New Roman" w:hAnsi="Times New Roman" w:eastAsia="Times New Roman"/>
-          <w:b w:val="0"/>
-          <w:i/>
-          <w:sz w:val="26"/>
-        </w:rPr>
-        <w:t>[Chèn sơ đồ 14: 3.5 Phương án deploy]</w:t>
+        <w:t>Admin chọn sân</w:t>
       </w:r>
     </w:p>
     <w:p>
       <w:pPr>
-        <w:pStyle w:val="Heading1"/>
-        <w:spacing w:line="360" w:lineRule="auto" w:after="60"/>
+        <w:spacing w:line="360" w:lineRule="auto" w:before="0" w:after="60"/>
       </w:pPr>
       <w:r>
-        <w:t>CHƯƠNG 4: MÔ TẢ CHỨC NĂNG</w:t>
+        <w:t>cập nhật:</w:t>
       </w:r>
     </w:p>
     <w:p>
       <w:pPr>
-        <w:pStyle w:val="Heading2"/>
-        <w:spacing w:line="360" w:lineRule="auto" w:after="60"/>
+        <w:spacing w:line="360" w:lineRule="auto" w:before="0" w:after="60"/>
       </w:pPr>
       <w:r>
-        <w:t>4.1 Chức năng người dùng</w:t>
+        <w:t>giá</w:t>
       </w:r>
     </w:p>
     <w:p>
       <w:pPr>
-        <w:spacing w:line="360" w:lineRule="auto" w:before="0" w:after="0"/>
-        <w:jc w:val="left"/>
+        <w:spacing w:line="360" w:lineRule="auto" w:before="0" w:after="60"/>
       </w:pPr>
       <w:r>
-        <w:rPr>
-          <w:rFonts w:ascii="Times New Roman" w:hAnsi="Times New Roman" w:eastAsia="Times New Roman"/>
-          <w:b w:val="0"/>
-          <w:i w:val="0"/>
-          <w:sz w:val="26"/>
-        </w:rPr>
-        <w:t>Nội dung chi tiết: ............................................................................................</w:t>
+        <w:t>trạng thái</w:t>
       </w:r>
     </w:p>
     <w:p>
       <w:pPr>
-        <w:spacing w:line="360" w:lineRule="auto" w:before="0" w:after="0"/>
-        <w:jc w:val="left"/>
+        <w:spacing w:line="360" w:lineRule="auto" w:before="0" w:after="60"/>
       </w:pPr>
       <w:r>
-        <w:rPr>
-          <w:rFonts w:ascii="Times New Roman" w:hAnsi="Times New Roman" w:eastAsia="Times New Roman"/>
-          <w:b w:val="0"/>
-          <w:i/>
-          <w:sz w:val="26"/>
-        </w:rPr>
-        <w:t>[Chèn hình 15: 4.1 Chức năng người dùng]</w:t>
+        <w:t>gửi transaction</w:t>
       </w:r>
     </w:p>
     <w:p>
       <w:pPr>
-        <w:spacing w:line="360" w:lineRule="auto" w:before="0" w:after="0"/>
-        <w:jc w:val="left"/>
+        <w:pStyle w:val="Heading2"/>
+        <w:spacing w:line="360" w:lineRule="auto" w:before="0" w:after="60"/>
       </w:pPr>
       <w:r>
-        <w:rPr>
-          <w:rFonts w:ascii="Times New Roman" w:hAnsi="Times New Roman" w:eastAsia="Times New Roman"/>
-          <w:b w:val="0"/>
-          <w:i/>
-          <w:sz w:val="26"/>
-        </w:rPr>
-        <w:t>[Chèn bảng 15: 4.1 Chức năng người dùng]</w:t>
+        <w:t>3.4 Xóa sân</w:t>
       </w:r>
     </w:p>
     <w:p>
       <w:pPr>
-        <w:spacing w:line="360" w:lineRule="auto" w:before="0" w:after="0"/>
-        <w:jc w:val="left"/>
+        <w:spacing w:line="360" w:lineRule="auto" w:before="0" w:after="60"/>
       </w:pPr>
       <w:r>
-        <w:rPr>
-          <w:rFonts w:ascii="Times New Roman" w:hAnsi="Times New Roman" w:eastAsia="Times New Roman"/>
-          <w:b w:val="0"/>
-          <w:i/>
-          <w:sz w:val="26"/>
-        </w:rPr>
-        <w:t>[Chèn sơ đồ 15: 4.1 Chức năng người dùng]</w:t>
+        <w:t>Gửi transaction</w:t>
       </w:r>
     </w:p>
     <w:p>
       <w:pPr>
-        <w:pStyle w:val="Heading2"/>
-        <w:spacing w:line="360" w:lineRule="auto" w:after="60"/>
+        <w:spacing w:line="360" w:lineRule="auto" w:before="0" w:after="60"/>
       </w:pPr>
       <w:r>
-        <w:t>4.2 Chức năng quản trị</w:t>
+        <w:t>Smart Contract:</w:t>
       </w:r>
     </w:p>
     <w:p>
       <w:pPr>
-        <w:spacing w:line="360" w:lineRule="auto" w:before="0" w:after="0"/>
-        <w:jc w:val="left"/>
+        <w:spacing w:line="360" w:lineRule="auto" w:before="0" w:after="60"/>
       </w:pPr>
       <w:r>
-        <w:rPr>
-          <w:rFonts w:ascii="Times New Roman" w:hAnsi="Times New Roman" w:eastAsia="Times New Roman"/>
-          <w:b w:val="0"/>
-          <w:i w:val="0"/>
-          <w:sz w:val="26"/>
-        </w:rPr>
-        <w:t>Nội dung chi tiết: ............................................................................................</w:t>
+        <w:t>đánh dấu xóa hoặc remove</w:t>
       </w:r>
     </w:p>
     <w:p>
       <w:pPr>
-        <w:spacing w:line="360" w:lineRule="auto" w:before="0" w:after="0"/>
-        <w:jc w:val="left"/>
+        <w:pStyle w:val="Heading2"/>
+        <w:spacing w:line="360" w:lineRule="auto" w:before="0" w:after="60"/>
       </w:pPr>
       <w:r>
-        <w:rPr>
-          <w:rFonts w:ascii="Times New Roman" w:hAnsi="Times New Roman" w:eastAsia="Times New Roman"/>
-          <w:b w:val="0"/>
-          <w:i/>
-          <w:sz w:val="26"/>
-        </w:rPr>
-        <w:t>[Chèn hình 16: 4.2 Chức năng quản trị]</w:t>
+        <w:t>3.5 Quản lý doanh thu</w:t>
       </w:r>
     </w:p>
     <w:p>
       <w:pPr>
-        <w:spacing w:line="360" w:lineRule="auto" w:before="0" w:after="0"/>
-        <w:jc w:val="left"/>
+        <w:spacing w:line="360" w:lineRule="auto" w:before="0" w:after="60"/>
       </w:pPr>
       <w:r>
-        <w:rPr>
-          <w:rFonts w:ascii="Times New Roman" w:hAnsi="Times New Roman" w:eastAsia="Times New Roman"/>
-          <w:b w:val="0"/>
-          <w:i/>
-          <w:sz w:val="26"/>
-        </w:rPr>
-        <w:t>[Chèn bảng 16: 4.2 Chức năng quản trị]</w:t>
+        <w:t>Tổng ETH = tổng các giao dịch đặt sân</w:t>
       </w:r>
     </w:p>
     <w:p>
       <w:pPr>
-        <w:spacing w:line="360" w:lineRule="auto" w:before="0" w:after="0"/>
-        <w:jc w:val="left"/>
+        <w:spacing w:line="360" w:lineRule="auto" w:before="0" w:after="60"/>
       </w:pPr>
       <w:r>
-        <w:rPr>
-          <w:rFonts w:ascii="Times New Roman" w:hAnsi="Times New Roman" w:eastAsia="Times New Roman"/>
-          <w:b w:val="0"/>
-          <w:i/>
-          <w:sz w:val="26"/>
-        </w:rPr>
-        <w:t>[Chèn sơ đồ 16: 4.2 Chức năng quản trị]</w:t>
+        <w:t>Có 2 cách:</w:t>
       </w:r>
     </w:p>
     <w:p>
       <w:pPr>
-        <w:pStyle w:val="Heading2"/>
-        <w:spacing w:line="360" w:lineRule="auto" w:after="60"/>
+        <w:spacing w:line="360" w:lineRule="auto" w:before="0" w:after="60"/>
       </w:pPr>
       <w:r>
-        <w:t>4.3 Ma trận phân quyền</w:t>
+        <w:t>Tính trực tiếp từ contract</w:t>
       </w:r>
     </w:p>
     <w:p>
       <w:pPr>
-        <w:spacing w:line="360" w:lineRule="auto" w:before="0" w:after="0"/>
-        <w:jc w:val="left"/>
+        <w:spacing w:line="360" w:lineRule="auto" w:before="0" w:after="60"/>
       </w:pPr>
       <w:r>
-        <w:rPr>
-          <w:rFonts w:ascii="Times New Roman" w:hAnsi="Times New Roman" w:eastAsia="Times New Roman"/>
-          <w:b w:val="0"/>
-          <w:i w:val="0"/>
-          <w:sz w:val="26"/>
-        </w:rPr>
-        <w:t>Nội dung chi tiết: ............................................................................................</w:t>
+        <w:t>Hoặc backend thống kê</w:t>
       </w:r>
     </w:p>
     <w:p>
       <w:pPr>
-        <w:spacing w:line="360" w:lineRule="auto" w:before="0" w:after="0"/>
-        <w:jc w:val="left"/>
+        <w:pStyle w:val="Heading2"/>
+        <w:spacing w:line="360" w:lineRule="auto" w:before="0" w:after="60"/>
       </w:pPr>
       <w:r>
-        <w:rPr>
-          <w:rFonts w:ascii="Times New Roman" w:hAnsi="Times New Roman" w:eastAsia="Times New Roman"/>
-          <w:b w:val="0"/>
-          <w:i/>
-          <w:sz w:val="26"/>
-        </w:rPr>
-        <w:t>[Chèn hình 17: 4.3 Ma trận phân quyền]</w:t>
+        <w:t>3.6 Nhận ETH</w:t>
       </w:r>
     </w:p>
     <w:p>
       <w:pPr>
-        <w:spacing w:line="360" w:lineRule="auto" w:before="0" w:after="0"/>
-        <w:jc w:val="left"/>
+        <w:spacing w:line="360" w:lineRule="auto" w:before="0" w:after="60"/>
       </w:pPr>
       <w:r>
-        <w:rPr>
-          <w:rFonts w:ascii="Times New Roman" w:hAnsi="Times New Roman" w:eastAsia="Times New Roman"/>
-          <w:b w:val="0"/>
-          <w:i/>
-          <w:sz w:val="26"/>
-        </w:rPr>
-        <w:t>[Chèn bảng 17: 4.3 Ma trận phân quyền]</w:t>
+        <w:t>ETH được chuyển:</w:t>
       </w:r>
     </w:p>
     <w:p>
       <w:pPr>
-        <w:spacing w:line="360" w:lineRule="auto" w:before="0" w:after="0"/>
-        <w:jc w:val="left"/>
+        <w:spacing w:line="360" w:lineRule="auto" w:before="0" w:after="60"/>
       </w:pPr>
       <w:r>
-        <w:rPr>
-          <w:rFonts w:ascii="Times New Roman" w:hAnsi="Times New Roman" w:eastAsia="Times New Roman"/>
-          <w:b w:val="0"/>
-          <w:i/>
-          <w:sz w:val="26"/>
-        </w:rPr>
-        <w:t>[Chèn sơ đồ 17: 4.3 Ma trận phân quyền]</w:t>
+        <w:t>Khi user đặt sân</w:t>
       </w:r>
     </w:p>
     <w:p>
       <w:pPr>
-        <w:pStyle w:val="Heading2"/>
-        <w:spacing w:line="360" w:lineRule="auto" w:after="60"/>
+        <w:spacing w:line="360" w:lineRule="auto" w:before="0" w:after="60"/>
       </w:pPr>
       <w:r>
-        <w:t>4.4 Xử lý ngoại lệ nghiệp vụ</w:t>
+        <w:t>chuyển vào contract hoặc ví admin</w:t>
       </w:r>
     </w:p>
     <w:p>
       <w:pPr>
-        <w:spacing w:line="360" w:lineRule="auto" w:before="0" w:after="0"/>
-        <w:jc w:val="left"/>
+        <w:pStyle w:val="Heading1"/>
+        <w:spacing w:line="360" w:lineRule="auto" w:before="0" w:after="60"/>
       </w:pPr>
       <w:r>
-        <w:rPr>
-          <w:rFonts w:ascii="Times New Roman" w:hAnsi="Times New Roman" w:eastAsia="Times New Roman"/>
-          <w:b w:val="0"/>
-          <w:i w:val="0"/>
-          <w:sz w:val="26"/>
-        </w:rPr>
-        <w:t>Nội dung chi tiết: ............................................................................................</w:t>
+        <w:t>4. PHÂN TÍCH TỪNG Ô CHỨC NĂNG (UI)</w:t>
       </w:r>
     </w:p>
     <w:p>
       <w:pPr>
-        <w:spacing w:line="360" w:lineRule="auto" w:before="0" w:after="0"/>
-        <w:jc w:val="left"/>
+        <w:spacing w:line="360" w:lineRule="auto" w:before="0" w:after="60"/>
       </w:pPr>
       <w:r>
-        <w:rPr>
-          <w:rFonts w:ascii="Times New Roman" w:hAnsi="Times New Roman" w:eastAsia="Times New Roman"/>
-          <w:b w:val="0"/>
-          <w:i/>
-          <w:sz w:val="26"/>
-        </w:rPr>
-        <w:t>[Chèn hình 18: 4.4 Xử lý ngoại lệ nghiệp vụ]</w:t>
+        <w:t>Ô: Connect Wallet</w:t>
       </w:r>
     </w:p>
     <w:p>
       <w:pPr>
-        <w:spacing w:line="360" w:lineRule="auto" w:before="0" w:after="0"/>
-        <w:jc w:val="left"/>
+        <w:spacing w:line="360" w:lineRule="auto" w:before="0" w:after="60"/>
       </w:pPr>
       <w:r>
-        <w:rPr>
-          <w:rFonts w:ascii="Times New Roman" w:hAnsi="Times New Roman" w:eastAsia="Times New Roman"/>
-          <w:b w:val="0"/>
-          <w:i/>
-          <w:sz w:val="26"/>
-        </w:rPr>
-        <w:t>[Chèn bảng 18: 4.4 Xử lý ngoại lệ nghiệp vụ]</w:t>
+        <w:t>Gọi ethereum.request()</w:t>
       </w:r>
     </w:p>
     <w:p>
       <w:pPr>
-        <w:spacing w:line="360" w:lineRule="auto" w:before="0" w:after="0"/>
-        <w:jc w:val="left"/>
+        <w:spacing w:line="360" w:lineRule="auto" w:before="0" w:after="60"/>
       </w:pPr>
       <w:r>
-        <w:rPr>
-          <w:rFonts w:ascii="Times New Roman" w:hAnsi="Times New Roman" w:eastAsia="Times New Roman"/>
-          <w:b w:val="0"/>
-          <w:i/>
-          <w:sz w:val="26"/>
-        </w:rPr>
-        <w:t>[Chèn sơ đồ 18: 4.4 Xử lý ngoại lệ nghiệp vụ]</w:t>
+        <w:t>Lấy address</w:t>
       </w:r>
     </w:p>
     <w:p>
       <w:pPr>
-        <w:pStyle w:val="Heading1"/>
-        <w:spacing w:line="360" w:lineRule="auto" w:after="60"/>
+        <w:spacing w:line="360" w:lineRule="auto" w:before="0" w:after="60"/>
       </w:pPr>
       <w:r>
-        <w:t>CHƯƠNG 5: KIỂM THỬ VÀ ĐÁNH GIÁ</w:t>
+        <w:t>Ô: Danh sách sân</w:t>
       </w:r>
     </w:p>
     <w:p>
       <w:pPr>
-        <w:pStyle w:val="Heading2"/>
-        <w:spacing w:line="360" w:lineRule="auto" w:after="60"/>
+        <w:spacing w:line="360" w:lineRule="auto" w:before="0" w:after="60"/>
       </w:pPr>
       <w:r>
-        <w:t>5.1 Kế hoạch kiểm thử</w:t>
+        <w:t>Render từ:</w:t>
       </w:r>
     </w:p>
     <w:p>
       <w:pPr>
-        <w:spacing w:line="360" w:lineRule="auto" w:before="0" w:after="0"/>
-        <w:jc w:val="left"/>
+        <w:spacing w:line="360" w:lineRule="auto" w:before="0" w:after="60"/>
       </w:pPr>
       <w:r>
-        <w:rPr>
-          <w:rFonts w:ascii="Times New Roman" w:hAnsi="Times New Roman" w:eastAsia="Times New Roman"/>
-          <w:b w:val="0"/>
-          <w:i w:val="0"/>
-          <w:sz w:val="26"/>
-        </w:rPr>
-        <w:t>Nội dung chi tiết: ............................................................................................</w:t>
+        <w:t>contract hoặc API</w:t>
       </w:r>
     </w:p>
     <w:p>
       <w:pPr>
-        <w:spacing w:line="360" w:lineRule="auto" w:before="0" w:after="0"/>
-        <w:jc w:val="left"/>
+        <w:spacing w:line="360" w:lineRule="auto" w:before="0" w:after="60"/>
       </w:pPr>
       <w:r>
-        <w:rPr>
-          <w:rFonts w:ascii="Times New Roman" w:hAnsi="Times New Roman" w:eastAsia="Times New Roman"/>
-          <w:b w:val="0"/>
-          <w:i/>
-          <w:sz w:val="26"/>
-        </w:rPr>
-        <w:t>[Chèn hình 19: 5.1 Kế hoạch kiểm thử]</w:t>
+        <w:t>Ô: Đặt sân</w:t>
       </w:r>
     </w:p>
     <w:p>
       <w:pPr>
-        <w:spacing w:line="360" w:lineRule="auto" w:before="0" w:after="0"/>
-        <w:jc w:val="left"/>
+        <w:spacing w:line="360" w:lineRule="auto" w:before="0" w:after="60"/>
       </w:pPr>
       <w:r>
-        <w:rPr>
-          <w:rFonts w:ascii="Times New Roman" w:hAnsi="Times New Roman" w:eastAsia="Times New Roman"/>
-          <w:b w:val="0"/>
-          <w:i/>
-          <w:sz w:val="26"/>
-        </w:rPr>
-        <w:t>[Chèn bảng 19: 5.1 Kế hoạch kiểm thử]</w:t>
+        <w:t>Trigger:</w:t>
       </w:r>
     </w:p>
     <w:p>
       <w:pPr>
-        <w:spacing w:line="360" w:lineRule="auto" w:before="0" w:after="0"/>
-        <w:jc w:val="left"/>
+        <w:spacing w:line="360" w:lineRule="auto" w:before="0" w:after="60"/>
       </w:pPr>
       <w:r>
-        <w:rPr>
-          <w:rFonts w:ascii="Times New Roman" w:hAnsi="Times New Roman" w:eastAsia="Times New Roman"/>
-          <w:b w:val="0"/>
-          <w:i/>
-          <w:sz w:val="26"/>
-        </w:rPr>
-        <w:t>[Chèn sơ đồ 19: 5.1 Kế hoạch kiểm thử]</w:t>
+        <w:t>transaction MetaMask</w:t>
       </w:r>
     </w:p>
     <w:p>
       <w:pPr>
-        <w:pStyle w:val="Heading2"/>
-        <w:spacing w:line="360" w:lineRule="auto" w:after="60"/>
+        <w:spacing w:line="360" w:lineRule="auto" w:before="0" w:after="60"/>
       </w:pPr>
       <w:r>
-        <w:t>5.2 Bộ test case chi tiết</w:t>
+        <w:t>Ô: Trạng thái sân</w:t>
       </w:r>
     </w:p>
     <w:p>
       <w:pPr>
-        <w:spacing w:line="360" w:lineRule="auto" w:before="0" w:after="0"/>
-        <w:jc w:val="left"/>
+        <w:spacing w:line="360" w:lineRule="auto" w:before="0" w:after="60"/>
       </w:pPr>
       <w:r>
-        <w:rPr>
-          <w:rFonts w:ascii="Times New Roman" w:hAnsi="Times New Roman" w:eastAsia="Times New Roman"/>
-          <w:b w:val="0"/>
-          <w:i w:val="0"/>
-          <w:sz w:val="26"/>
-        </w:rPr>
-        <w:t>Nội dung chi tiết: ............................................................................................</w:t>
+        <w:t>Hiển thị:</w:t>
       </w:r>
     </w:p>
     <w:p>
       <w:pPr>
-        <w:spacing w:line="360" w:lineRule="auto" w:before="0" w:after="0"/>
-        <w:jc w:val="left"/>
+        <w:spacing w:line="360" w:lineRule="auto" w:before="0" w:after="60"/>
       </w:pPr>
       <w:r>
-        <w:rPr>
-          <w:rFonts w:ascii="Times New Roman" w:hAnsi="Times New Roman" w:eastAsia="Times New Roman"/>
-          <w:b w:val="0"/>
-          <w:i/>
-          <w:sz w:val="26"/>
-        </w:rPr>
-        <w:t>[Chèn hình 20: 5.2 Bộ test case chi tiết]</w:t>
+        <w:t>Available / Booked</w:t>
       </w:r>
     </w:p>
     <w:p>
       <w:pPr>
-        <w:spacing w:line="360" w:lineRule="auto" w:before="0" w:after="0"/>
-        <w:jc w:val="left"/>
+        <w:spacing w:line="360" w:lineRule="auto" w:before="0" w:after="60"/>
       </w:pPr>
       <w:r>
-        <w:rPr>
-          <w:rFonts w:ascii="Times New Roman" w:hAnsi="Times New Roman" w:eastAsia="Times New Roman"/>
-          <w:b w:val="0"/>
-          <w:i/>
-          <w:sz w:val="26"/>
-        </w:rPr>
-        <w:t>[Chèn bảng 20: 5.2 Bộ test case chi tiết]</w:t>
+        <w:t>Ô: Admin Dashboard</w:t>
       </w:r>
     </w:p>
     <w:p>
       <w:pPr>
-        <w:spacing w:line="360" w:lineRule="auto" w:before="0" w:after="0"/>
-        <w:jc w:val="left"/>
+        <w:spacing w:line="360" w:lineRule="auto" w:before="0" w:after="60"/>
       </w:pPr>
       <w:r>
-        <w:rPr>
-          <w:rFonts w:ascii="Times New Roman" w:hAnsi="Times New Roman" w:eastAsia="Times New Roman"/>
-          <w:b w:val="0"/>
-          <w:i/>
-          <w:sz w:val="26"/>
-        </w:rPr>
-        <w:t>[Chèn sơ đồ 20: 5.2 Bộ test case chi tiết]</w:t>
+        <w:t>CRUD sân</w:t>
       </w:r>
     </w:p>
     <w:p>
       <w:pPr>
-        <w:pStyle w:val="Heading2"/>
-        <w:spacing w:line="360" w:lineRule="auto" w:after="60"/>
+        <w:spacing w:line="360" w:lineRule="auto" w:before="0" w:after="60"/>
       </w:pPr>
       <w:r>
-        <w:t>5.3 Kết quả thực nghiệm</w:t>
+        <w:t>Thống kê</w:t>
       </w:r>
     </w:p>
     <w:p>
       <w:pPr>
-        <w:spacing w:line="360" w:lineRule="auto" w:before="0" w:after="0"/>
-        <w:jc w:val="left"/>
+        <w:spacing w:line="360" w:lineRule="auto" w:before="0" w:after="60"/>
       </w:pPr>
       <w:r>
-        <w:rPr>
-          <w:rFonts w:ascii="Times New Roman" w:hAnsi="Times New Roman" w:eastAsia="Times New Roman"/>
-          <w:b w:val="0"/>
-          <w:i w:val="0"/>
-          <w:sz w:val="26"/>
-        </w:rPr>
-        <w:t>Nội dung chi tiết: ............................................................................................</w:t>
+        <w:t>Ô: Doanh thu</w:t>
       </w:r>
     </w:p>
     <w:p>
       <w:pPr>
-        <w:spacing w:line="360" w:lineRule="auto" w:before="0" w:after="0"/>
-        <w:jc w:val="left"/>
+        <w:spacing w:line="360" w:lineRule="auto" w:before="0" w:after="60"/>
       </w:pPr>
       <w:r>
-        <w:rPr>
-          <w:rFonts w:ascii="Times New Roman" w:hAnsi="Times New Roman" w:eastAsia="Times New Roman"/>
-          <w:b w:val="0"/>
-          <w:i/>
-          <w:sz w:val="26"/>
-        </w:rPr>
-        <w:t>[Chèn hình 21: 5.3 Kết quả thực nghiệm]</w:t>
+        <w:t>Tổng ETH đã nhận</w:t>
       </w:r>
     </w:p>
     <w:p>
       <w:pPr>
-        <w:spacing w:line="360" w:lineRule="auto" w:before="0" w:after="0"/>
-        <w:jc w:val="left"/>
+        <w:pStyle w:val="Heading1"/>
+        <w:spacing w:line="360" w:lineRule="auto" w:before="0" w:after="60"/>
       </w:pPr>
       <w:r>
-        <w:rPr>
-          <w:rFonts w:ascii="Times New Roman" w:hAnsi="Times New Roman" w:eastAsia="Times New Roman"/>
-          <w:b w:val="0"/>
-          <w:i/>
-          <w:sz w:val="26"/>
-        </w:rPr>
-        <w:t>[Chèn bảng 21: 5.3 Kết quả thực nghiệm]</w:t>
+        <w:t>5. LUỒNG TỔNG THỂ (QUAN TRỌNG NHẤT)</w:t>
       </w:r>
     </w:p>
     <w:p>
       <w:pPr>
-        <w:spacing w:line="360" w:lineRule="auto" w:before="0" w:after="0"/>
-        <w:jc w:val="left"/>
+        <w:spacing w:line="360" w:lineRule="auto" w:before="0" w:after="60"/>
       </w:pPr>
       <w:r>
-        <w:rPr>
-          <w:rFonts w:ascii="Times New Roman" w:hAnsi="Times New Roman" w:eastAsia="Times New Roman"/>
-          <w:b w:val="0"/>
-          <w:i/>
-          <w:sz w:val="26"/>
-        </w:rPr>
-        <w:t>[Chèn sơ đồ 21: 5.3 Kết quả thực nghiệm]</w:t>
+        <w:t>User Flow</w:t>
       </w:r>
     </w:p>
     <w:p>
       <w:pPr>
-        <w:pStyle w:val="Heading2"/>
-        <w:spacing w:line="360" w:lineRule="auto" w:after="60"/>
+        <w:spacing w:line="360" w:lineRule="auto" w:before="0" w:after="60"/>
       </w:pPr>
       <w:r>
-        <w:t>5.4 Nhận xét</w:t>
+        <w:t>User → Connect Wallet</w:t>
+        <w:br/>
+        <w:t>→ Xem sân</w:t>
+        <w:br/>
+        <w:t>→ Đặt sân</w:t>
+        <w:br/>
+        <w:t>→ MetaMask confirm</w:t>
+        <w:br/>
+        <w:t>→ Smart Contract xử lý</w:t>
+        <w:br/>
+        <w:t>→ ETH chuyển</w:t>
+        <w:br/>
+        <w:t>→ UI cập nhật</w:t>
       </w:r>
     </w:p>
     <w:p>
       <w:pPr>
-        <w:spacing w:line="360" w:lineRule="auto" w:before="0" w:after="0"/>
-        <w:jc w:val="left"/>
+        <w:spacing w:line="360" w:lineRule="auto" w:before="0" w:after="60"/>
       </w:pPr>
       <w:r>
-        <w:rPr>
-          <w:rFonts w:ascii="Times New Roman" w:hAnsi="Times New Roman" w:eastAsia="Times New Roman"/>
-          <w:b w:val="0"/>
-          <w:i w:val="0"/>
-          <w:sz w:val="26"/>
-        </w:rPr>
-        <w:t>Nội dung chi tiết: ............................................................................................</w:t>
+        <w:t>Admin Flow</w:t>
       </w:r>
     </w:p>
     <w:p>
       <w:pPr>
-        <w:spacing w:line="360" w:lineRule="auto" w:before="0" w:after="0"/>
-        <w:jc w:val="left"/>
+        <w:spacing w:line="360" w:lineRule="auto" w:before="0" w:after="60"/>
       </w:pPr>
       <w:r>
-        <w:rPr>
-          <w:rFonts w:ascii="Times New Roman" w:hAnsi="Times New Roman" w:eastAsia="Times New Roman"/>
-          <w:b w:val="0"/>
-          <w:i/>
-          <w:sz w:val="26"/>
-        </w:rPr>
-        <w:t>[Chèn hình 22: 5.4 Nhận xét]</w:t>
+        <w:t>Admin → Connect Wallet</w:t>
+        <w:br/>
+        <w:t>→ Có quyền admin</w:t>
+        <w:br/>
+        <w:t>→ Tạo/sửa/xóa sân</w:t>
+        <w:br/>
+        <w:t>→ Theo dõi doanh thu</w:t>
       </w:r>
     </w:p>
     <w:p>
       <w:pPr>
-        <w:spacing w:line="360" w:lineRule="auto" w:before="0" w:after="0"/>
-        <w:jc w:val="left"/>
+        <w:spacing w:line="360" w:lineRule="auto" w:before="0" w:after="60"/>
       </w:pPr>
       <w:r>
-        <w:rPr>
-          <w:rFonts w:ascii="Times New Roman" w:hAnsi="Times New Roman" w:eastAsia="Times New Roman"/>
-          <w:b w:val="0"/>
-          <w:i/>
-          <w:sz w:val="26"/>
-        </w:rPr>
-        <w:t>[Chèn bảng 22: 5.4 Nhận xét]</w:t>
+        <w:t>PROMT Cho Word</w:t>
+        <w:br/>
+        <w:t>Hãy thực hiện ngay việc viết một báo cáo hoàn chỉnh cho đề tài:</w:t>
       </w:r>
     </w:p>
     <w:p>
       <w:pPr>
-        <w:spacing w:line="360" w:lineRule="auto" w:before="0" w:after="0"/>
-        <w:jc w:val="left"/>
+        <w:spacing w:line="360" w:lineRule="auto" w:before="0" w:after="60"/>
       </w:pPr>
       <w:r>
-        <w:rPr>
-          <w:rFonts w:ascii="Times New Roman" w:hAnsi="Times New Roman" w:eastAsia="Times New Roman"/>
-          <w:b w:val="0"/>
-          <w:i/>
-          <w:sz w:val="26"/>
-        </w:rPr>
-        <w:t>[Chèn sơ đồ 22: 5.4 Nhận xét]</w:t>
+        <w:t>Xây dựng ứng dụng DApp đặt sân thể thao sử dụng Blockchain"</w:t>
       </w:r>
     </w:p>
     <w:p>
       <w:pPr>
-        <w:pStyle w:val="Heading1"/>
-        <w:spacing w:line="360" w:lineRule="auto" w:after="60"/>
+        <w:spacing w:line="360" w:lineRule="auto" w:before="0" w:after="60"/>
       </w:pPr>
       <w:r>
-        <w:t>CHƯƠNG 6: ĐÁNH GIÁ HỆ THỐNG &amp; HƯỚNG PHÁT TRIỂN</w:t>
+        <w:t>YÊU CẦU BẮT BUỘC:</w:t>
       </w:r>
     </w:p>
     <w:p>
       <w:pPr>
-        <w:pStyle w:val="Heading2"/>
-        <w:spacing w:line="360" w:lineRule="auto" w:after="60"/>
+        <w:spacing w:line="360" w:lineRule="auto" w:before="0" w:after="60"/>
       </w:pPr>
       <w:r>
-        <w:t>6.1 Ưu điểm</w:t>
+        <w:t>Viết theo chuẩn báo cáo học thuật CNTT</w:t>
       </w:r>
     </w:p>
     <w:p>
       <w:pPr>
-        <w:spacing w:line="360" w:lineRule="auto" w:before="0" w:after="0"/>
-        <w:jc w:val="left"/>
+        <w:spacing w:line="360" w:lineRule="auto" w:before="0" w:after="60"/>
       </w:pPr>
       <w:r>
-        <w:rPr>
-          <w:rFonts w:ascii="Times New Roman" w:hAnsi="Times New Roman" w:eastAsia="Times New Roman"/>
-          <w:b w:val="0"/>
-          <w:i w:val="0"/>
-          <w:sz w:val="26"/>
-        </w:rPr>
-        <w:t>Nội dung chi tiết: ............................................................................................</w:t>
+        <w:t>Font Times New Roman, cỡ 13</w:t>
       </w:r>
     </w:p>
     <w:p>
       <w:pPr>
-        <w:spacing w:line="360" w:lineRule="auto" w:before="0" w:after="0"/>
-        <w:jc w:val="left"/>
+        <w:spacing w:line="360" w:lineRule="auto" w:before="0" w:after="60"/>
       </w:pPr>
       <w:r>
-        <w:rPr>
-          <w:rFonts w:ascii="Times New Roman" w:hAnsi="Times New Roman" w:eastAsia="Times New Roman"/>
-          <w:b w:val="0"/>
-          <w:i/>
-          <w:sz w:val="26"/>
-        </w:rPr>
-        <w:t>[Chèn hình 23: 6.1 Ưu điểm]</w:t>
+        <w:t>Không sử dụng dấu chấm đầu dòng</w:t>
       </w:r>
     </w:p>
     <w:p>
       <w:pPr>
-        <w:spacing w:line="360" w:lineRule="auto" w:before="0" w:after="0"/>
-        <w:jc w:val="left"/>
+        <w:spacing w:line="360" w:lineRule="auto" w:before="0" w:after="60"/>
       </w:pPr>
       <w:r>
-        <w:rPr>
-          <w:rFonts w:ascii="Times New Roman" w:hAnsi="Times New Roman" w:eastAsia="Times New Roman"/>
-          <w:b w:val="0"/>
-          <w:i/>
-          <w:sz w:val="26"/>
-        </w:rPr>
-        <w:t>[Chèn bảng 23: 6.1 Ưu điểm]</w:t>
+        <w:t>Giãn dòng 1.5</w:t>
       </w:r>
     </w:p>
     <w:p>
       <w:pPr>
-        <w:spacing w:line="360" w:lineRule="auto" w:before="0" w:after="0"/>
-        <w:jc w:val="left"/>
+        <w:spacing w:line="360" w:lineRule="auto" w:before="0" w:after="60"/>
       </w:pPr>
       <w:r>
-        <w:rPr>
-          <w:rFonts w:ascii="Times New Roman" w:hAnsi="Times New Roman" w:eastAsia="Times New Roman"/>
-          <w:b w:val="0"/>
-          <w:i/>
-          <w:sz w:val="26"/>
-        </w:rPr>
-        <w:t>[Chèn sơ đồ 23: 6.1 Ưu điểm]</w:t>
+        <w:t>Đánh số chương mục rõ ràng (Chương 1 → Chương 7)</w:t>
       </w:r>
     </w:p>
     <w:p>
       <w:pPr>
-        <w:pStyle w:val="Heading2"/>
-        <w:spacing w:line="360" w:lineRule="auto" w:after="60"/>
+        <w:spacing w:line="360" w:lineRule="auto" w:before="0" w:after="60"/>
       </w:pPr>
       <w:r>
-        <w:t>6.2 Hạn chế</w:t>
+        <w:t>Văn phong chuyên ngành, không viết chung chung</w:t>
       </w:r>
     </w:p>
     <w:p>
       <w:pPr>
-        <w:spacing w:line="360" w:lineRule="auto" w:before="0" w:after="0"/>
-        <w:jc w:val="left"/>
+        <w:spacing w:line="360" w:lineRule="auto" w:before="0" w:after="60"/>
       </w:pPr>
       <w:r>
-        <w:rPr>
-          <w:rFonts w:ascii="Times New Roman" w:hAnsi="Times New Roman" w:eastAsia="Times New Roman"/>
-          <w:b w:val="0"/>
-          <w:i w:val="0"/>
-          <w:sz w:val="26"/>
-        </w:rPr>
-        <w:t>Nội dung chi tiết: ............................................................................................</w:t>
+        <w:t>Nội dung phải logic như một dự án thực tế</w:t>
       </w:r>
     </w:p>
     <w:p>
       <w:pPr>
-        <w:spacing w:line="360" w:lineRule="auto" w:before="0" w:after="0"/>
-        <w:jc w:val="left"/>
+        <w:spacing w:line="360" w:lineRule="auto" w:before="0" w:after="60"/>
       </w:pPr>
       <w:r>
-        <w:rPr>
-          <w:rFonts w:ascii="Times New Roman" w:hAnsi="Times New Roman" w:eastAsia="Times New Roman"/>
-          <w:b w:val="0"/>
-          <w:i/>
-          <w:sz w:val="26"/>
-        </w:rPr>
-        <w:t>[Chèn hình 24: 6.2 Hạn chế]</w:t>
+        <w:t>THÔNG TIN CỤ THỂ:</w:t>
       </w:r>
     </w:p>
     <w:p>
       <w:pPr>
-        <w:spacing w:line="360" w:lineRule="auto" w:before="0" w:after="0"/>
-        <w:jc w:val="left"/>
+        <w:spacing w:line="360" w:lineRule="auto" w:before="0" w:after="60"/>
       </w:pPr>
       <w:r>
-        <w:rPr>
-          <w:rFonts w:ascii="Times New Roman" w:hAnsi="Times New Roman" w:eastAsia="Times New Roman"/>
-          <w:b w:val="0"/>
-          <w:i/>
-          <w:sz w:val="26"/>
-        </w:rPr>
-        <w:t>[Chèn bảng 24: 6.2 Hạn chế]</w:t>
+        <w:t>Học phần: Blockchain và ứng dụng</w:t>
       </w:r>
     </w:p>
     <w:p>
       <w:pPr>
-        <w:spacing w:line="360" w:lineRule="auto" w:before="0" w:after="0"/>
-        <w:jc w:val="left"/>
+        <w:spacing w:line="360" w:lineRule="auto" w:before="0" w:after="60"/>
       </w:pPr>
       <w:r>
-        <w:rPr>
-          <w:rFonts w:ascii="Times New Roman" w:hAnsi="Times New Roman" w:eastAsia="Times New Roman"/>
-          <w:b w:val="0"/>
-          <w:i/>
-          <w:sz w:val="26"/>
-        </w:rPr>
-        <w:t>[Chèn sơ đồ 24: 6.2 Hạn chế]</w:t>
+        <w:t>Giảng viên: Thầy Huỳnh Minh Châu</w:t>
       </w:r>
     </w:p>
     <w:p>
       <w:pPr>
-        <w:pStyle w:val="Heading2"/>
-        <w:spacing w:line="360" w:lineRule="auto" w:after="60"/>
+        <w:spacing w:line="360" w:lineRule="auto" w:before="0" w:after="60"/>
       </w:pPr>
       <w:r>
-        <w:t>6.3 Hướng phát triển lên testnet</w:t>
+        <w:t>Lớp: DHCNTT23A-CS</w:t>
       </w:r>
     </w:p>
     <w:p>
       <w:pPr>
-        <w:spacing w:line="360" w:lineRule="auto" w:before="0" w:after="0"/>
-        <w:jc w:val="left"/>
+        <w:spacing w:line="360" w:lineRule="auto" w:before="0" w:after="60"/>
       </w:pPr>
       <w:r>
-        <w:rPr>
-          <w:rFonts w:ascii="Times New Roman" w:hAnsi="Times New Roman" w:eastAsia="Times New Roman"/>
-          <w:b w:val="0"/>
-          <w:i w:val="0"/>
-          <w:sz w:val="26"/>
-        </w:rPr>
-        <w:t>Nội dung chi tiết: ............................................................................................</w:t>
+        <w:t>Thành viên:</w:t>
+        <w:br/>
+        <w:t>Lê Thanh Trân</w:t>
+        <w:br/>
+        <w:t>Lê Mai Trường Chinh</w:t>
+        <w:br/>
+        <w:t>Hồ Nguyên Đức Anh Hào</w:t>
+        <w:br/>
+        <w:t>Võ Tấn Qui</w:t>
       </w:r>
     </w:p>
     <w:p>
       <w:pPr>
-        <w:spacing w:line="360" w:lineRule="auto" w:before="0" w:after="0"/>
-        <w:jc w:val="left"/>
+        <w:spacing w:line="360" w:lineRule="auto" w:before="0" w:after="60"/>
       </w:pPr>
       <w:r>
-        <w:rPr>
-          <w:rFonts w:ascii="Times New Roman" w:hAnsi="Times New Roman" w:eastAsia="Times New Roman"/>
-          <w:b w:val="0"/>
-          <w:i/>
-          <w:sz w:val="26"/>
-        </w:rPr>
-        <w:t>[Chèn hình 25: 6.3 Hướng phát triển lên testnet]</w:t>
+        <w:t>CÔNG NGHỆ SỬ DỤNG:</w:t>
       </w:r>
     </w:p>
     <w:p>
       <w:pPr>
-        <w:spacing w:line="360" w:lineRule="auto" w:before="0" w:after="0"/>
-        <w:jc w:val="left"/>
+        <w:spacing w:line="360" w:lineRule="auto" w:before="0" w:after="60"/>
       </w:pPr>
       <w:r>
-        <w:rPr>
-          <w:rFonts w:ascii="Times New Roman" w:hAnsi="Times New Roman" w:eastAsia="Times New Roman"/>
-          <w:b w:val="0"/>
-          <w:i/>
-          <w:sz w:val="26"/>
-        </w:rPr>
-        <w:t>[Chèn bảng 25: 6.3 Hướng phát triển lên testnet]</w:t>
+        <w:t>Hardhat localhost</w:t>
       </w:r>
     </w:p>
     <w:p>
       <w:pPr>
-        <w:spacing w:line="360" w:lineRule="auto" w:before="0" w:after="0"/>
-        <w:jc w:val="left"/>
+        <w:spacing w:line="360" w:lineRule="auto" w:before="0" w:after="60"/>
       </w:pPr>
       <w:r>
-        <w:rPr>
-          <w:rFonts w:ascii="Times New Roman" w:hAnsi="Times New Roman" w:eastAsia="Times New Roman"/>
-          <w:b w:val="0"/>
-          <w:i/>
-          <w:sz w:val="26"/>
-        </w:rPr>
-        <w:t>[Chèn sơ đồ 25: 6.3 Hướng phát triển lên testnet]</w:t>
+        <w:t>MetaMask (import account)</w:t>
       </w:r>
     </w:p>
     <w:p>
       <w:pPr>
-        <w:pStyle w:val="Heading1"/>
-        <w:spacing w:line="360" w:lineRule="auto" w:after="60"/>
+        <w:spacing w:line="360" w:lineRule="auto" w:before="0" w:after="60"/>
       </w:pPr>
       <w:r>
-        <w:t>CHƯƠNG 7: KẾT LUẬN</w:t>
+        <w:t>Smart Contract Solidity</w:t>
       </w:r>
     </w:p>
     <w:p>
       <w:pPr>
-        <w:pStyle w:val="Heading2"/>
-        <w:spacing w:line="360" w:lineRule="auto" w:after="60"/>
+        <w:spacing w:line="360" w:lineRule="auto" w:before="0" w:after="60"/>
       </w:pPr>
       <w:r>
-        <w:t>7.1 Kết quả đạt được</w:t>
+        <w:t>Backend API (.NET hoặc NodeJS)</w:t>
       </w:r>
     </w:p>
     <w:p>
       <w:pPr>
-        <w:spacing w:line="360" w:lineRule="auto" w:before="0" w:after="0"/>
-        <w:jc w:val="left"/>
+        <w:spacing w:line="360" w:lineRule="auto" w:before="0" w:after="60"/>
       </w:pPr>
       <w:r>
-        <w:rPr>
-          <w:rFonts w:ascii="Times New Roman" w:hAnsi="Times New Roman" w:eastAsia="Times New Roman"/>
-          <w:b w:val="0"/>
-          <w:i w:val="0"/>
-          <w:sz w:val="26"/>
-        </w:rPr>
-        <w:t>Nội dung chi tiết: ............................................................................................</w:t>
+        <w:t>Frontend Web</w:t>
       </w:r>
     </w:p>
     <w:p>
       <w:pPr>
-        <w:spacing w:line="360" w:lineRule="auto" w:before="0" w:after="0"/>
-        <w:jc w:val="left"/>
+        <w:spacing w:line="360" w:lineRule="auto" w:before="0" w:after="60"/>
       </w:pPr>
       <w:r>
-        <w:rPr>
-          <w:rFonts w:ascii="Times New Roman" w:hAnsi="Times New Roman" w:eastAsia="Times New Roman"/>
-          <w:b w:val="0"/>
-          <w:i/>
-          <w:sz w:val="26"/>
-        </w:rPr>
-        <w:t>[Chèn hình 26: 7.1 Kết quả đạt được]</w:t>
+        <w:t>Deploy Azure (frontend + backend), blockchain chạy local</w:t>
       </w:r>
     </w:p>
     <w:p>
       <w:pPr>
-        <w:spacing w:line="360" w:lineRule="auto" w:before="0" w:after="0"/>
-        <w:jc w:val="left"/>
+        <w:spacing w:line="360" w:lineRule="auto" w:before="0" w:after="60"/>
       </w:pPr>
       <w:r>
-        <w:rPr>
-          <w:rFonts w:ascii="Times New Roman" w:hAnsi="Times New Roman" w:eastAsia="Times New Roman"/>
-          <w:b w:val="0"/>
-          <w:i/>
-          <w:sz w:val="26"/>
-        </w:rPr>
-        <w:t>[Chèn bảng 26: 7.1 Kết quả đạt được]</w:t>
+        <w:t>YÊU CẦU TRIỂN KHAI NỘI DUNG:</w:t>
       </w:r>
     </w:p>
     <w:p>
       <w:pPr>
-        <w:spacing w:line="360" w:lineRule="auto" w:before="0" w:after="0"/>
-        <w:jc w:val="left"/>
+        <w:spacing w:line="360" w:lineRule="auto" w:before="0" w:after="60"/>
       </w:pPr>
       <w:r>
-        <w:rPr>
-          <w:rFonts w:ascii="Times New Roman" w:hAnsi="Times New Roman" w:eastAsia="Times New Roman"/>
-          <w:b w:val="0"/>
-          <w:i/>
-          <w:sz w:val="26"/>
-        </w:rPr>
-        <w:t>[Chèn sơ đồ 26: 7.1 Kết quả đạt được]</w:t>
+        <w:t>BƯỚC 1:</w:t>
+        <w:br/>
+        <w:t>Phân tích đề tài và xác định kiến trúc hệ thống gồm:</w:t>
+        <w:br/>
+        <w:t>Frontend – Backend – Blockchain</w:t>
       </w:r>
     </w:p>
     <w:p>
       <w:pPr>
-        <w:pStyle w:val="Heading2"/>
-        <w:spacing w:line="360" w:lineRule="auto" w:after="60"/>
+        <w:spacing w:line="360" w:lineRule="auto" w:before="0" w:after="60"/>
       </w:pPr>
       <w:r>
-        <w:t>7.2 Đóng góp</w:t>
+        <w:t>BƯỚC 2:</w:t>
+        <w:br/>
+        <w:t>Viết Chương 1:</w:t>
       </w:r>
     </w:p>
     <w:p>
       <w:pPr>
-        <w:spacing w:line="360" w:lineRule="auto" w:before="0" w:after="0"/>
-        <w:jc w:val="left"/>
+        <w:spacing w:line="360" w:lineRule="auto" w:before="0" w:after="60"/>
       </w:pPr>
       <w:r>
-        <w:rPr>
-          <w:rFonts w:ascii="Times New Roman" w:hAnsi="Times New Roman" w:eastAsia="Times New Roman"/>
-          <w:b w:val="0"/>
-          <w:i w:val="0"/>
-          <w:sz w:val="26"/>
-        </w:rPr>
-        <w:t>Nội dung chi tiết: ............................................................................................</w:t>
+        <w:t>Tổng quan DApp</w:t>
       </w:r>
     </w:p>
     <w:p>
       <w:pPr>
-        <w:spacing w:line="360" w:lineRule="auto" w:before="0" w:after="0"/>
-        <w:jc w:val="left"/>
+        <w:spacing w:line="360" w:lineRule="auto" w:before="0" w:after="60"/>
       </w:pPr>
       <w:r>
-        <w:rPr>
-          <w:rFonts w:ascii="Times New Roman" w:hAnsi="Times New Roman" w:eastAsia="Times New Roman"/>
-          <w:b w:val="0"/>
-          <w:i/>
-          <w:sz w:val="26"/>
-        </w:rPr>
-        <w:t>[Chèn hình 27: 7.2 Đóng góp]</w:t>
+        <w:t>Lý do chọn đề tài</w:t>
       </w:r>
     </w:p>
     <w:p>
       <w:pPr>
-        <w:spacing w:line="360" w:lineRule="auto" w:before="0" w:after="0"/>
-        <w:jc w:val="left"/>
+        <w:spacing w:line="360" w:lineRule="auto" w:before="0" w:after="60"/>
       </w:pPr>
       <w:r>
-        <w:rPr>
-          <w:rFonts w:ascii="Times New Roman" w:hAnsi="Times New Roman" w:eastAsia="Times New Roman"/>
-          <w:b w:val="0"/>
-          <w:i/>
-          <w:sz w:val="26"/>
-        </w:rPr>
-        <w:t>[Chèn bảng 27: 7.2 Đóng góp]</w:t>
+        <w:t>Mục tiêu và phạm vi</w:t>
       </w:r>
     </w:p>
     <w:p>
       <w:pPr>
-        <w:spacing w:line="360" w:lineRule="auto" w:before="0" w:after="0"/>
-        <w:jc w:val="left"/>
+        <w:spacing w:line="360" w:lineRule="auto" w:before="0" w:after="60"/>
       </w:pPr>
       <w:r>
-        <w:rPr>
-          <w:rFonts w:ascii="Times New Roman" w:hAnsi="Times New Roman" w:eastAsia="Times New Roman"/>
-          <w:b w:val="0"/>
-          <w:i/>
-          <w:sz w:val="26"/>
-        </w:rPr>
-        <w:t>[Chèn sơ đồ 27: 7.2 Đóng góp]</w:t>
+        <w:t>BƯỚC 3:</w:t>
+        <w:br/>
+        <w:t>Viết Chương 2:</w:t>
       </w:r>
     </w:p>
     <w:p>
       <w:pPr>
-        <w:pStyle w:val="Heading2"/>
-        <w:spacing w:line="360" w:lineRule="auto" w:after="60"/>
+        <w:spacing w:line="360" w:lineRule="auto" w:before="0" w:after="60"/>
       </w:pPr>
       <w:r>
-        <w:t>7.3 Đề xuất mở rộng</w:t>
+        <w:t>Thiết kế hệ thống</w:t>
       </w:r>
     </w:p>
     <w:p>
       <w:pPr>
-        <w:spacing w:line="360" w:lineRule="auto" w:before="0" w:after="0"/>
-        <w:jc w:val="left"/>
+        <w:spacing w:line="360" w:lineRule="auto" w:before="0" w:after="60"/>
       </w:pPr>
       <w:r>
-        <w:rPr>
-          <w:rFonts w:ascii="Times New Roman" w:hAnsi="Times New Roman" w:eastAsia="Times New Roman"/>
-          <w:b w:val="0"/>
-          <w:i w:val="0"/>
-          <w:sz w:val="26"/>
-        </w:rPr>
-        <w:t>Nội dung chi tiết: ............................................................................................</w:t>
+        <w:t>Luồng đặt sân</w:t>
       </w:r>
     </w:p>
     <w:p>
       <w:pPr>
-        <w:spacing w:line="360" w:lineRule="auto" w:before="0" w:after="0"/>
-        <w:jc w:val="left"/>
+        <w:spacing w:line="360" w:lineRule="auto" w:before="0" w:after="60"/>
       </w:pPr>
       <w:r>
-        <w:rPr>
-          <w:rFonts w:ascii="Times New Roman" w:hAnsi="Times New Roman" w:eastAsia="Times New Roman"/>
-          <w:b w:val="0"/>
-          <w:i/>
-          <w:sz w:val="26"/>
-        </w:rPr>
-        <w:t>[Chèn hình 28: 7.3 Đề xuất mở rộng]</w:t>
+        <w:t>Luồng thanh toán ETH</w:t>
       </w:r>
     </w:p>
     <w:p>
       <w:pPr>
-        <w:spacing w:line="360" w:lineRule="auto" w:before="0" w:after="0"/>
-        <w:jc w:val="left"/>
+        <w:spacing w:line="360" w:lineRule="auto" w:before="0" w:after="60"/>
       </w:pPr>
       <w:r>
-        <w:rPr>
-          <w:rFonts w:ascii="Times New Roman" w:hAnsi="Times New Roman" w:eastAsia="Times New Roman"/>
-          <w:b w:val="0"/>
-          <w:i/>
-          <w:sz w:val="26"/>
-        </w:rPr>
-        <w:t>[Chèn bảng 28: 7.3 Đề xuất mở rộng]</w:t>
+        <w:t>Kết nối MetaMask</w:t>
       </w:r>
     </w:p>
     <w:p>
       <w:pPr>
-        <w:spacing w:line="360" w:lineRule="auto" w:before="0" w:after="0"/>
-        <w:jc w:val="left"/>
+        <w:spacing w:line="360" w:lineRule="auto" w:before="0" w:after="60"/>
       </w:pPr>
       <w:r>
-        <w:rPr>
-          <w:rFonts w:ascii="Times New Roman" w:hAnsi="Times New Roman" w:eastAsia="Times New Roman"/>
-          <w:b w:val="0"/>
-          <w:i/>
-          <w:sz w:val="26"/>
-        </w:rPr>
-        <w:t>[Chèn sơ đồ 28: 7.3 Đề xuất mở rộng]</w:t>
+        <w:t>Phân tích Hardhat localhost</w:t>
       </w:r>
     </w:p>
     <w:p>
       <w:pPr>
-        <w:pStyle w:val="Heading1"/>
-        <w:spacing w:line="360" w:lineRule="auto" w:after="60"/>
+        <w:spacing w:line="360" w:lineRule="auto" w:before="0" w:after="60"/>
       </w:pPr>
       <w:r>
-        <w:t>PHỤ LỤC</w:t>
+        <w:t>BƯỚC 4:</w:t>
+        <w:br/>
+        <w:t>Viết Chương 3:</w:t>
       </w:r>
     </w:p>
     <w:p>
       <w:pPr>
-        <w:spacing w:line="360" w:lineRule="auto" w:before="0" w:after="0"/>
-        <w:jc w:val="left"/>
+        <w:spacing w:line="360" w:lineRule="auto" w:before="0" w:after="60"/>
       </w:pPr>
       <w:r>
-        <w:rPr>
-          <w:rFonts w:ascii="Times New Roman" w:hAnsi="Times New Roman" w:eastAsia="Times New Roman"/>
-          <w:b w:val="0"/>
-          <w:i w:val="0"/>
-          <w:sz w:val="28"/>
-        </w:rPr>
-        <w:t>Phụ lục A: Mẫu API, request/response.</w:t>
+        <w:t>Triển khai Smart Contract</w:t>
       </w:r>
     </w:p>
     <w:p>
       <w:pPr>
-        <w:spacing w:line="360" w:lineRule="auto" w:before="0" w:after="0"/>
-        <w:jc w:val="left"/>
+        <w:spacing w:line="360" w:lineRule="auto" w:before="0" w:after="60"/>
       </w:pPr>
       <w:r>
-        <w:rPr>
-          <w:rFonts w:ascii="Times New Roman" w:hAnsi="Times New Roman" w:eastAsia="Times New Roman"/>
-          <w:b w:val="0"/>
-          <w:i w:val="0"/>
-          <w:sz w:val="28"/>
-        </w:rPr>
-        <w:t>Phụ lục B: Danh sách hàm Smart Contract.</w:t>
+        <w:t>Kết nối blockchain</w:t>
       </w:r>
     </w:p>
     <w:p>
       <w:pPr>
-        <w:spacing w:line="360" w:lineRule="auto" w:before="0" w:after="0"/>
-        <w:jc w:val="left"/>
+        <w:spacing w:line="360" w:lineRule="auto" w:before="0" w:after="60"/>
       </w:pPr>
       <w:r>
-        <w:rPr>
-          <w:rFonts w:ascii="Times New Roman" w:hAnsi="Times New Roman" w:eastAsia="Times New Roman"/>
-          <w:b w:val="0"/>
-          <w:i w:val="0"/>
-          <w:sz w:val="28"/>
-        </w:rPr>
-        <w:t>Phụ lục C: Ảnh chụp màn hình giao diện và giao dịch.</w:t>
+        <w:t>Xử lý transaction</w:t>
       </w:r>
     </w:p>
     <w:p>
       <w:pPr>
-        <w:pStyle w:val="Heading1"/>
-        <w:spacing w:line="360" w:lineRule="auto" w:after="60"/>
+        <w:spacing w:line="360" w:lineRule="auto" w:before="0" w:after="60"/>
       </w:pPr>
       <w:r>
-        <w:t>TÀI LIỆU THAM KHẢO</w:t>
+        <w:t>API backend</w:t>
       </w:r>
     </w:p>
     <w:p>
       <w:pPr>
-        <w:spacing w:line="360" w:lineRule="auto" w:before="0" w:after="0"/>
-        <w:jc w:val="left"/>
+        <w:spacing w:line="360" w:lineRule="auto" w:before="0" w:after="60"/>
       </w:pPr>
       <w:r>
-        <w:rPr>
-          <w:rFonts w:ascii="Times New Roman" w:hAnsi="Times New Roman" w:eastAsia="Times New Roman"/>
-          <w:b w:val="0"/>
-          <w:i w:val="0"/>
-          <w:sz w:val="28"/>
-        </w:rPr>
-        <w:t>Ethereum Documentation</w:t>
+        <w:t>Deploy Azure</w:t>
       </w:r>
     </w:p>
     <w:p>
       <w:pPr>
-        <w:spacing w:line="360" w:lineRule="auto" w:before="0" w:after="0"/>
-        <w:jc w:val="left"/>
+        <w:spacing w:line="360" w:lineRule="auto" w:before="0" w:after="60"/>
       </w:pPr>
       <w:r>
-        <w:rPr>
-          <w:rFonts w:ascii="Times New Roman" w:hAnsi="Times New Roman" w:eastAsia="Times New Roman"/>
-          <w:b w:val="0"/>
-          <w:i w:val="0"/>
-          <w:sz w:val="28"/>
-        </w:rPr>
-        <w:t>Hardhat Documentation</w:t>
+        <w:t>BƯỚC 5:</w:t>
+        <w:br/>
+        <w:t>Viết Chương 4:</w:t>
       </w:r>
     </w:p>
     <w:p>
       <w:pPr>
-        <w:spacing w:line="360" w:lineRule="auto" w:before="0" w:after="0"/>
-        <w:jc w:val="left"/>
+        <w:spacing w:line="360" w:lineRule="auto" w:before="0" w:after="60"/>
       </w:pPr>
       <w:r>
-        <w:rPr>
-          <w:rFonts w:ascii="Times New Roman" w:hAnsi="Times New Roman" w:eastAsia="Times New Roman"/>
-          <w:b w:val="0"/>
-          <w:i w:val="0"/>
-          <w:sz w:val="28"/>
-        </w:rPr>
-        <w:t>MetaMask Developer Documentation</w:t>
+        <w:t>Chức năng Admin: tạo/sửa/xóa sân, thống kê</w:t>
       </w:r>
     </w:p>
     <w:p>
       <w:pPr>
-        <w:spacing w:line="360" w:lineRule="auto" w:before="0" w:after="0"/>
-        <w:jc w:val="left"/>
+        <w:spacing w:line="360" w:lineRule="auto" w:before="0" w:after="60"/>
       </w:pPr>
       <w:r>
-        <w:rPr>
-          <w:rFonts w:ascii="Times New Roman" w:hAnsi="Times New Roman" w:eastAsia="Times New Roman"/>
-          <w:b w:val="0"/>
-          <w:i w:val="0"/>
-          <w:sz w:val="28"/>
-        </w:rPr>
-        <w:t>Solidity Documentation</w:t>
+        <w:t>Chức năng User: đặt sân, thanh toán, xem lịch sử</w:t>
+      </w:r>
+    </w:p>
+    <w:p>
+      <w:pPr>
+        <w:spacing w:line="360" w:lineRule="auto" w:before="0" w:after="60"/>
+      </w:pPr>
+      <w:r>
+        <w:t>BƯỚC 6:</w:t>
+        <w:br/>
+        <w:t>Viết Chương 5:</w:t>
+      </w:r>
+    </w:p>
+    <w:p>
+      <w:pPr>
+        <w:spacing w:line="360" w:lineRule="auto" w:before="0" w:after="60"/>
+      </w:pPr>
+      <w:r>
+        <w:t>Kiểm thử hệ thống</w:t>
+      </w:r>
+    </w:p>
+    <w:p>
+      <w:pPr>
+        <w:spacing w:line="360" w:lineRule="auto" w:before="0" w:after="60"/>
+      </w:pPr>
+      <w:r>
+        <w:t>Bảng kết quả kiểm thử</w:t>
+      </w:r>
+    </w:p>
+    <w:p>
+      <w:pPr>
+        <w:spacing w:line="360" w:lineRule="auto" w:before="0" w:after="60"/>
+      </w:pPr>
+      <w:r>
+        <w:t>BƯỚC 7:</w:t>
+        <w:br/>
+        <w:t>Viết Chương 6:</w:t>
+      </w:r>
+    </w:p>
+    <w:p>
+      <w:pPr>
+        <w:spacing w:line="360" w:lineRule="auto" w:before="0" w:after="60"/>
+      </w:pPr>
+      <w:r>
+        <w:t>Đánh giá hệ thống</w:t>
+      </w:r>
+    </w:p>
+    <w:p>
+      <w:pPr>
+        <w:spacing w:line="360" w:lineRule="auto" w:before="0" w:after="60"/>
+      </w:pPr>
+      <w:r>
+        <w:t>Nhược điểm Hardhat localhost</w:t>
+      </w:r>
+    </w:p>
+    <w:p>
+      <w:pPr>
+        <w:spacing w:line="360" w:lineRule="auto" w:before="0" w:after="60"/>
+      </w:pPr>
+      <w:r>
+        <w:t>Hướng phát triển (Sepolia)</w:t>
+      </w:r>
+    </w:p>
+    <w:p>
+      <w:pPr>
+        <w:spacing w:line="360" w:lineRule="auto" w:before="0" w:after="60"/>
+      </w:pPr>
+      <w:r>
+        <w:t>BƯỚC 8:</w:t>
+        <w:br/>
+        <w:t>Viết Chương 7:</w:t>
+      </w:r>
+    </w:p>
+    <w:p>
+      <w:pPr>
+        <w:spacing w:line="360" w:lineRule="auto" w:before="0" w:after="60"/>
+      </w:pPr>
+      <w:r>
+        <w:t>Kết luận</w:t>
+      </w:r>
+    </w:p>
+    <w:p>
+      <w:pPr>
+        <w:spacing w:line="360" w:lineRule="auto" w:before="0" w:after="60"/>
+      </w:pPr>
+      <w:r>
+        <w:t>BƯỚC 9:</w:t>
+        <w:br/>
+        <w:t>Thêm:</w:t>
+      </w:r>
+    </w:p>
+    <w:p>
+      <w:pPr>
+        <w:spacing w:line="360" w:lineRule="auto" w:before="0" w:after="60"/>
+      </w:pPr>
+      <w:r>
+        <w:t>Phụ lục (code, API)</w:t>
+      </w:r>
+    </w:p>
+    <w:p>
+      <w:pPr>
+        <w:spacing w:line="360" w:lineRule="auto" w:before="0" w:after="60"/>
+      </w:pPr>
+      <w:r>
+        <w:t>Tài liệu tham khảo thực tế</w:t>
+      </w:r>
+    </w:p>
+    <w:p>
+      <w:pPr>
+        <w:spacing w:line="360" w:lineRule="auto" w:before="0" w:after="60"/>
+      </w:pPr>
+      <w:r>
+        <w:t>YÊU CẦU NÂNG CAO:</w:t>
+      </w:r>
+    </w:p>
+    <w:p>
+      <w:pPr>
+        <w:spacing w:line="360" w:lineRule="auto" w:before="0" w:after="60"/>
+      </w:pPr>
+      <w:r>
+        <w:t>Sử dụng thuật ngữ chuyên ngành:</w:t>
+        <w:br/>
+        <w:t>DApp, Smart Contract, EVM, JSON-RPC, Transaction Signing, Gas Fee, REST API, Middleware, Authorization</w:t>
+      </w:r>
+    </w:p>
+    <w:p>
+      <w:pPr>
+        <w:spacing w:line="360" w:lineRule="auto" w:before="0" w:after="60"/>
+      </w:pPr>
+      <w:r>
+        <w:t>Có placeholder:</w:t>
+        <w:br/>
+        <w:t>[Hình X], [Bảng Y], [Sơ đồ Z]</w:t>
+      </w:r>
+    </w:p>
+    <w:p>
+      <w:pPr>
+        <w:spacing w:line="360" w:lineRule="auto" w:before="0" w:after="60"/>
+      </w:pPr>
+      <w:r>
+        <w:t>Viết như báo cáo thật để nộp giảng viên</w:t>
+      </w:r>
+    </w:p>
+    <w:p>
+      <w:pPr>
+        <w:spacing w:line="360" w:lineRule="auto" w:before="0" w:after="60"/>
+      </w:pPr>
+      <w:r>
+        <w:t>Nội dung phải chi tiết, logic, không sai thuật ngữ</w:t>
+      </w:r>
+    </w:p>
+    <w:p>
+      <w:pPr>
+        <w:spacing w:line="360" w:lineRule="auto" w:before="0" w:after="60"/>
+      </w:pPr>
+      <w:r>
+        <w:t>THỰC HIỆN NGAY:</w:t>
+      </w:r>
+    </w:p>
+    <w:p>
+      <w:pPr>
+        <w:spacing w:line="360" w:lineRule="auto" w:before="0" w:after="60"/>
+      </w:pPr>
+      <w:r>
+        <w:t>Viết toàn bộ nội dung từ Chương 1 đến Chương 7</w:t>
+      </w:r>
+    </w:p>
+    <w:p>
+      <w:pPr>
+        <w:spacing w:line="360" w:lineRule="auto" w:before="0" w:after="60"/>
+      </w:pPr>
+      <w:r>
+        <w:t>Không giải thích, không hỏi lại</w:t>
+      </w:r>
+    </w:p>
+    <w:p>
+      <w:pPr>
+        <w:spacing w:line="360" w:lineRule="auto" w:before="0" w:after="60"/>
+      </w:pPr>
+      <w:r>
+        <w:t>Xuất ra nội dung hoàn chỉnh có thể copy vào Word</w:t>
       </w:r>
     </w:p>
     <w:sectPr>
@@ -2455,12 +1818,6 @@
       <w:pgMar w:top="1134" w:right="1417" w:bottom="1134" w:left="1417" w:header="720" w:footer="720" w:gutter="0"/>
       <w:cols w:space="720"/>
       <w:docGrid w:linePitch="360"/>
-      <w:pgBorders w:offsetFrom="page">
-        <w:top w:val="single" w:sz="12" w:space="24" w:color="000000"/>
-        <w:left w:val="single" w:sz="12" w:space="24" w:color="000000"/>
-        <w:bottom w:val="single" w:sz="12" w:space="24" w:color="000000"/>
-        <w:right w:val="single" w:sz="12" w:space="24" w:color="000000"/>
-      </w:pgBorders>
     </w:sectPr>
   </w:body>
 </w:document>

</xml_diff>

<commit_message>
Regenerate report DOCX from 20042026 outline with BAOCAOBACKEND-style cover
Agent-Logs-Url: https://github.com/TanQui-Ovnatiuq/BlockChain/sessions/5779a93a-71db-40f8-9bd8-ef6c58d68ef5

Co-authored-by: TanQui-Ovnatiuq <253677590+TanQui-Ovnatiuq@users.noreply.github.com>
</commit_message>
<xml_diff>
--- a/BAOCAO_DAPP_DAT_SAN_20042026.docx
+++ b/BAOCAO_DAPP_DAT_SAN_20042026.docx
@@ -4,13 +4,12 @@
   <w:body>
     <w:p>
       <w:pPr>
-        <w:spacing w:before="0" w:after="60" w:line="360" w:lineRule="auto"/>
+        <w:spacing w:line="360" w:lineRule="auto" w:before="0" w:after="0"/>
         <w:jc w:val="center"/>
       </w:pPr>
       <w:r>
         <w:rPr>
           <w:rFonts w:ascii="Times New Roman" w:hAnsi="Times New Roman" w:eastAsia="Times New Roman"/>
-          <w:b w:val="0"/>
           <w:i w:val="0"/>
           <w:sz w:val="28"/>
         </w:rPr>
@@ -19,13 +18,12 @@
     </w:p>
     <w:p>
       <w:pPr>
-        <w:spacing w:before="0" w:after="60" w:line="360" w:lineRule="auto"/>
+        <w:spacing w:line="360" w:lineRule="auto" w:before="0" w:after="0"/>
         <w:jc w:val="center"/>
       </w:pPr>
       <w:r>
         <w:rPr>
           <w:rFonts w:ascii="Times New Roman" w:hAnsi="Times New Roman" w:eastAsia="Times New Roman"/>
-          <w:b w:val="0"/>
           <w:i w:val="0"/>
           <w:sz w:val="28"/>
         </w:rPr>
@@ -34,7 +32,7 @@
     </w:p>
     <w:p>
       <w:pPr>
-        <w:spacing w:before="0" w:after="60" w:line="360" w:lineRule="auto"/>
+        <w:spacing w:before="120" w:after="120"/>
         <w:jc w:val="center"/>
       </w:pPr>
       <w:r>
@@ -74,13 +72,12 @@
     </w:p>
     <w:p>
       <w:pPr>
-        <w:spacing w:before="0" w:after="60" w:line="360" w:lineRule="auto"/>
+        <w:spacing w:line="360" w:lineRule="auto" w:before="0" w:after="0"/>
         <w:jc w:val="center"/>
       </w:pPr>
       <w:r>
         <w:rPr>
           <w:rFonts w:ascii="Times New Roman" w:hAnsi="Times New Roman" w:eastAsia="Times New Roman"/>
-          <w:b w:val="0"/>
           <w:i w:val="0"/>
           <w:sz w:val="26"/>
         </w:rPr>
@@ -89,13 +86,12 @@
     </w:p>
     <w:p>
       <w:pPr>
-        <w:spacing w:before="0" w:after="60" w:line="360" w:lineRule="auto"/>
+        <w:spacing w:line="360" w:lineRule="auto" w:before="0" w:after="0"/>
         <w:jc w:val="center"/>
       </w:pPr>
       <w:r>
         <w:rPr>
           <w:rFonts w:ascii="Times New Roman" w:hAnsi="Times New Roman" w:eastAsia="Times New Roman"/>
-          <w:b w:val="0"/>
           <w:i w:val="0"/>
           <w:sz w:val="26"/>
         </w:rPr>
@@ -104,13 +100,12 @@
     </w:p>
     <w:p>
       <w:pPr>
-        <w:spacing w:before="0" w:after="60" w:line="360" w:lineRule="auto"/>
+        <w:spacing w:line="360" w:lineRule="auto" w:before="0" w:after="0"/>
         <w:jc w:val="center"/>
       </w:pPr>
       <w:r>
         <w:rPr>
           <w:rFonts w:ascii="Times New Roman" w:hAnsi="Times New Roman" w:eastAsia="Times New Roman"/>
-          <w:b w:val="0"/>
           <w:i w:val="0"/>
           <w:sz w:val="26"/>
         </w:rPr>
@@ -119,13 +114,12 @@
     </w:p>
     <w:p>
       <w:pPr>
-        <w:spacing w:before="0" w:after="60" w:line="360" w:lineRule="auto"/>
+        <w:spacing w:line="360" w:lineRule="auto" w:before="0" w:after="0"/>
         <w:jc w:val="center"/>
       </w:pPr>
       <w:r>
         <w:rPr>
           <w:rFonts w:ascii="Times New Roman" w:hAnsi="Times New Roman" w:eastAsia="Times New Roman"/>
-          <w:b w:val="0"/>
           <w:i w:val="0"/>
           <w:sz w:val="26"/>
         </w:rPr>
@@ -134,13 +128,12 @@
     </w:p>
     <w:p>
       <w:pPr>
-        <w:spacing w:before="0" w:after="60" w:line="360" w:lineRule="auto"/>
+        <w:spacing w:line="360" w:lineRule="auto" w:before="0" w:after="0"/>
         <w:jc w:val="center"/>
       </w:pPr>
       <w:r>
         <w:rPr>
           <w:rFonts w:ascii="Times New Roman" w:hAnsi="Times New Roman" w:eastAsia="Times New Roman"/>
-          <w:b w:val="0"/>
           <w:i w:val="0"/>
           <w:sz w:val="26"/>
         </w:rPr>
@@ -149,13 +142,12 @@
     </w:p>
     <w:p>
       <w:pPr>
-        <w:spacing w:before="0" w:after="60" w:line="360" w:lineRule="auto"/>
+        <w:spacing w:line="360" w:lineRule="auto" w:before="0" w:after="360"/>
         <w:jc w:val="left"/>
       </w:pPr>
       <w:r>
         <w:rPr>
           <w:rFonts w:ascii="Times New Roman" w:hAnsi="Times New Roman" w:eastAsia="Times New Roman"/>
-          <w:b w:val="0"/>
           <w:i w:val="0"/>
           <w:sz w:val="28"/>
         </w:rPr>
@@ -163,43 +155,40 @@
     </w:p>
     <w:p>
       <w:pPr>
-        <w:spacing w:before="0" w:after="60" w:line="360" w:lineRule="auto"/>
+        <w:spacing w:line="360" w:lineRule="auto" w:before="0" w:after="0"/>
         <w:jc w:val="center"/>
       </w:pPr>
       <w:r>
         <w:rPr>
           <w:rFonts w:ascii="Times New Roman" w:hAnsi="Times New Roman" w:eastAsia="Times New Roman"/>
-          <w:b w:val="0"/>
           <w:i w:val="0"/>
           <w:sz w:val="28"/>
         </w:rPr>
-        <w:t>BÁO CÁO KẾT THÚC MÔN BLOCKCHAIN VÀ ỨNG DỤNG:</w:t>
+        <w:t>BÁO CÁO KẾT THÚC MÔN LẬP TRÌNH BACK END:</w:t>
       </w:r>
     </w:p>
     <w:p>
       <w:pPr>
-        <w:spacing w:before="0" w:after="60" w:line="360" w:lineRule="auto"/>
+        <w:spacing w:line="360" w:lineRule="auto" w:before="0" w:after="0"/>
         <w:jc w:val="center"/>
       </w:pPr>
       <w:r>
         <w:rPr>
           <w:rFonts w:ascii="Times New Roman" w:hAnsi="Times New Roman" w:eastAsia="Times New Roman"/>
-          <w:b w:val="0"/>
           <w:i w:val="0"/>
           <w:sz w:val="28"/>
         </w:rPr>
-        <w:t>TRANG WEB DAPP ĐẶT SÂN THỂ THAO</w:t>
+        <w:t>TRANG WEB QUẢNG BÁ PHƯỜNG CAO LÃNH</w:t>
       </w:r>
     </w:p>
     <w:p>
       <w:pPr>
-        <w:spacing w:before="0" w:after="60" w:line="360" w:lineRule="auto"/>
+        <w:spacing w:line="360" w:lineRule="auto" w:before="0" w:after="1000"/>
         <w:jc w:val="left"/>
       </w:pPr>
       <w:r>
         <w:rPr>
           <w:rFonts w:ascii="Times New Roman" w:hAnsi="Times New Roman" w:eastAsia="Times New Roman"/>
-          <w:b w:val="0"/>
           <w:i w:val="0"/>
           <w:sz w:val="28"/>
         </w:rPr>
@@ -207,13 +196,12 @@
     </w:p>
     <w:p>
       <w:pPr>
-        <w:spacing w:before="0" w:after="60" w:line="360" w:lineRule="auto"/>
+        <w:spacing w:line="360" w:lineRule="auto" w:before="0" w:after="0"/>
         <w:jc w:val="center"/>
       </w:pPr>
       <w:r>
         <w:rPr>
           <w:rFonts w:ascii="Times New Roman" w:hAnsi="Times New Roman" w:eastAsia="Times New Roman"/>
-          <w:b w:val="0"/>
           <w:i w:val="0"/>
           <w:sz w:val="28"/>
         </w:rPr>
@@ -222,43 +210,40 @@
     </w:p>
     <w:p>
       <w:pPr>
-        <w:spacing w:before="0" w:after="60" w:line="360" w:lineRule="auto"/>
+        <w:spacing w:line="360" w:lineRule="auto" w:before="0" w:after="0"/>
         <w:jc w:val="center"/>
       </w:pPr>
       <w:r>
         <w:rPr>
           <w:rFonts w:ascii="Times New Roman" w:hAnsi="Times New Roman" w:eastAsia="Times New Roman"/>
-          <w:b w:val="0"/>
           <w:i w:val="0"/>
           <w:sz w:val="28"/>
         </w:rPr>
-        <w:t>LỚP: ĐHCNTT23A-CS.....</w:t>
+        <w:t>LỚP: ĐHCNTT23A-CS</w:t>
       </w:r>
     </w:p>
     <w:p>
       <w:pPr>
-        <w:spacing w:before="0" w:after="60" w:line="360" w:lineRule="auto"/>
+        <w:spacing w:line="360" w:lineRule="auto" w:before="0" w:after="0"/>
         <w:jc w:val="center"/>
       </w:pPr>
       <w:r>
         <w:rPr>
           <w:rFonts w:ascii="Times New Roman" w:hAnsi="Times New Roman" w:eastAsia="Times New Roman"/>
-          <w:b w:val="0"/>
           <w:i w:val="0"/>
           <w:sz w:val="28"/>
         </w:rPr>
-        <w:t>Giảng Viên Hướng Dẫn: Huỳnh Minh Châu</w:t>
+        <w:t>Giảng Viên Hướng Dẫn: Lê Minh Hiếu</w:t>
       </w:r>
     </w:p>
     <w:p>
       <w:pPr>
-        <w:spacing w:before="0" w:after="60" w:line="360" w:lineRule="auto"/>
+        <w:spacing w:line="360" w:lineRule="auto" w:before="480" w:after="0"/>
         <w:jc w:val="right"/>
       </w:pPr>
       <w:r>
         <w:rPr>
           <w:rFonts w:ascii="Times New Roman" w:hAnsi="Times New Roman" w:eastAsia="Times New Roman"/>
-          <w:b w:val="0"/>
           <w:i/>
           <w:sz w:val="26"/>
         </w:rPr>
@@ -267,7 +252,6 @@
     </w:p>
     <w:p>
       <w:pPr>
-        <w:spacing w:before="0" w:after="60"/>
         <w:sectPr>
           <w:pgSz w:w="12240" w:h="15840"/>
           <w:pgMar w:top="1134" w:right="1417" w:bottom="1134" w:left="1417" w:header="720" w:footer="720" w:gutter="0"/>
@@ -285,32 +269,19 @@
     <w:p>
       <w:pPr>
         <w:pStyle w:val="Heading1"/>
-        <w:spacing w:line="360" w:lineRule="auto" w:before="0" w:after="60"/>
-        <w:jc w:val="left"/>
+        <w:spacing w:line="360" w:lineRule="auto"/>
       </w:pPr>
       <w:r>
         <w:t>MỤC LỤC</w:t>
       </w:r>
     </w:p>
     <w:p>
-      <w:pPr>
-        <w:spacing w:before="0" w:after="60"/>
-      </w:pPr>
       <w:r>
         <w:fldChar w:fldCharType="begin"/>
         <w:instrText xml:space="preserve">TOC \o "1-3" \h \z \u</w:instrText>
         <w:fldChar w:fldCharType="separate"/>
         <w:t>(Right click mục lục -&gt; Update Field)</w:t>
         <w:fldChar w:fldCharType="end"/>
-      </w:r>
-    </w:p>
-    <w:p>
-      <w:pPr>
-        <w:pStyle w:val="Heading1"/>
-        <w:spacing w:before="0" w:after="60"/>
-      </w:pPr>
-      <w:r>
-        <w:t>NỘI DUNG</w:t>
       </w:r>
     </w:p>
     <w:p>

</xml_diff>